<commit_message>
Tegenbegroting 2027: aanname wachtgeld bij minder wethouders
Co-Authored-By: Claude Opus 5.5 <noreply@anthropic.com>
Claude-Session: https://claude.ai/code/session_01Gpinc7W9kdxFe2j2GC2ZtD
</commit_message>
<xml_diff>
--- a/tegenbegroting/Tegenbegroting_VVD_Groningen_2027_v2.docx
+++ b/tegenbegroting/Tegenbegroting_VVD_Groningen_2027_v2.docx
@@ -3182,7 +3182,7 @@
         <w:rPr>
           <w:rFonts w:cs="Times New Roman"/>
         </w:rPr>
-        <w:t xml:space="preserve">Het college van burgemeester en wethouders kan kleiner. Niet alleen de wethouders kosten geld, ook de hele entourage van een wethouder kost veel geld. De VVD stelt een besparing van 24% op het college voor.</w:t>
+        <w:t xml:space="preserve">Het college van burgemeester en wethouders kan kleiner. Niet alleen de wethouders kosten geld, ook de hele entourage van een wethouder kost veel geld. De VVD stelt een besparing van 24% op het college voor. Wij gaan ervan uit dat wethouders die vertrekken direct een nieuwe baan hebben en daarom afzien van wachtgeld. Zo kan de besparing al in 2027 volledig worden ingezet.</w:t>
       </w:r>
     </w:p>
     <w:p>
@@ -17751,7 +17751,7 @@
         <w:rPr>
           <w:rFonts w:cs="Times New Roman"/>
         </w:rPr>
-        <w:t xml:space="preserve">Alle bedragen zijn doorgerekend met het rekenmodel van de Begrotingsgame op basis van de Ontwerpbegroting 2027 (scenario midden), zonder indexering. De kettingeffecten staan als aparte regels in de tabellen: subsidies moeten worden opgezegd (in 2027 telt een kwart van de besparing mee), lopende Wmo-contracten schuiven die besparing naar 2028, de bijdragen aan de GGD en de Regio Groningen-Assen dalen pas in 2029, en minder preventie leidt vanaf 2028 tot meer jeugdzorg en Wmo-hulp. Kleinere effecten: minder bijstandshuishoudens geven iets minder gemeentefonds, minder cultuur iets minder toeristenbelasting, en extra woningen door minder bouwregels leveren vanaf 2029 wat OZB op maar vragen ook meer onderhoud. De besparing op het ambtenarenapparaat groeit in vier gelijke stappen (25%, 50%, 75% en 100%) naar 53,7 miljoen euro in 2030; de frictiekosten daarvan vallen eenmalig in 2027. De verplichte tegenprestatie levert in 2027 nog niets op, in 2028 de helft en vanaf 2029 1,6 miljoen euro. Eenmalige posten tellen alleen in 2027 mee. Het saldo van 2027 is in de tabellen hierboven gestort in de reserves; in deze tabel staat het saldo vóór die storting. Door afronding kan de som van de regels in de laatste decimaal afwijken van het totaal.</w:t>
+        <w:t xml:space="preserve">Alle bedragen zijn doorgerekend met het rekenmodel van de Begrotingsgame op basis van de Ontwerpbegroting 2027 (scenario midden), zonder indexering. De kettingeffecten staan als aparte regels in de tabellen: subsidies moeten worden opgezegd (in 2027 telt een kwart van de besparing mee), lopende Wmo-contracten schuiven die besparing naar 2028, de bijdragen aan de GGD en de Regio Groningen-Assen dalen pas in 2029, en minder preventie leidt vanaf 2028 tot meer jeugdzorg en Wmo-hulp. Kleinere effecten: minder bijstandshuishoudens geven iets minder gemeentefonds, minder cultuur iets minder toeristenbelasting, en extra woningen door minder bouwregels leveren vanaf 2029 wat OZB op maar vragen ook meer onderhoud. De besparing op het ambtenarenapparaat groeit in vier gelijke stappen (25%, 50%, 75% en 100%) naar 53,7 miljoen euro in 2030; de frictiekosten daarvan vallen eenmalig in 2027. De verplichte tegenprestatie levert in 2027 nog niets op, in 2028 de helft en vanaf 2029 1,6 miljoen euro. Bij minder wethouders gaan we ervan uit dat vertrekkende wethouders afzien van wachtgeld, zodat de besparing direct in 2027 telt. Eenmalige posten tellen alleen in 2027 mee. Het saldo van 2027 is in de tabellen hierboven gestort in de reserves; in deze tabel staat het saldo vóór die storting. Door afronding kan de som van de regels in de laatste decimaal afwijken van het totaal.</w:t>
       </w:r>
     </w:p>
     <w:p>

</xml_diff>

<commit_message>
Tegenbegroting 2027: wegenfundering WarmteStad geschrapt (post uit 2026, al uitgevoerd)
Co-Authored-By: Claude Opus 5.5 <noreply@anthropic.com>
Claude-Session: https://claude.ai/code/session_01Gpinc7W9kdxFe2j2GC2ZtD
</commit_message>
<xml_diff>
--- a/tegenbegroting/Tegenbegroting_VVD_Groningen_2027_v2.docx
+++ b/tegenbegroting/Tegenbegroting_VVD_Groningen_2027_v2.docx
@@ -3285,7 +3285,7 @@
           <w:b/>
           <w:bCs/>
         </w:rPr>
-        <w:t xml:space="preserve">Wegenfundering WarmteStad</w:t>
+        <w:t xml:space="preserve">Stoppen met het plan van aanpak diversiteit en diversiteit en inclusie 85%</w:t>
       </w:r>
       <w:r>
         <w:rPr>
@@ -3299,20 +3299,7 @@
         <w:rPr>
           <w:rFonts w:cs="Times New Roman"/>
         </w:rPr>
-        <w:t xml:space="preserve">De gemeente Groningen betaalt mee aan het verwijderen van vervuilde wegenfundering bij de aanleg van het warmtenet van WarmteStad. WarmteStad is sinds 2025 volledig in handen van de gemeente.</w:t>
-      </w:r>
-      <w:r>
-        <w:rPr>
-          <w:rStyle w:val="Voetnootmarkering"/>
-          <w:rFonts w:cs="Times New Roman"/>
-        </w:rPr>
-        <w:footnoteReference w:id="1"/>
-      </w:r>
-      <w:r>
-        <w:rPr>
-          <w:rFonts w:cs="Times New Roman"/>
-        </w:rPr>
-        <w:t xml:space="preserve"> Kosten die bij de aanleg van het warmtenet horen, moeten daarom op de rekening van WarmteStad staan en niet verdwijnen in de gemeentelijke begroting. Zo blijft zichtbaar wat het warmtenet werkelijk kost.</w:t>
+        <w:t xml:space="preserve">De gemeente investeert in diversiteitsprojecten en inclusieprogramma’s die vooral beleid en overlegstructuren opleveren. Dit is een van de onderdelen waarop de VVD de gemeentelijke organisatie wil laten krimpen. Daarom stopt de gemeente met het diversiteitsplan voor eigen personeel (eenmalig 0,2 miljoen euro) en gaat het budget voor diversiteit en inclusie met 85% omlaag.</w:t>
       </w:r>
     </w:p>
     <w:p>
@@ -3337,7 +3324,7 @@
           <w:b/>
           <w:bCs/>
         </w:rPr>
-        <w:t xml:space="preserve">Stoppen met het plan van aanpak diversiteit en diversiteit en inclusie 85%</w:t>
+        <w:t xml:space="preserve">Minder bouwregels: welstandsvrij bouwen</w:t>
       </w:r>
       <w:r>
         <w:rPr>
@@ -3351,7 +3338,7 @@
         <w:rPr>
           <w:rFonts w:cs="Times New Roman"/>
         </w:rPr>
-        <w:t xml:space="preserve">De gemeente investeert in diversiteitsprojecten en inclusieprogramma’s die vooral beleid en overlegstructuren opleveren. Dit is een van de onderdelen waarop de VVD de gemeentelijke organisatie wil laten krimpen. Daarom stopt de gemeente met het diversiteitsplan voor eigen personeel (eenmalig 0,2 miljoen euro) en gaat het budget voor diversiteit en inclusie met 85% omlaag.</w:t>
+        <w:t xml:space="preserve">De welstandscommissie krijgt minder macht. Er komt één welstandsnota met zo min mogelijk regels en nieuwe wijken worden vaker welstandsvrij. Dan zijn er ook minder ambtenaren voor wonen nodig. Het versnelt bovendien de bouw, waardoor er meer woningen komen die OZB betalen.</w:t>
       </w:r>
     </w:p>
     <w:p>
@@ -3376,7 +3363,7 @@
           <w:b/>
           <w:bCs/>
         </w:rPr>
-        <w:t xml:space="preserve">Minder bouwregels: welstandsvrij bouwen</w:t>
+        <w:t xml:space="preserve">Elektrisch maken gemeenteauto’s uitstellen</w:t>
       </w:r>
       <w:r>
         <w:rPr>
@@ -3390,7 +3377,7 @@
         <w:rPr>
           <w:rFonts w:cs="Times New Roman"/>
         </w:rPr>
-        <w:t xml:space="preserve">De welstandscommissie krijgt minder macht. Er komt één welstandsnota met zo min mogelijk regels en nieuwe wijken worden vaker welstandsvrij. Dan zijn er ook minder ambtenaren voor wonen nodig. Het versnelt bovendien de bouw, waardoor er meer woningen komen die OZB betalen.</w:t>
+        <w:t xml:space="preserve">De gemeente koopt voorlopig weer gewone auto’s en busjes in plaats van elektrische. Dat is goedkoper, maar de gemeente stoot hierdoor meer CO2 uit.</w:t>
       </w:r>
     </w:p>
     <w:p>
@@ -3415,7 +3402,7 @@
           <w:b/>
           <w:bCs/>
         </w:rPr>
-        <w:t xml:space="preserve">Elektrisch maken gemeenteauto’s uitstellen</w:t>
+        <w:t xml:space="preserve">Overige ombuigingen</w:t>
       </w:r>
       <w:r>
         <w:rPr>
@@ -3429,45 +3416,6 @@
         <w:rPr>
           <w:rFonts w:cs="Times New Roman"/>
         </w:rPr>
-        <w:t xml:space="preserve">De gemeente koopt voorlopig weer gewone auto’s en busjes in plaats van elektrische. Dat is goedkoper, maar de gemeente stoot hierdoor meer CO2 uit.</w:t>
-      </w:r>
-    </w:p>
-    <w:p>
-      <w:pPr>
-        <w:pStyle w:val="Hoofdtekst"/>
-        <w:rPr>
-          <w:rFonts w:cs="Times New Roman"/>
-        </w:rPr>
-      </w:pPr>
-      <w:r>
-        <w:rPr>
-          <w:color w:val="FF6400"/>
-        </w:rPr>
-        <w:t>▶</w:t>
-      </w:r>
-      <w:r>
-        <w:tab/>
-      </w:r>
-      <w:r>
-        <w:rPr>
-          <w:rFonts w:cs="Times New Roman"/>
-          <w:b/>
-          <w:bCs/>
-        </w:rPr>
-        <w:t xml:space="preserve">Overige ombuigingen</w:t>
-      </w:r>
-      <w:r>
-        <w:rPr>
-          <w:rFonts w:cs="Times New Roman"/>
-          <w:b/>
-          <w:bCs/>
-        </w:rPr>
-        <w:t xml:space="preserve">. </w:t>
-      </w:r>
-      <w:r>
-        <w:rPr>
-          <w:rFonts w:cs="Times New Roman"/>
-        </w:rPr>
         <w:t xml:space="preserve">De gemeente geeft geen geld meer voor Campus Camera (0,1 miljoen euro per jaar). Ook stopt de gemeente met het budget voor internationale solidariteit (0,05 miljoen euro per jaar) en met de subsidie voor dierenartskosten (0,05 miljoen euro eenmalig).</w:t>
       </w:r>
     </w:p>
@@ -3508,7 +3456,7 @@
         <w:rPr>
           <w:rStyle w:val="Voetnootmarkering"/>
         </w:rPr>
-        <w:footnoteReference w:id="2"/>
+        <w:footnoteReference w:id="1"/>
       </w:r>
       <w:r>
         <w:rPr>
@@ -4700,8 +4648,6 @@
       </w:pPr>
       <w:r>
         <w:rPr>
-          <w:i/>
-          <w:iCs/>
           <w:sz w:val="16"/>
           <w:szCs w:val="16"/>
         </w:rPr>
@@ -4869,7 +4815,7 @@
           <w:rStyle w:val="Voetnootmarkering"/>
           <w:rFonts w:cs="Times New Roman"/>
         </w:rPr>
-        <w:footnoteReference w:id="3"/>
+        <w:footnoteReference w:id="2"/>
       </w:r>
       <w:r>
         <w:rPr>
@@ -5077,7 +5023,7 @@
           <w:rStyle w:val="Voetnootmarkering"/>
           <w:rFonts w:cs="Times New Roman"/>
         </w:rPr>
-        <w:footnoteReference w:id="4"/>
+        <w:footnoteReference w:id="3"/>
       </w:r>
       <w:r>
         <w:rPr>
@@ -5168,7 +5114,7 @@
           <w:rStyle w:val="Voetnootmarkering"/>
           <w:rFonts w:cs="Times New Roman"/>
         </w:rPr>
-        <w:footnoteReference w:id="5"/>
+        <w:footnoteReference w:id="4"/>
       </w:r>
       <w:r>
         <w:rPr>
@@ -5283,7 +5229,7 @@
           <w:rStyle w:val="Voetnootmarkering"/>
           <w:rFonts w:cs="Times New Roman"/>
         </w:rPr>
-        <w:footnoteReference w:id="6"/>
+        <w:footnoteReference w:id="5"/>
       </w:r>
       <w:r>
         <w:rPr>
@@ -5828,7 +5774,7 @@
         <w:rPr>
           <w:rStyle w:val="Voetnootmarkering"/>
         </w:rPr>
-        <w:footnoteReference w:id="7"/>
+        <w:footnoteReference w:id="6"/>
       </w:r>
       <w:r>
         <w:rPr>
@@ -5881,7 +5827,7 @@
           <w:rStyle w:val="Voetnootmarkering"/>
           <w:rFonts w:cs="Times New Roman"/>
         </w:rPr>
-        <w:footnoteReference w:id="8"/>
+        <w:footnoteReference w:id="7"/>
       </w:r>
       <w:r>
         <w:rPr>
@@ -5972,7 +5918,7 @@
           <w:rStyle w:val="Voetnootmarkering"/>
           <w:rFonts w:cs="Times New Roman"/>
         </w:rPr>
-        <w:footnoteReference w:id="9"/>
+        <w:footnoteReference w:id="8"/>
       </w:r>
       <w:r>
         <w:rPr>
@@ -6357,7 +6303,7 @@
           <w:rStyle w:val="Voetnootmarkering"/>
           <w:rFonts w:cs="Times New Roman"/>
         </w:rPr>
-        <w:footnoteReference w:id="10"/>
+        <w:footnoteReference w:id="9"/>
       </w:r>
       <w:r>
         <w:rPr>
@@ -6597,7 +6543,7 @@
         <w:rPr>
           <w:rFonts w:cs="Times New Roman"/>
         </w:rPr>
-        <w:t xml:space="preserve">De financiële positie van de gemeente staat er niet goed voor. Daarom wil de VVD de reserves van de gemeente laten toenemen, waardoor de financiële positie van onze gemeente flink verbetert. Een gezonde balans voorkomt dat toekomstige generaties opdraaien voor de uitgaven van vandaag. Het saldo dat na alle keuzes in 2027 overblijft, 24,4 miljoen euro, storten we hiervoor. Het structurele overschot loopt op tot 87,5 miljoen euro in 2030.</w:t>
+        <w:t xml:space="preserve">De financiële positie van de gemeente staat er niet goed voor. Daarom wil de VVD de reserves van de gemeente laten toenemen, waardoor de financiële positie van onze gemeente flink verbetert. Een gezonde balans voorkomt dat toekomstige generaties opdraaien voor de uitgaven van vandaag. Het saldo dat na alle keuzes in 2027 overblijft, 24,0 miljoen euro, storten we hiervoor. Het structurele overschot loopt op tot 87,5 miljoen euro in 2030.</w:t>
       </w:r>
     </w:p>
     <w:p>
@@ -6931,8 +6877,6 @@
       </w:pPr>
       <w:r>
         <w:rPr>
-          <w:i/>
-          <w:iCs/>
           <w:sz w:val="16"/>
           <w:szCs w:val="16"/>
         </w:rPr>
@@ -11208,7 +11152,7 @@
                 <w:color w:val="000000"/>
                 <w:lang w:eastAsia="nl-NL"/>
               </w:rPr>
-              <w:t xml:space="preserve">Wegenfundering Warmtestad</w:t>
+              <w:t xml:space="preserve">Route Arbeid+ niet uitbreiden</w:t>
             </w:r>
           </w:p>
         </w:tc>
@@ -11237,7 +11181,7 @@
                 <w:color w:val="000000"/>
                 <w:lang w:eastAsia="nl-NL"/>
               </w:rPr>
-              <w:t xml:space="preserve">0,45</w:t>
+              <w:t xml:space="preserve">0,35</w:t>
             </w:r>
           </w:p>
         </w:tc>
@@ -11299,7 +11243,7 @@
                 <w:color w:val="000000"/>
                 <w:lang w:eastAsia="nl-NL"/>
               </w:rPr>
-              <w:t xml:space="preserve">Route Arbeid+ niet uitbreiden</w:t>
+              <w:t xml:space="preserve">Schrappen cultuurprogramma Niemeyer</w:t>
             </w:r>
           </w:p>
         </w:tc>
@@ -11328,7 +11272,7 @@
                 <w:color w:val="000000"/>
                 <w:lang w:eastAsia="nl-NL"/>
               </w:rPr>
-              <w:t xml:space="preserve">0,35</w:t>
+              <w:t xml:space="preserve">0,25</w:t>
             </w:r>
           </w:p>
         </w:tc>
@@ -11390,7 +11334,7 @@
                 <w:color w:val="000000"/>
                 <w:lang w:eastAsia="nl-NL"/>
               </w:rPr>
-              <w:t xml:space="preserve">Schrappen cultuurprogramma Niemeyer</w:t>
+              <w:t xml:space="preserve">Stoppen uitvoering plan van aanpak diversiteit</w:t>
             </w:r>
           </w:p>
         </w:tc>
@@ -11419,7 +11363,7 @@
                 <w:color w:val="000000"/>
                 <w:lang w:eastAsia="nl-NL"/>
               </w:rPr>
-              <w:t xml:space="preserve">0,25</w:t>
+              <w:t xml:space="preserve">0,205</w:t>
             </w:r>
           </w:p>
         </w:tc>
@@ -11481,7 +11425,7 @@
                 <w:color w:val="000000"/>
                 <w:lang w:eastAsia="nl-NL"/>
               </w:rPr>
-              <w:t xml:space="preserve">Stoppen uitvoering plan van aanpak diversiteit</w:t>
+              <w:t xml:space="preserve">Organisatiekosten Energiebedrijf Groningen</w:t>
             </w:r>
           </w:p>
         </w:tc>
@@ -11510,7 +11454,7 @@
                 <w:color w:val="000000"/>
                 <w:lang w:eastAsia="nl-NL"/>
               </w:rPr>
-              <w:t xml:space="preserve">0,205</w:t>
+              <w:t xml:space="preserve">0,201</w:t>
             </w:r>
           </w:p>
         </w:tc>
@@ -11572,97 +11516,6 @@
                 <w:color w:val="000000"/>
                 <w:lang w:eastAsia="nl-NL"/>
               </w:rPr>
-              <w:t xml:space="preserve">Organisatiekosten Energiebedrijf Groningen</w:t>
-            </w:r>
-          </w:p>
-        </w:tc>
-        <w:tc>
-          <w:tcPr>
-            <w:tcW w:w="1103" w:type="dxa"/>
-            <w:noWrap/>
-            <w:vAlign w:val="bottom"/>
-            <w:hideMark/>
-          </w:tcPr>
-          <w:p>
-            <w:pPr>
-              <w:widowControl/>
-              <w:autoSpaceDE/>
-              <w:autoSpaceDN/>
-              <w:jc w:val="right"/>
-              <w:rPr>
-                <w:rFonts w:ascii="Aptos Narrow" w:eastAsia="Times New Roman" w:hAnsi="Aptos Narrow" w:cs="Times New Roman"/>
-                <w:color w:val="000000"/>
-                <w:lang w:eastAsia="nl-NL"/>
-              </w:rPr>
-            </w:pPr>
-            <w:r>
-              <w:rPr>
-                <w:rFonts w:ascii="Aptos Narrow" w:eastAsia="Times New Roman" w:hAnsi="Aptos Narrow" w:cs="Times New Roman"/>
-                <w:color w:val="000000"/>
-                <w:lang w:eastAsia="nl-NL"/>
-              </w:rPr>
-              <w:t xml:space="preserve">0,201</w:t>
-            </w:r>
-          </w:p>
-        </w:tc>
-        <w:tc>
-          <w:tcPr>
-            <w:tcW w:w="2169" w:type="dxa"/>
-            <w:noWrap/>
-            <w:vAlign w:val="bottom"/>
-            <w:hideMark/>
-          </w:tcPr>
-          <w:p>
-            <w:pPr>
-              <w:widowControl/>
-              <w:autoSpaceDE/>
-              <w:autoSpaceDN/>
-              <w:jc w:val="right"/>
-              <w:rPr>
-                <w:rFonts w:ascii="Aptos Narrow" w:eastAsia="Times New Roman" w:hAnsi="Aptos Narrow" w:cs="Times New Roman"/>
-                <w:color w:val="000000"/>
-                <w:lang w:eastAsia="nl-NL"/>
-              </w:rPr>
-            </w:pPr>
-            <w:r>
-              <w:rPr>
-                <w:rFonts w:ascii="Aptos Narrow" w:eastAsia="Times New Roman" w:hAnsi="Aptos Narrow" w:cs="Times New Roman"/>
-                <w:color w:val="000000"/>
-                <w:lang w:eastAsia="nl-NL"/>
-              </w:rPr>
-              <w:t xml:space="preserve">I</w:t>
-            </w:r>
-          </w:p>
-        </w:tc>
-      </w:tr>
-      <w:tr>
-        <w:trPr>
-          <w:trHeight w:val="315"/>
-        </w:trPr>
-        <w:tc>
-          <w:tcPr>
-            <w:tcW w:w="7285" w:type="dxa"/>
-            <w:noWrap/>
-            <w:vAlign w:val="bottom"/>
-            <w:hideMark/>
-          </w:tcPr>
-          <w:p>
-            <w:pPr>
-              <w:widowControl/>
-              <w:autoSpaceDE/>
-              <w:autoSpaceDN/>
-              <w:rPr>
-                <w:rFonts w:ascii="Aptos Narrow" w:eastAsia="Times New Roman" w:hAnsi="Aptos Narrow" w:cs="Times New Roman"/>
-                <w:color w:val="000000"/>
-                <w:lang w:eastAsia="nl-NL"/>
-              </w:rPr>
-            </w:pPr>
-            <w:r>
-              <w:rPr>
-                <w:rFonts w:ascii="Aptos Narrow" w:eastAsia="Times New Roman" w:hAnsi="Aptos Narrow" w:cs="Times New Roman"/>
-                <w:color w:val="000000"/>
-                <w:lang w:eastAsia="nl-NL"/>
-              </w:rPr>
               <w:t xml:space="preserve">Geen gemeentegeld voor dierenartskosten</w:t>
             </w:r>
           </w:p>
@@ -11791,7 +11644,7 @@
                 <w:color w:val="000000"/>
                 <w:lang w:eastAsia="nl-NL"/>
               </w:rPr>
-              <w:t xml:space="preserve">138,662</w:t>
+              <w:t xml:space="preserve">138,212</w:t>
             </w:r>
           </w:p>
         </w:tc>
@@ -15668,7 +15521,7 @@
                 <w:color w:val="000000"/>
                 <w:lang w:eastAsia="nl-NL"/>
               </w:rPr>
-              <w:t xml:space="preserve">24,418</w:t>
+              <w:t xml:space="preserve">23,968</w:t>
             </w:r>
           </w:p>
         </w:tc>
@@ -15767,7 +15620,7 @@
                 <w:color w:val="000000"/>
                 <w:lang w:eastAsia="nl-NL"/>
               </w:rPr>
-              <w:t xml:space="preserve">138,662</w:t>
+              <w:t xml:space="preserve">138,212</w:t>
             </w:r>
           </w:p>
         </w:tc>
@@ -16221,7 +16074,7 @@
                 <w:color w:val="000000"/>
                 <w:lang w:eastAsia="nl-NL"/>
               </w:rPr>
-              <w:t xml:space="preserve">12,665</w:t>
+              <w:t xml:space="preserve">12,215</w:t>
             </w:r>
           </w:p>
         </w:tc>
@@ -16378,7 +16231,7 @@
                 <w:color w:val="000000"/>
                 <w:lang w:eastAsia="nl-NL"/>
               </w:rPr>
-              <w:t xml:space="preserve">138,662</w:t>
+              <w:t xml:space="preserve">138,212</w:t>
             </w:r>
           </w:p>
         </w:tc>
@@ -17014,7 +16867,7 @@
                 <w:color w:val="000000"/>
                 <w:lang w:eastAsia="nl-NL"/>
               </w:rPr>
-              <w:t xml:space="preserve">24,418</w:t>
+              <w:t xml:space="preserve">23,968</w:t>
             </w:r>
           </w:p>
         </w:tc>
@@ -17324,7 +17177,7 @@
                 <w:color w:val="000000"/>
                 <w:lang w:eastAsia="nl-NL"/>
               </w:rPr>
-              <w:t xml:space="preserve">1,217</w:t>
+              <w:t xml:space="preserve">0,767</w:t>
             </w:r>
           </w:p>
         </w:tc>
@@ -17622,7 +17475,7 @@
                 <w:color w:val="000000"/>
                 <w:lang w:eastAsia="nl-NL"/>
               </w:rPr>
-              <w:t xml:space="preserve">24,418</w:t>
+              <w:t xml:space="preserve">23,968</w:t>
             </w:r>
           </w:p>
         </w:tc>
@@ -17651,7 +17504,7 @@
                 <w:color w:val="000000"/>
                 <w:lang w:eastAsia="nl-NL"/>
               </w:rPr>
-              <w:t xml:space="preserve">84,18</w:t>
+              <w:t xml:space="preserve">83,73</w:t>
             </w:r>
           </w:p>
         </w:tc>
@@ -17680,7 +17533,7 @@
                 <w:color w:val="000000"/>
                 <w:lang w:eastAsia="nl-NL"/>
               </w:rPr>
-              <w:t xml:space="preserve">158,435</w:t>
+              <w:t xml:space="preserve">157,985</w:t>
             </w:r>
           </w:p>
         </w:tc>
@@ -17709,7 +17562,7 @@
                 <w:color w:val="000000"/>
                 <w:lang w:eastAsia="nl-NL"/>
               </w:rPr>
-              <w:t xml:space="preserve">245,938</w:t>
+              <w:t xml:space="preserve">245,488</w:t>
             </w:r>
           </w:p>
         </w:tc>
@@ -18044,7 +17897,7 @@
         <w:footnoteRef/>
       </w:r>
       <w:r>
-        <w:t xml:space="preserve"> OOG, "Waterbedrijf Groningen stapt uit WarmteStad, gemeente wordt voor 10 miljoen de enige eigenaar", september 2025. https://www.oogtv.nl/2025/09/waterbedrijf-groningen-stapt-uit-warmtestad-gemeente-neemt-aandelen-over-en-wordt-enige-eigenaar/</w:t>
+        <w:t xml:space="preserve"> Rijksoverheid, "Kabinet-Jetten beëdigd", 23 februari 2026 (D66, VVD en CDA). https://www.rijksoverheid.nl/actueel/nieuws/2026/02/23/kabinet-jetten-beedigd</w:t>
       </w:r>
     </w:p>
   </w:footnote>
@@ -18060,7 +17913,7 @@
         <w:footnoteRef/>
       </w:r>
       <w:r>
-        <w:t xml:space="preserve"> Rijksoverheid, "Kabinet-Jetten beëdigd", 23 februari 2026 (D66, VVD en CDA). https://www.rijksoverheid.nl/actueel/nieuws/2026/02/23/kabinet-jetten-beedigd</w:t>
+        <w:t xml:space="preserve"> Participatiewet, artikel 8 en 36: de gemeenteraad bepaalt in een verordening wat onder langdurig laag inkomen wordt verstaan. wetten.overheid.nl, geldende versie op 31 oktober 2026. https://wetten.overheid.nl/BWBR0015703</w:t>
       </w:r>
     </w:p>
   </w:footnote>
@@ -18076,7 +17929,7 @@
         <w:footnoteRef/>
       </w:r>
       <w:r>
-        <w:t xml:space="preserve"> Participatiewet, artikel 8 en 36: de gemeenteraad bepaalt in een verordening wat onder langdurig laag inkomen wordt verstaan. wetten.overheid.nl, geldende versie op 31 oktober 2026. https://wetten.overheid.nl/BWBR0015703</w:t>
+        <w:t xml:space="preserve"> Wet maatschappelijke ondersteuning 2015, artikel 2.3.5 (maatwerkvoorziening) en artikel 2.6.6 (reële prijs voor ingekochte ondersteuning), wetten.overheid.nl, geldende versie op 31 oktober 2026. https://wetten.overheid.nl/BWBR0035362</w:t>
       </w:r>
     </w:p>
   </w:footnote>
@@ -18092,7 +17945,7 @@
         <w:footnoteRef/>
       </w:r>
       <w:r>
-        <w:t xml:space="preserve"> Wet maatschappelijke ondersteuning 2015, artikel 2.3.5 (maatwerkvoorziening) en artikel 2.6.6 (reële prijs voor ingekochte ondersteuning), wetten.overheid.nl, geldende versie op 31 oktober 2026. https://wetten.overheid.nl/BWBR0035362</w:t>
+        <w:t xml:space="preserve"> NOS, "Faber schrapt financiering 'bed-bad-brood', gemeenten vrezen overlast en onveiligheid", 4 september 2024 (rijksbijdrage aan de Landelijke Vreemdelingenvoorzieningen stopt per 1 januari 2025). https://nos.nl/l/2535822</w:t>
       </w:r>
     </w:p>
   </w:footnote>
@@ -18108,7 +17961,7 @@
         <w:footnoteRef/>
       </w:r>
       <w:r>
-        <w:t xml:space="preserve"> NOS, "Faber schrapt financiering 'bed-bad-brood', gemeenten vrezen overlast en onveiligheid", 4 september 2024 (rijksbijdrage aan de Landelijke Vreemdelingenvoorzieningen stopt per 1 januari 2025). https://nos.nl/l/2535822</w:t>
+        <w:t xml:space="preserve"> OOG, "Forum Groningen krijgt extra jaar voor stabiele exploitatie", mei 2025. https://www.oogtv.nl/2025/05/forum-groningen-krijgt-extra-jaar-voor-stabiele-exploitatie-geld-naar-onderhoud-en-upgrade-bieb/</w:t>
       </w:r>
     </w:p>
   </w:footnote>
@@ -18124,7 +17977,7 @@
         <w:footnoteRef/>
       </w:r>
       <w:r>
-        <w:t xml:space="preserve"> OOG, "Forum Groningen krijgt extra jaar voor stabiele exploitatie", mei 2025. https://www.oogtv.nl/2025/05/forum-groningen-krijgt-extra-jaar-voor-stabiele-exploitatie-geld-naar-onderhoud-en-upgrade-bieb/</w:t>
+        <w:t xml:space="preserve"> COELO (Rijksuniversiteit Groningen), Atlas van de lokale lasten 2026, databestand Gemeentelijke belastingen 2026: gemiddeld betaalde OZB bij de gemiddelde WOZ-waarde (Groningen € 687, hoogste van de 65 gemeenten in Groningen, Drenthe, Fryslân en Overijssel). https://coelo.nl/atlas-lokale-lasten-2026/bijlagen-2026-en-databestanden/</w:t>
       </w:r>
     </w:p>
   </w:footnote>
@@ -18156,27 +18009,11 @@
         <w:footnoteRef/>
       </w:r>
       <w:r>
-        <w:t xml:space="preserve"> COELO (Rijksuniversiteit Groningen), Atlas van de lokale lasten 2026, databestand Gemeentelijke belastingen 2026: gemiddeld betaalde OZB bij de gemiddelde WOZ-waarde (Groningen € 687, hoogste van de 65 gemeenten in Groningen, Drenthe, Fryslân en Overijssel). https://coelo.nl/atlas-lokale-lasten-2026/bijlagen-2026-en-databestanden/</w:t>
+        <w:t xml:space="preserve"> ANP, "Van plek 10 naar plek 4: Haarlem bij duurste parkeersteden van Nederland", 20 oktober 2026. https://persportaal.anp.nl/artikel/230ac0d2-e22e-403c-ab54-2966cc6d7f61</w:t>
       </w:r>
     </w:p>
   </w:footnote>
   <w:footnote w:id="9">
-    <w:p>
-      <w:pPr>
-        <w:pStyle w:val="Voetnoottekst"/>
-      </w:pPr>
-      <w:r>
-        <w:rPr>
-          <w:rStyle w:val="Voetnootmarkering"/>
-        </w:rPr>
-        <w:footnoteRef/>
-      </w:r>
-      <w:r>
-        <w:t xml:space="preserve"> ANP, "Van plek 10 naar plek 4: Haarlem bij duurste parkeersteden van Nederland", 20 oktober 2026. https://persportaal.anp.nl/artikel/230ac0d2-e22e-403c-ab54-2966cc6d7f61</w:t>
-      </w:r>
-    </w:p>
-  </w:footnote>
-  <w:footnote w:id="10">
     <w:p>
       <w:pPr>
         <w:pStyle w:val="Voetnoottekst"/>

</xml_diff>

<commit_message>
Tegenbegroting 2027: precario -20%, verwijzingen naar de game uit het document, controle tegen begroting 2027
Co-Authored-By: Claude Opus 5.5 <noreply@anthropic.com>
Claude-Session: https://claude.ai/code/session_01Gpinc7W9kdxFe2j2GC2ZtD
</commit_message>
<xml_diff>
--- a/tegenbegroting/Tegenbegroting_VVD_Groningen_2027_v2.docx
+++ b/tegenbegroting/Tegenbegroting_VVD_Groningen_2027_v2.docx
@@ -5949,7 +5949,7 @@
           <w:b/>
           <w:bCs/>
         </w:rPr>
-        <w:t xml:space="preserve">Verlaging precariobelasting 60,7%</w:t>
+        <w:t xml:space="preserve">Verlaging precariobelasting 20%</w:t>
       </w:r>
       <w:r>
         <w:rPr>
@@ -5963,7 +5963,7 @@
         <w:rPr>
           <w:rFonts w:cs="Times New Roman"/>
         </w:rPr>
-        <w:t xml:space="preserve">Wie zijn huis onderhoudt of verbouwt en een container of steiger op straat zet, betaalt daarvoor precariobelasting. Dat maakt noodzakelijk onderhoud duurder en zorgt voor extra administratie. De VVD wil de lasten voor alle Groningers laten dalen en dus ook de precariobelasting. Daarom gaat de precariobelasting met 60,7% omlaag.</w:t>
+        <w:t xml:space="preserve">Wie zijn huis onderhoudt of verbouwt en een container of steiger op straat zet, betaalt daarvoor precariobelasting. Dat maakt noodzakelijk onderhoud duurder en zorgt voor extra administratie. De VVD wil de lasten voor alle Groningers laten dalen en dus ook de precariobelasting. Daarom gaat de precariobelasting met 20% omlaag.</w:t>
       </w:r>
     </w:p>
     <w:p>
@@ -6543,7 +6543,7 @@
         <w:rPr>
           <w:rFonts w:cs="Times New Roman"/>
         </w:rPr>
-        <w:t xml:space="preserve">De financiële positie van de gemeente staat er niet goed voor. Daarom wil de VVD de reserves van de gemeente laten toenemen, waardoor de financiële positie van onze gemeente flink verbetert. Een gezonde balans voorkomt dat toekomstige generaties opdraaien voor de uitgaven van vandaag. Het saldo dat na alle keuzes in 2027 overblijft, 24,0 miljoen euro, storten we hiervoor. Het structurele overschot loopt op tot 87,5 miljoen euro in 2030.</w:t>
+        <w:t xml:space="preserve">De financiële positie van de gemeente staat er niet goed voor. Daarom wil de VVD de reserves van de gemeente laten toenemen, waardoor de financiële positie van onze gemeente flink verbetert. Een gezonde balans voorkomt dat toekomstige generaties opdraaien voor de uitgaven van vandaag. Het saldo dat na alle keuzes in 2027 overblijft, 24,7 miljoen euro, storten we hiervoor. Het structurele overschot loopt op tot 88,3 miljoen euro in 2030.</w:t>
       </w:r>
     </w:p>
     <w:p>
@@ -6880,7 +6880,7 @@
           <w:sz w:val="16"/>
           <w:szCs w:val="16"/>
         </w:rPr>
-        <w:t xml:space="preserve">Bron: Ontwerpbegroting 2027 gemeente Groningen; doorgerekend met het rekenmodel van de Begrotingsgame VVD Groningen (scenario midden, stand 31 oktober 2026), inclusief kettingeffecten. S = structureel, I = incidenteel (eenmalig). Bedragen x 1 miljoen euro.</w:t>
+        <w:t xml:space="preserve">Bron: Ontwerpbegroting 2027 gemeente Groningen; berekeningen VVD Groningen, inclusief kettingeffecten. S = structureel, I = incidenteel (eenmalig). Bedragen x 1 miljoen euro.</w:t>
       </w:r>
     </w:p>
     <w:p>
@@ -12944,7 +12944,7 @@
                 <w:color w:val="000000"/>
                 <w:lang w:eastAsia="nl-NL"/>
               </w:rPr>
-              <w:t xml:space="preserve">Verlaging precariobelasting 60,7%</w:t>
+              <w:t xml:space="preserve">Kettingeffect: restkosten na stoppen opvang ongedocumenteerden</w:t>
             </w:r>
           </w:p>
         </w:tc>
@@ -12973,7 +12973,7 @@
                 <w:color w:val="000000"/>
                 <w:lang w:eastAsia="nl-NL"/>
               </w:rPr>
-              <w:t xml:space="preserve">1,133</w:t>
+              <w:t xml:space="preserve">1,12</w:t>
             </w:r>
           </w:p>
         </w:tc>
@@ -13035,7 +13035,7 @@
                 <w:color w:val="000000"/>
                 <w:lang w:eastAsia="nl-NL"/>
               </w:rPr>
-              <w:t xml:space="preserve">Kettingeffect: restkosten na stoppen opvang ongedocumenteerden</w:t>
+              <w:t xml:space="preserve">Afschaffen reclamebelasting</w:t>
             </w:r>
           </w:p>
         </w:tc>
@@ -13064,7 +13064,7 @@
                 <w:color w:val="000000"/>
                 <w:lang w:eastAsia="nl-NL"/>
               </w:rPr>
-              <w:t xml:space="preserve">1,12</w:t>
+              <w:t xml:space="preserve">0,98</w:t>
             </w:r>
           </w:p>
         </w:tc>
@@ -13126,7 +13126,7 @@
                 <w:color w:val="000000"/>
                 <w:lang w:eastAsia="nl-NL"/>
               </w:rPr>
-              <w:t xml:space="preserve">Afschaffen reclamebelasting</w:t>
+              <w:t xml:space="preserve">Betaald parkeren verlagen vergunningen 20%</w:t>
             </w:r>
           </w:p>
         </w:tc>
@@ -13155,7 +13155,7 @@
                 <w:color w:val="000000"/>
                 <w:lang w:eastAsia="nl-NL"/>
               </w:rPr>
-              <w:t xml:space="preserve">0,98</w:t>
+              <w:t xml:space="preserve">0,778</w:t>
             </w:r>
           </w:p>
         </w:tc>
@@ -13217,7 +13217,7 @@
                 <w:color w:val="000000"/>
                 <w:lang w:eastAsia="nl-NL"/>
               </w:rPr>
-              <w:t xml:space="preserve">Betaald parkeren verlagen vergunningen 20%</w:t>
+              <w:t xml:space="preserve">Kettingeffect: minder parkeercontrole, minder naheffingen</w:t>
             </w:r>
           </w:p>
         </w:tc>
@@ -13246,7 +13246,7 @@
                 <w:color w:val="000000"/>
                 <w:lang w:eastAsia="nl-NL"/>
               </w:rPr>
-              <w:t xml:space="preserve">0,778</w:t>
+              <w:t xml:space="preserve">0,581</w:t>
             </w:r>
           </w:p>
         </w:tc>
@@ -13308,7 +13308,7 @@
                 <w:color w:val="000000"/>
                 <w:lang w:eastAsia="nl-NL"/>
               </w:rPr>
-              <w:t xml:space="preserve">Kettingeffect: minder parkeercontrole, minder naheffingen</w:t>
+              <w:t xml:space="preserve">Openbare orde en veiligheid (o.a. cameratoezicht) 10%</w:t>
             </w:r>
           </w:p>
         </w:tc>
@@ -13337,7 +13337,7 @@
                 <w:color w:val="000000"/>
                 <w:lang w:eastAsia="nl-NL"/>
               </w:rPr>
-              <w:t xml:space="preserve">0,581</w:t>
+              <w:t xml:space="preserve">0,57</w:t>
             </w:r>
           </w:p>
         </w:tc>
@@ -13399,7 +13399,7 @@
                 <w:color w:val="000000"/>
                 <w:lang w:eastAsia="nl-NL"/>
               </w:rPr>
-              <w:t xml:space="preserve">Openbare orde en veiligheid (o.a. cameratoezicht) 10%</w:t>
+              <w:t xml:space="preserve">Suikerzijde (gebiedsontwikkeling) 10%</w:t>
             </w:r>
           </w:p>
         </w:tc>
@@ -13428,7 +13428,7 @@
                 <w:color w:val="000000"/>
                 <w:lang w:eastAsia="nl-NL"/>
               </w:rPr>
-              <w:t xml:space="preserve">0,57</w:t>
+              <w:t xml:space="preserve">0,43</w:t>
             </w:r>
           </w:p>
         </w:tc>
@@ -13490,7 +13490,7 @@
                 <w:color w:val="000000"/>
                 <w:lang w:eastAsia="nl-NL"/>
               </w:rPr>
-              <w:t xml:space="preserve">Suikerzijde (gebiedsontwikkeling) 10%</w:t>
+              <w:t xml:space="preserve">Verlaging precariobelasting 20%</w:t>
             </w:r>
           </w:p>
         </w:tc>
@@ -13519,7 +13519,7 @@
                 <w:color w:val="000000"/>
                 <w:lang w:eastAsia="nl-NL"/>
               </w:rPr>
-              <w:t xml:space="preserve">0,43</w:t>
+              <w:t xml:space="preserve">0,373</w:t>
             </w:r>
           </w:p>
         </w:tc>
@@ -15521,7 +15521,7 @@
                 <w:color w:val="000000"/>
                 <w:lang w:eastAsia="nl-NL"/>
               </w:rPr>
-              <w:t xml:space="preserve">23,968</w:t>
+              <w:t xml:space="preserve">24,728</w:t>
             </w:r>
           </w:p>
         </w:tc>
@@ -16392,7 +16392,7 @@
                 <w:color w:val="000000"/>
                 <w:lang w:eastAsia="nl-NL"/>
               </w:rPr>
-              <w:t xml:space="preserve">102,796</w:t>
+              <w:t xml:space="preserve">102,037</w:t>
             </w:r>
           </w:p>
         </w:tc>
@@ -16421,7 +16421,7 @@
                 <w:color w:val="000000"/>
                 <w:lang w:eastAsia="nl-NL"/>
               </w:rPr>
-              <w:t xml:space="preserve">82,115</w:t>
+              <w:t xml:space="preserve">81,355</w:t>
             </w:r>
           </w:p>
         </w:tc>
@@ -16450,7 +16450,7 @@
                 <w:color w:val="000000"/>
                 <w:lang w:eastAsia="nl-NL"/>
               </w:rPr>
-              <w:t xml:space="preserve">82,365</w:t>
+              <w:t xml:space="preserve">81,605</w:t>
             </w:r>
           </w:p>
         </w:tc>
@@ -16479,7 +16479,7 @@
                 <w:color w:val="000000"/>
                 <w:lang w:eastAsia="nl-NL"/>
               </w:rPr>
-              <w:t xml:space="preserve">82,555</w:t>
+              <w:t xml:space="preserve">81,796</w:t>
             </w:r>
           </w:p>
         </w:tc>
@@ -16698,7 +16698,7 @@
                 <w:color w:val="000000"/>
                 <w:lang w:eastAsia="nl-NL"/>
               </w:rPr>
-              <w:t xml:space="preserve">114,244</w:t>
+              <w:t xml:space="preserve">113,485</w:t>
             </w:r>
           </w:p>
         </w:tc>
@@ -16731,7 +16731,7 @@
                 <w:color w:val="000000"/>
                 <w:lang w:eastAsia="nl-NL"/>
               </w:rPr>
-              <w:t xml:space="preserve">82,115</w:t>
+              <w:t xml:space="preserve">81,355</w:t>
             </w:r>
           </w:p>
         </w:tc>
@@ -16764,7 +16764,7 @@
                 <w:color w:val="000000"/>
                 <w:lang w:eastAsia="nl-NL"/>
               </w:rPr>
-              <w:t xml:space="preserve">82,365</w:t>
+              <w:t xml:space="preserve">81,605</w:t>
             </w:r>
           </w:p>
         </w:tc>
@@ -16797,7 +16797,7 @@
                 <w:color w:val="000000"/>
                 <w:lang w:eastAsia="nl-NL"/>
               </w:rPr>
-              <w:t xml:space="preserve">82,555</w:t>
+              <w:t xml:space="preserve">81,796</w:t>
             </w:r>
           </w:p>
         </w:tc>
@@ -16867,7 +16867,7 @@
                 <w:color w:val="000000"/>
                 <w:lang w:eastAsia="nl-NL"/>
               </w:rPr>
-              <w:t xml:space="preserve">23,968</w:t>
+              <w:t xml:space="preserve">24,728</w:t>
             </w:r>
           </w:p>
         </w:tc>
@@ -16900,7 +16900,7 @@
                 <w:color w:val="000000"/>
                 <w:lang w:eastAsia="nl-NL"/>
               </w:rPr>
-              <w:t xml:space="preserve">59,762</w:t>
+              <w:t xml:space="preserve">60,521</w:t>
             </w:r>
           </w:p>
         </w:tc>
@@ -16933,7 +16933,7 @@
                 <w:color w:val="000000"/>
                 <w:lang w:eastAsia="nl-NL"/>
               </w:rPr>
-              <w:t xml:space="preserve">74,255</w:t>
+              <w:t xml:space="preserve">75,015</w:t>
             </w:r>
           </w:p>
         </w:tc>
@@ -16966,7 +16966,7 @@
                 <w:color w:val="000000"/>
                 <w:lang w:eastAsia="nl-NL"/>
               </w:rPr>
-              <w:t xml:space="preserve">87,502</w:t>
+              <w:t xml:space="preserve">88,262</w:t>
             </w:r>
           </w:p>
         </w:tc>
@@ -17028,7 +17028,7 @@
                 <w:color w:val="000000"/>
                 <w:lang w:eastAsia="nl-NL"/>
               </w:rPr>
-              <w:t xml:space="preserve">23,201</w:t>
+              <w:t xml:space="preserve">23,96</w:t>
             </w:r>
           </w:p>
         </w:tc>
@@ -17057,7 +17057,7 @@
                 <w:color w:val="000000"/>
                 <w:lang w:eastAsia="nl-NL"/>
               </w:rPr>
-              <w:t xml:space="preserve">59,762</w:t>
+              <w:t xml:space="preserve">60,521</w:t>
             </w:r>
           </w:p>
         </w:tc>
@@ -17086,7 +17086,7 @@
                 <w:color w:val="000000"/>
                 <w:lang w:eastAsia="nl-NL"/>
               </w:rPr>
-              <w:t xml:space="preserve">74,255</w:t>
+              <w:t xml:space="preserve">75,015</w:t>
             </w:r>
           </w:p>
         </w:tc>
@@ -17115,7 +17115,7 @@
                 <w:color w:val="000000"/>
                 <w:lang w:eastAsia="nl-NL"/>
               </w:rPr>
-              <w:t xml:space="preserve">87,502</w:t>
+              <w:t xml:space="preserve">88,262</w:t>
             </w:r>
           </w:p>
         </w:tc>
@@ -17475,7 +17475,7 @@
                 <w:color w:val="000000"/>
                 <w:lang w:eastAsia="nl-NL"/>
               </w:rPr>
-              <w:t xml:space="preserve">23,968</w:t>
+              <w:t xml:space="preserve">24,728</w:t>
             </w:r>
           </w:p>
         </w:tc>
@@ -17504,7 +17504,7 @@
                 <w:color w:val="000000"/>
                 <w:lang w:eastAsia="nl-NL"/>
               </w:rPr>
-              <w:t xml:space="preserve">83,73</w:t>
+              <w:t xml:space="preserve">85,249</w:t>
             </w:r>
           </w:p>
         </w:tc>
@@ -17533,7 +17533,7 @@
                 <w:color w:val="000000"/>
                 <w:lang w:eastAsia="nl-NL"/>
               </w:rPr>
-              <w:t xml:space="preserve">157,985</w:t>
+              <w:t xml:space="preserve">160,264</w:t>
             </w:r>
           </w:p>
         </w:tc>
@@ -17562,7 +17562,7 @@
                 <w:color w:val="000000"/>
                 <w:lang w:eastAsia="nl-NL"/>
               </w:rPr>
-              <w:t xml:space="preserve">245,488</w:t>
+              <w:t xml:space="preserve">248,526</w:t>
             </w:r>
           </w:p>
         </w:tc>
@@ -17604,7 +17604,7 @@
         <w:rPr>
           <w:rFonts w:cs="Times New Roman"/>
         </w:rPr>
-        <w:t xml:space="preserve">Alle bedragen zijn doorgerekend met het rekenmodel van de Begrotingsgame op basis van de Ontwerpbegroting 2027 (scenario midden), zonder indexering. De kettingeffecten staan als aparte regels in de tabellen: subsidies moeten worden opgezegd (in 2027 telt een kwart van de besparing mee), lopende Wmo-contracten schuiven die besparing naar 2028, de bijdragen aan de GGD en de Regio Groningen-Assen dalen pas in 2029, en minder preventie leidt vanaf 2028 tot meer jeugdzorg en Wmo-hulp. Kleinere effecten: minder bijstandshuishoudens geven iets minder gemeentefonds, minder cultuur iets minder toeristenbelasting, en extra woningen door minder bouwregels leveren vanaf 2029 wat OZB op maar vragen ook meer onderhoud. De besparing op het ambtenarenapparaat groeit in vier gelijke stappen (25%, 50%, 75% en 100%) naar 53,7 miljoen euro in 2030; de frictiekosten daarvan vallen eenmalig in 2027. De verplichte tegenprestatie levert in 2027 nog niets op, in 2028 de helft en vanaf 2029 1,6 miljoen euro. Bij minder wethouders gaan we ervan uit dat vertrekkende wethouders afzien van wachtgeld, zodat de besparing direct in 2027 telt. Eenmalige posten tellen alleen in 2027 mee. Het saldo van 2027 is in de tabellen hierboven gestort in de reserves; in deze tabel staat het saldo vóór die storting. Door afronding kan de som van de regels in de laatste decimaal afwijken van het totaal.</w:t>
+        <w:t xml:space="preserve">Alle bedragen zijn berekend op basis van de Ontwerpbegroting 2027, zonder indexering. Waar een maatregel tijd nodig heeft of gevolgen heeft voor andere budgetten, staat dat als kettingeffect apart in de tabellen. Dat zijn voorzichtige inschattingen: subsidies moeten worden opgezegd (in 2027 telt een kwart van de besparing mee), lopende Wmo-contracten schuiven die besparing naar 2028, de bijdragen aan de GGD en de Regio Groningen-Assen dalen pas in 2029, en minder preventie leidt vanaf 2028 tot meer jeugdzorg en Wmo-hulp. Kleinere effecten: minder bijstandshuishoudens geven iets minder gemeentefonds, minder cultuur iets minder toeristenbelasting, en extra woningen door minder bouwregels leveren vanaf 2029 wat OZB op maar vragen ook meer onderhoud. De besparing op het ambtenarenapparaat groeit in vier gelijke stappen (25%, 50%, 75% en 100%) naar 53,7 miljoen euro in 2030; de frictiekosten daarvan vallen eenmalig in 2027. De verplichte tegenprestatie levert in 2027 nog niets op, in 2028 de helft en vanaf 2029 1,6 miljoen euro. Bij minder wethouders gaan we ervan uit dat vertrekkende wethouders afzien van wachtgeld, zodat de besparing direct in 2027 telt. Eenmalige posten tellen alleen in 2027 mee. Het saldo van 2027 is in de tabellen hierboven gestort in de reserves; in deze tabel staat het saldo vóór die storting. Door afronding kan de som van de regels in de laatste decimaal afwijken van het totaal.</w:t>
       </w:r>
     </w:p>
     <w:p>

</xml_diff>

<commit_message>
Tegenbegroting 2027: vacaturestop, dubbeltellingen ambtenaren eruit, twijfels verwerkt, fractienamen
Co-Authored-By: Claude Opus 5.5 <noreply@anthropic.com>
Claude-Session: https://claude.ai/code/session_01Gpinc7W9kdxFe2j2GC2ZtD
</commit_message>
<xml_diff>
--- a/tegenbegroting/Tegenbegroting_VVD_Groningen_2027_v2.docx
+++ b/tegenbegroting/Tegenbegroting_VVD_Groningen_2027_v2.docx
@@ -1944,7 +1944,7 @@
             <w:rPr>
               <w:noProof/>
             </w:rPr>
-            <w:t>12</w:t>
+            <w:t>11</w:t>
           </w:r>
           <w:r>
             <w:rPr>
@@ -2010,7 +2010,7 @@
             <w:rPr>
               <w:noProof/>
             </w:rPr>
-            <w:t>12</w:t>
+            <w:t>11</w:t>
           </w:r>
           <w:r>
             <w:rPr>
@@ -2076,7 +2076,7 @@
             <w:rPr>
               <w:noProof/>
             </w:rPr>
-            <w:t>14</w:t>
+            <w:t>13</w:t>
           </w:r>
           <w:r>
             <w:rPr>
@@ -2142,7 +2142,7 @@
             <w:rPr>
               <w:noProof/>
             </w:rPr>
-            <w:t>15</w:t>
+            <w:t>14</w:t>
           </w:r>
           <w:r>
             <w:rPr>
@@ -2216,7 +2216,7 @@
             <w:rPr>
               <w:noProof/>
             </w:rPr>
-            <w:t>17</w:t>
+            <w:t>16</w:t>
           </w:r>
           <w:r>
             <w:rPr>
@@ -2282,7 +2282,7 @@
             <w:rPr>
               <w:noProof/>
             </w:rPr>
-            <w:t>17</w:t>
+            <w:t>16</w:t>
           </w:r>
           <w:r>
             <w:rPr>
@@ -2348,7 +2348,7 @@
             <w:rPr>
               <w:noProof/>
             </w:rPr>
-            <w:t>18</w:t>
+            <w:t>17</w:t>
           </w:r>
           <w:r>
             <w:rPr>
@@ -2414,7 +2414,7 @@
             <w:rPr>
               <w:noProof/>
             </w:rPr>
-            <w:t>19</w:t>
+            <w:t>18</w:t>
           </w:r>
           <w:r>
             <w:rPr>
@@ -2552,7 +2552,7 @@
           <w:lang w:eastAsia="nl-NL"/>
         </w:rPr>
         <w:br/>
-        <w:t>Fokke Veenstra</w:t>
+        <w:t>Cassandra Hensen</w:t>
       </w:r>
       <w:r>
         <w:rPr>
@@ -2560,7 +2560,7 @@
           <w:lang w:eastAsia="nl-NL"/>
         </w:rPr>
         <w:br/>
-        <w:t>Jasper van der Aa</w:t>
+        <w:t>Lisa</w:t>
       </w:r>
       <w:r>
         <w:rPr>
@@ -2568,7 +2568,7 @@
           <w:lang w:eastAsia="nl-NL"/>
         </w:rPr>
         <w:br/>
-        <w:t>Teun Havinga</w:t>
+        <w:t>Fokke Veenstra</w:t>
       </w:r>
     </w:p>
     <w:p>
@@ -2987,7 +2987,7 @@
         <w:rPr>
           <w:rFonts w:cs="Times New Roman"/>
         </w:rPr>
-        <w:t xml:space="preserve">De gemeentelijke overhead is fors gestegen, onder andere door stijgende personeelskosten en een steeds meer uitdijende gemeentelijke organisatie. De VVD vindt dat elke euro aan overhead een euro minder is voor directe uitvoering. We stellen een generieke taakstelling van 20% voor op overhead (zoals stadhuis, ICT, salarisadministratie en HR), zodat middelen worden vrijgemaakt voor veiligheid, onderhoud en lastenverlichting.</w:t>
+        <w:t xml:space="preserve">De gemeentelijke overhead is fors gestegen, onder andere door stijgende personeelskosten en een steeds meer uitdijende gemeentelijke organisatie. De VVD vindt dat elke euro aan overhead een euro minder is voor directe uitvoering. We stellen een generieke taakstelling van 20% voor op overhead (zoals stadhuis, ICT, salarisadministratie en HR), zodat middelen worden vrijgemaakt voor veiligheid, onderhoud en lastenverlichting. Deze besparing telt mee voor de 15% minder ambtenaren.</w:t>
       </w:r>
     </w:p>
     <w:p>
@@ -3012,7 +3012,7 @@
           <w:b/>
           <w:bCs/>
         </w:rPr>
-        <w:t xml:space="preserve">Besparingen op het ambtenarenapparaat 15%</w:t>
+        <w:t xml:space="preserve">Besparingen op het ambtenarenapparaat 15% en een vacaturestop</w:t>
       </w:r>
       <w:r>
         <w:rPr>
@@ -3026,7 +3026,20 @@
         <w:rPr>
           <w:rFonts w:cs="Times New Roman"/>
         </w:rPr>
-        <w:t xml:space="preserve">Wat de VVD betreft moet de gemeente vooral heel veel taken niet meer doen. Daarom kan er flink worden gesneden in het ambtenarenapparaat. De VVD schat in dat hierdoor 15% gesneden kan worden, in de hele organisatie. Alleen met natuurlijk verloop, zoals medewerkers op leeftijd die met pensioen gaan, lukt dat niet binnen vier jaar. Er zijn daarom ook andere maatregelen nodig, zoals het afstoten van taken. De besparing loopt op van 13,4 miljoen euro in 2027 naar 53,7 miljoen euro structureel vanaf 2030. Omdat dit sneller gaat dan natuurlijk verloop, is in 2027 eenmalig 10,9 miljoen euro aan frictiekosten gereserveerd.</w:t>
+        <w:t xml:space="preserve">Wat de VVD betreft moet de gemeente vooral heel veel taken niet meer doen. Daarom kan het ambtenarenapparaat met 15% krimpen: 53,7 miljoen euro per jaar vanaf 2030. Amsterdam laat zien dat het kan: die gemeente heeft een vacature- en inhuurstop ingesteld en wil 2.500 voltijdbanen schrappen.</w:t>
+      </w:r>
+      <w:r>
+        <w:rPr>
+          <w:rStyle w:val="Voetnootmarkering"/>
+          <w:rFonts w:cs="Times New Roman"/>
+        </w:rPr>
+        <w:footnoteReference w:id="1"/>
+      </w:r>
+      <w:r>
+        <w:rPr>
+          <w:rFonts w:cs="Times New Roman"/>
+        </w:rPr>
+        <w:t xml:space="preserve"> De VVD wil ook in Groningen een vacaturestop: vacatures die ontstaan door pensioen of vertrek worden niet meer opgevuld, tenzij het gaat om boa’s en de mensen die de openbare ruimte onderhouden. Daarnaast stoot de gemeente taken af. De besparingen op de overhead (26,3 miljoen euro) en op het klimaat- en energiebeleid (6,5 miljoen euro) tellen mee voor deze 15%. De rest, oplopend van 5,2 miljoen euro in 2027 naar 20,9 miljoen euro vanaf 2030, komt uit de vacaturestop en het afstoten van taken in de rest van de organisatie. Omdat de besparing op de overhead al in 2027 wordt gehaald, sneller dan via natuurlijk verloop kan, is in 2027 eenmalig 8,4 miljoen euro aan frictiekosten opgenomen.</w:t>
       </w:r>
     </w:p>
     <w:p>
@@ -3246,7 +3259,7 @@
           <w:b/>
           <w:bCs/>
         </w:rPr>
-        <w:t xml:space="preserve">Organisatiekosten Energiebedrijf Groningen</w:t>
+        <w:t xml:space="preserve">Diversiteit en inclusie 85%</w:t>
       </w:r>
       <w:r>
         <w:rPr>
@@ -3260,7 +3273,7 @@
         <w:rPr>
           <w:rFonts w:cs="Times New Roman"/>
         </w:rPr>
-        <w:t xml:space="preserve">De gemeente Groningen heeft een eigen energiebedrijf opgericht. Wat de VVD betreft is dit geen kerntaak van de overheid en moeten we hier daarom zo snel mogelijk mee stoppen. Nieuwe grote zonne- en windprojecten laat de gemeente aan de markt over. Dat scheelt in 2027 eenmalig 0,2 miljoen euro aan organisatiekosten.</w:t>
+        <w:t xml:space="preserve">De gemeente investeert in diversiteitsprojecten en inclusieprogramma’s die vooral beleid en overlegstructuren opleveren. Dit is een van de onderdelen waarop de VVD de gemeentelijke organisatie wil laten krimpen. Daarom gaat het budget voor diversiteit en inclusie met 85% omlaag.</w:t>
       </w:r>
     </w:p>
     <w:p>
@@ -3285,7 +3298,7 @@
           <w:b/>
           <w:bCs/>
         </w:rPr>
-        <w:t xml:space="preserve">Stoppen met het plan van aanpak diversiteit en diversiteit en inclusie 85%</w:t>
+        <w:t xml:space="preserve">Minder bouwregels: welstandsvrij bouwen</w:t>
       </w:r>
       <w:r>
         <w:rPr>
@@ -3299,7 +3312,7 @@
         <w:rPr>
           <w:rFonts w:cs="Times New Roman"/>
         </w:rPr>
-        <w:t xml:space="preserve">De gemeente investeert in diversiteitsprojecten en inclusieprogramma’s die vooral beleid en overlegstructuren opleveren. Dit is een van de onderdelen waarop de VVD de gemeentelijke organisatie wil laten krimpen. Daarom stopt de gemeente met het diversiteitsplan voor eigen personeel (eenmalig 0,2 miljoen euro) en gaat het budget voor diversiteit en inclusie met 85% omlaag.</w:t>
+        <w:t xml:space="preserve">De welstandscommissie krijgt minder macht. Er komt één welstandsnota met zo min mogelijk regels en nieuwe wijken worden vaker welstandsvrij. Dat versnelt de bouw. Er zijn dan ook minder ambtenaren voor wonen nodig; die besparing valt binnen de 15% minder ambtenaren en staat daarom niet apart in de tabel.</w:t>
       </w:r>
     </w:p>
     <w:p>
@@ -3324,7 +3337,7 @@
           <w:b/>
           <w:bCs/>
         </w:rPr>
-        <w:t xml:space="preserve">Minder bouwregels: welstandsvrij bouwen</w:t>
+        <w:t xml:space="preserve">Elektrisch maken gemeenteauto’s uitstellen</w:t>
       </w:r>
       <w:r>
         <w:rPr>
@@ -3338,7 +3351,7 @@
         <w:rPr>
           <w:rFonts w:cs="Times New Roman"/>
         </w:rPr>
-        <w:t xml:space="preserve">De welstandscommissie krijgt minder macht. Er komt één welstandsnota met zo min mogelijk regels en nieuwe wijken worden vaker welstandsvrij. Dan zijn er ook minder ambtenaren voor wonen nodig. Het versnelt bovendien de bouw, waardoor er meer woningen komen die OZB betalen.</w:t>
+        <w:t xml:space="preserve">De gemeente koopt voorlopig weer gewone auto’s en busjes in plaats van elektrische. Dat is goedkoper: 0,6 miljoen euro in 2027 en 0,9 miljoen euro per jaar vanaf 2028. De gemeente stoot hierdoor wel meer CO2 uit.</w:t>
       </w:r>
     </w:p>
     <w:p>
@@ -3363,7 +3376,7 @@
           <w:b/>
           <w:bCs/>
         </w:rPr>
-        <w:t xml:space="preserve">Elektrisch maken gemeenteauto’s uitstellen</w:t>
+        <w:t xml:space="preserve">Overige ombuigingen</w:t>
       </w:r>
       <w:r>
         <w:rPr>
@@ -3377,46 +3390,7 @@
         <w:rPr>
           <w:rFonts w:cs="Times New Roman"/>
         </w:rPr>
-        <w:t xml:space="preserve">De gemeente koopt voorlopig weer gewone auto’s en busjes in plaats van elektrische. Dat is goedkoper, maar de gemeente stoot hierdoor meer CO2 uit.</w:t>
-      </w:r>
-    </w:p>
-    <w:p>
-      <w:pPr>
-        <w:pStyle w:val="Hoofdtekst"/>
-        <w:rPr>
-          <w:rFonts w:cs="Times New Roman"/>
-        </w:rPr>
-      </w:pPr>
-      <w:r>
-        <w:rPr>
-          <w:color w:val="FF6400"/>
-        </w:rPr>
-        <w:t>▶</w:t>
-      </w:r>
-      <w:r>
-        <w:tab/>
-      </w:r>
-      <w:r>
-        <w:rPr>
-          <w:rFonts w:cs="Times New Roman"/>
-          <w:b/>
-          <w:bCs/>
-        </w:rPr>
-        <w:t xml:space="preserve">Overige ombuigingen</w:t>
-      </w:r>
-      <w:r>
-        <w:rPr>
-          <w:rFonts w:cs="Times New Roman"/>
-          <w:b/>
-          <w:bCs/>
-        </w:rPr>
-        <w:t xml:space="preserve">. </w:t>
-      </w:r>
-      <w:r>
-        <w:rPr>
-          <w:rFonts w:cs="Times New Roman"/>
-        </w:rPr>
-        <w:t xml:space="preserve">De gemeente geeft geen geld meer voor Campus Camera (0,1 miljoen euro per jaar). Ook stopt de gemeente met het budget voor internationale solidariteit (0,05 miljoen euro per jaar) en met de subsidie voor dierenartskosten (0,05 miljoen euro eenmalig).</w:t>
+        <w:t xml:space="preserve">De gemeente geeft geen geld meer voor Campus Camera (0,1 miljoen euro per jaar). Ook stopt de gemeente met het budget voor internationale solidariteit (0,05 miljoen euro per jaar) en met de subsidie voor dierenartskosten (0,05 miljoen euro in 2027).</w:t>
       </w:r>
     </w:p>
     <w:p>
@@ -3456,7 +3430,7 @@
         <w:rPr>
           <w:rStyle w:val="Voetnootmarkering"/>
         </w:rPr>
-        <w:footnoteReference w:id="1"/>
+        <w:footnoteReference w:id="2"/>
       </w:r>
       <w:r>
         <w:rPr>
@@ -4716,7 +4690,7 @@
           <w:b/>
           <w:bCs/>
         </w:rPr>
-        <w:t xml:space="preserve">Stoppen met extra programma’s in het sociaal domein</w:t>
+        <w:t xml:space="preserve">Stoppen met extra programma’s voor werk</w:t>
       </w:r>
       <w:r>
         <w:rPr>
@@ -4730,7 +4704,7 @@
         <w:rPr>
           <w:rFonts w:cs="Times New Roman"/>
         </w:rPr>
-        <w:t xml:space="preserve">De gemeente stopt met het preventiefonds jeugd (4,5 miljoen euro), het extra werkprogramma voor mensen in de bijstand (1,05 miljoen euro) en de uitbreiding van Route Arbeid+ voor jongeren uit het praktijk- en speciaal onderwijs (0,35 miljoen euro). Dit zijn tijdelijke extra programma’s bovenop de gewone jeugdhulp en re-integratie; samen leveren ze in 2027 eenmalig 5,9 miljoen euro op. De jongeren die nu in Route Arbeid+ zitten, houden hun begeleiding. De VVD kiest ervoor het geld voor jeugd en werk in de vaste budgetten te steken: 10% extra voor jeugdzorg en 10% extra voor begeleiding naar werk.</w:t>
+        <w:t xml:space="preserve">De gemeente stopt met het extra werkprogramma voor mensen in de bijstand (0,85 miljoen euro) en met de uitbreiding van Route Arbeid+ voor jongeren uit het praktijk- en speciaal onderwijs (0,35 miljoen euro). Dit zijn tijdelijke extra programma’s bovenop de gewone re-integratie; samen leveren ze in 2027 eenmalig 1,2 miljoen euro op. De jongeren die nu in Route Arbeid+ zitten, houden hun begeleiding. De VVD steekt het geld voor werk liever in het vaste budget: 10% extra voor begeleiding naar werk.</w:t>
       </w:r>
     </w:p>
     <w:p>
@@ -4815,7 +4789,7 @@
           <w:rStyle w:val="Voetnootmarkering"/>
           <w:rFonts w:cs="Times New Roman"/>
         </w:rPr>
-        <w:footnoteReference w:id="2"/>
+        <w:footnoteReference w:id="3"/>
       </w:r>
       <w:r>
         <w:rPr>
@@ -5023,7 +4997,7 @@
           <w:rStyle w:val="Voetnootmarkering"/>
           <w:rFonts w:cs="Times New Roman"/>
         </w:rPr>
-        <w:footnoteReference w:id="3"/>
+        <w:footnoteReference w:id="4"/>
       </w:r>
       <w:r>
         <w:rPr>
@@ -5114,7 +5088,7 @@
           <w:rStyle w:val="Voetnootmarkering"/>
           <w:rFonts w:cs="Times New Roman"/>
         </w:rPr>
-        <w:footnoteReference w:id="4"/>
+        <w:footnoteReference w:id="5"/>
       </w:r>
       <w:r>
         <w:rPr>
@@ -5229,7 +5203,7 @@
           <w:rStyle w:val="Voetnootmarkering"/>
           <w:rFonts w:cs="Times New Roman"/>
         </w:rPr>
-        <w:footnoteReference w:id="5"/>
+        <w:footnoteReference w:id="6"/>
       </w:r>
       <w:r>
         <w:rPr>
@@ -5299,7 +5273,7 @@
           <w:b/>
           <w:bCs/>
         </w:rPr>
-        <w:t xml:space="preserve">Schrappen cultuurprogramma Niemeyer</w:t>
+        <w:t xml:space="preserve">Aanpak Oosterhamrikzone 100%</w:t>
       </w:r>
       <w:r>
         <w:rPr>
@@ -5313,7 +5287,7 @@
         <w:rPr>
           <w:rFonts w:cs="Times New Roman"/>
         </w:rPr>
-        <w:t xml:space="preserve">Niemeyer zou volledig door de markt georganiseerd worden zonder dat hier gemeentelijke middelen heen zouden gaan. Nu blijkt dat in deze begroting er geld wordt gereserveerd voor het cultuurprogramma. De VVD is hier geen voorstander van en wil Niemeyer volledig aan de markt overlaten.</w:t>
+        <w:t xml:space="preserve">In de begroting staat 0,25 miljoen euro per jaar uit het stedelijk investeringsfonds voor projecten in de Oosterhamrikzone, terwijl de uitvoering onzeker is en de kosten blijven stijgen. De VVD vindt dat de focus moet liggen op haalbare projecten met direct maatschappelijk nut. Daarom schrappen we dit budget. Dat brengt duidelijkheid voor bewoners en ondernemers in het gebied.</w:t>
       </w:r>
     </w:p>
     <w:p>
@@ -5338,7 +5312,7 @@
           <w:b/>
           <w:bCs/>
         </w:rPr>
-        <w:t xml:space="preserve">Aanpak Oosterhamrikzone 100%</w:t>
+        <w:t xml:space="preserve">Klimaat- en energiebeleid (CDOKE) 60%</w:t>
       </w:r>
       <w:r>
         <w:rPr>
@@ -5352,7 +5326,7 @@
         <w:rPr>
           <w:rFonts w:cs="Times New Roman"/>
         </w:rPr>
-        <w:t xml:space="preserve">De gemeente Groningen reserveert jaarlijks middelen voor de verdere planvorming rond de Oosterhamrikzone, ondanks dat de uitvoering onzeker is en de kosten blijven stijgen. De VVD vindt dat de focus moet liggen op haalbare projecten met direct maatschappelijk nut. Daarom stopt de planvorming en wordt de busbaan niet verlegd. Dat brengt duidelijkheid voor bewoners en ondernemers in het gebied.</w:t>
+        <w:t xml:space="preserve">De gemeente Groningen heeft op klimaat en energie een groot apparaat en grote ambities, zoals de routekaart CO2-neutraal en de warmtetransitie. De VVD wil een realistische en betaalbare energietransitie en vraagt daarom een taakstelling van 60% op dit budget, dat vooral bestaat uit ambtelijke capaciteit; deze besparing telt mee voor de 15% minder ambtenaren. Ook extra geld voor de energietransitie (40%), energiesubsidies (55%) en natuur- en duurzaamheidseducatie (100%) gaan omlaag. Het grootste deel van de energiesubsidies wordt betaald uit inkomsten van buiten de gemeente (3,3 van de 4,3 miljoen euro); daarom levert die bezuiniging netto weinig op.</w:t>
       </w:r>
     </w:p>
     <w:p>
@@ -5377,7 +5351,7 @@
           <w:b/>
           <w:bCs/>
         </w:rPr>
-        <w:t xml:space="preserve">Klimaat- en energiebeleid (CDOKE) 60%</w:t>
+        <w:t xml:space="preserve">Taakstelling mobiliteit en ruimte</w:t>
       </w:r>
       <w:r>
         <w:rPr>
@@ -5391,85 +5365,7 @@
         <w:rPr>
           <w:rFonts w:cs="Times New Roman"/>
         </w:rPr>
-        <w:t xml:space="preserve">De gemeente Groningen heeft op klimaat en energie een groot apparaat en grote ambities, zoals de routekaart CO2-neutraal en de warmtetransitie. De VVD wil een realistische en betaalbare energietransitie en vraagt daarom een taakstelling van 60% op dit budget. Ook extra geld voor de energietransitie (40%), energiesubsidies (55%) en natuur- en duurzaamheidseducatie (100%) gaan omlaag. Het grootste deel van de energiesubsidies wordt betaald uit inkomsten van buiten de gemeente (3,3 van de 4,3 miljoen euro); daarom levert die bezuiniging netto weinig op.</w:t>
-      </w:r>
-    </w:p>
-    <w:p>
-      <w:pPr>
-        <w:pStyle w:val="Hoofdtekst"/>
-        <w:rPr>
-          <w:rFonts w:cs="Times New Roman"/>
-        </w:rPr>
-      </w:pPr>
-      <w:r>
-        <w:rPr>
-          <w:color w:val="FF6400"/>
-        </w:rPr>
-        <w:t>▶</w:t>
-      </w:r>
-      <w:r>
-        <w:tab/>
-      </w:r>
-      <w:r>
-        <w:rPr>
-          <w:rFonts w:cs="Times New Roman"/>
-          <w:b/>
-          <w:bCs/>
-        </w:rPr>
-        <w:t xml:space="preserve">Taakstelling mobiliteit en ruimte</w:t>
-      </w:r>
-      <w:r>
-        <w:rPr>
-          <w:rFonts w:cs="Times New Roman"/>
-          <w:b/>
-          <w:bCs/>
-        </w:rPr>
-        <w:t xml:space="preserve">. </w:t>
-      </w:r>
-      <w:r>
-        <w:rPr>
-          <w:rFonts w:cs="Times New Roman"/>
-        </w:rPr>
-        <w:t xml:space="preserve">De gemeente kan met minder ambtenaren en minder plannen toe op mobiliteit en ruimte: ambtenaren mobiliteit (40%), uitvoering mobiliteitsvisie (55%), geo en data (15%) en ambtenaren wonen (25%). De VVD kiest voor haalbare projecten met direct nut voor inwoners.</w:t>
-      </w:r>
-    </w:p>
-    <w:p>
-      <w:pPr>
-        <w:pStyle w:val="Hoofdtekst"/>
-        <w:rPr>
-          <w:rFonts w:cs="Times New Roman"/>
-        </w:rPr>
-      </w:pPr>
-      <w:r>
-        <w:rPr>
-          <w:color w:val="FF6400"/>
-        </w:rPr>
-        <w:t>▶</w:t>
-      </w:r>
-      <w:r>
-        <w:tab/>
-      </w:r>
-      <w:r>
-        <w:rPr>
-          <w:rFonts w:cs="Times New Roman"/>
-          <w:b/>
-          <w:bCs/>
-        </w:rPr>
-        <w:t xml:space="preserve">Parkeercontrole 20%</w:t>
-      </w:r>
-      <w:r>
-        <w:rPr>
-          <w:rFonts w:cs="Times New Roman"/>
-          <w:b/>
-          <w:bCs/>
-        </w:rPr>
-        <w:t xml:space="preserve">. </w:t>
-      </w:r>
-      <w:r>
-        <w:rPr>
-          <w:rFonts w:cs="Times New Roman"/>
-        </w:rPr>
-        <w:t xml:space="preserve">Er komt minder parkeercontrole. Let op: daardoor mist de gemeente naheffingen en betalen meer mensen niet voor parkeren. Per saldo kost dit de gemeente ongeveer 0,4 miljoen euro per jaar.</w:t>
+        <w:t xml:space="preserve">De gemeente kan met minder plannen toe op mobiliteit en ruimte: de uitvoering van de mobiliteitsvisie gaat 55% omlaag en geo en data 15%. Minder ambtenaren voor mobiliteit en wonen valt onder de vacaturestop en de 15% minder ambtenaren. De VVD kiest voor haalbare projecten met direct nut voor inwoners.</w:t>
       </w:r>
     </w:p>
     <w:p>
@@ -5774,7 +5670,7 @@
         <w:rPr>
           <w:rStyle w:val="Voetnootmarkering"/>
         </w:rPr>
-        <w:footnoteReference w:id="6"/>
+        <w:footnoteReference w:id="7"/>
       </w:r>
       <w:r>
         <w:rPr>
@@ -5827,7 +5723,7 @@
           <w:rStyle w:val="Voetnootmarkering"/>
           <w:rFonts w:cs="Times New Roman"/>
         </w:rPr>
-        <w:footnoteReference w:id="7"/>
+        <w:footnoteReference w:id="8"/>
       </w:r>
       <w:r>
         <w:rPr>
@@ -5918,7 +5814,7 @@
           <w:rStyle w:val="Voetnootmarkering"/>
           <w:rFonts w:cs="Times New Roman"/>
         </w:rPr>
-        <w:footnoteReference w:id="8"/>
+        <w:footnoteReference w:id="9"/>
       </w:r>
       <w:r>
         <w:rPr>
@@ -6303,7 +6199,7 @@
           <w:rStyle w:val="Voetnootmarkering"/>
           <w:rFonts w:cs="Times New Roman"/>
         </w:rPr>
-        <w:footnoteReference w:id="9"/>
+        <w:footnoteReference w:id="10"/>
       </w:r>
       <w:r>
         <w:rPr>
@@ -6543,7 +6439,7 @@
         <w:rPr>
           <w:rFonts w:cs="Times New Roman"/>
         </w:rPr>
-        <w:t xml:space="preserve">De financiële positie van de gemeente staat er niet goed voor. Daarom wil de VVD de reserves van de gemeente laten toenemen, waardoor de financiële positie van onze gemeente flink verbetert. Een gezonde balans voorkomt dat toekomstige generaties opdraaien voor de uitgaven van vandaag. Het saldo dat na alle keuzes in 2027 overblijft, 24,7 miljoen euro, storten we hiervoor. Het structurele overschot loopt op tot 88,3 miljoen euro in 2030.</w:t>
+        <w:t xml:space="preserve">De financiële positie van de gemeente staat er niet goed voor. Daarom wil de VVD de reserves van de gemeente laten toenemen, waardoor de financiële positie van onze gemeente flink verbetert. Een gezonde balans voorkomt dat toekomstige generaties opdraaien voor de uitgaven van vandaag. Het saldo dat na alle keuzes in 2027 overblijft, 11,4 miljoen euro, storten we hiervoor. Het structurele overschot loopt op tot 53,4 miljoen euro in 2030.</w:t>
       </w:r>
     </w:p>
     <w:p>
@@ -7057,7 +6953,7 @@
                 <w:color w:val="000000"/>
                 <w:lang w:eastAsia="nl-NL"/>
               </w:rPr>
-              <w:t xml:space="preserve">Besparing overhead 20%</w:t>
+              <w:t xml:space="preserve">Besparing overhead 20% (onderdeel van de 15% minder ambtenaren)</w:t>
             </w:r>
           </w:p>
         </w:tc>
@@ -7148,7 +7044,7 @@
                 <w:color w:val="000000"/>
                 <w:lang w:eastAsia="nl-NL"/>
               </w:rPr>
-              <w:t xml:space="preserve">Besparingen op het ambtenarenapparaat 15% (oplopend)</w:t>
+              <w:t xml:space="preserve">Taakstelling cultuur, instellingen en subsidies 40%</w:t>
             </w:r>
           </w:p>
         </w:tc>
@@ -7177,7 +7073,7 @@
                 <w:color w:val="000000"/>
                 <w:lang w:eastAsia="nl-NL"/>
               </w:rPr>
-              <w:t xml:space="preserve">13,423</w:t>
+              <w:t xml:space="preserve">11,6</w:t>
             </w:r>
           </w:p>
         </w:tc>
@@ -7239,7 +7135,7 @@
                 <w:color w:val="000000"/>
                 <w:lang w:eastAsia="nl-NL"/>
               </w:rPr>
-              <w:t xml:space="preserve">Taakstelling cultuur, instellingen en subsidies 40%</w:t>
+              <w:t xml:space="preserve">Wmo 15%</w:t>
             </w:r>
           </w:p>
         </w:tc>
@@ -7268,7 +7164,7 @@
                 <w:color w:val="000000"/>
                 <w:lang w:eastAsia="nl-NL"/>
               </w:rPr>
-              <w:t xml:space="preserve">11,6</w:t>
+              <w:t xml:space="preserve">10,32</w:t>
             </w:r>
           </w:p>
         </w:tc>
@@ -7330,7 +7226,7 @@
                 <w:color w:val="000000"/>
                 <w:lang w:eastAsia="nl-NL"/>
               </w:rPr>
-              <w:t xml:space="preserve">Wmo 15%</w:t>
+              <w:t xml:space="preserve">Taakstelling WIJ-teams 20%</w:t>
             </w:r>
           </w:p>
         </w:tc>
@@ -7359,7 +7255,7 @@
                 <w:color w:val="000000"/>
                 <w:lang w:eastAsia="nl-NL"/>
               </w:rPr>
-              <w:t xml:space="preserve">10,32</w:t>
+              <w:t xml:space="preserve">9,26</w:t>
             </w:r>
           </w:p>
         </w:tc>
@@ -7421,7 +7317,7 @@
                 <w:color w:val="000000"/>
                 <w:lang w:eastAsia="nl-NL"/>
               </w:rPr>
-              <w:t xml:space="preserve">Taakstelling WIJ-teams 20%</w:t>
+              <w:t xml:space="preserve">Schrappen basisbanen 100%</w:t>
             </w:r>
           </w:p>
         </w:tc>
@@ -7450,7 +7346,7 @@
                 <w:color w:val="000000"/>
                 <w:lang w:eastAsia="nl-NL"/>
               </w:rPr>
-              <w:t xml:space="preserve">9,26</w:t>
+              <w:t xml:space="preserve">6,7</w:t>
             </w:r>
           </w:p>
         </w:tc>
@@ -7512,7 +7408,7 @@
                 <w:color w:val="000000"/>
                 <w:lang w:eastAsia="nl-NL"/>
               </w:rPr>
-              <w:t xml:space="preserve">Schrappen basisbanen 100%</w:t>
+              <w:t xml:space="preserve">Klimaat- en energiebeleid (CDOKE) 60% (onderdeel van de 15%)</w:t>
             </w:r>
           </w:p>
         </w:tc>
@@ -7541,7 +7437,7 @@
                 <w:color w:val="000000"/>
                 <w:lang w:eastAsia="nl-NL"/>
               </w:rPr>
-              <w:t xml:space="preserve">6,7</w:t>
+              <w:t xml:space="preserve">6,54</w:t>
             </w:r>
           </w:p>
         </w:tc>
@@ -7603,7 +7499,7 @@
                 <w:color w:val="000000"/>
                 <w:lang w:eastAsia="nl-NL"/>
               </w:rPr>
-              <w:t xml:space="preserve">Klimaat- en energiebeleid (CDOKE) 60%</w:t>
+              <w:t xml:space="preserve">Taakstelling armoede- en minimaregelingen 40%</w:t>
             </w:r>
           </w:p>
         </w:tc>
@@ -7632,7 +7528,7 @@
                 <w:color w:val="000000"/>
                 <w:lang w:eastAsia="nl-NL"/>
               </w:rPr>
-              <w:t xml:space="preserve">6,54</w:t>
+              <w:t xml:space="preserve">5,56</w:t>
             </w:r>
           </w:p>
         </w:tc>
@@ -7694,7 +7590,7 @@
                 <w:color w:val="000000"/>
                 <w:lang w:eastAsia="nl-NL"/>
               </w:rPr>
-              <w:t xml:space="preserve">Taakstelling armoede- en minimaregelingen 40%</w:t>
+              <w:t xml:space="preserve">Ambtenarenapparaat 15%: vacaturestop en afstoten van taken (oplopend)</w:t>
             </w:r>
           </w:p>
         </w:tc>
@@ -7723,7 +7619,7 @@
                 <w:color w:val="000000"/>
                 <w:lang w:eastAsia="nl-NL"/>
               </w:rPr>
-              <w:t xml:space="preserve">5,56</w:t>
+              <w:t xml:space="preserve">5,213</w:t>
             </w:r>
           </w:p>
         </w:tc>
@@ -8695,7 +8591,7 @@
                 <w:color w:val="000000"/>
                 <w:lang w:eastAsia="nl-NL"/>
               </w:rPr>
-              <w:t xml:space="preserve">Ambtenaren mobiliteit 40%</w:t>
+              <w:t xml:space="preserve">Diversiteit en inclusie 85%</w:t>
             </w:r>
           </w:p>
         </w:tc>
@@ -8724,7 +8620,7 @@
                 <w:color w:val="000000"/>
                 <w:lang w:eastAsia="nl-NL"/>
               </w:rPr>
-              <w:t xml:space="preserve">1,32</w:t>
+              <w:t xml:space="preserve">1,19</w:t>
             </w:r>
           </w:p>
         </w:tc>
@@ -8786,7 +8682,7 @@
                 <w:color w:val="000000"/>
                 <w:lang w:eastAsia="nl-NL"/>
               </w:rPr>
-              <w:t xml:space="preserve">Ambtenaren wonen 25%</w:t>
+              <w:t xml:space="preserve">Cultuur- en evenementenbeleid 10%</w:t>
             </w:r>
           </w:p>
         </w:tc>
@@ -8815,7 +8711,7 @@
                 <w:color w:val="000000"/>
                 <w:lang w:eastAsia="nl-NL"/>
               </w:rPr>
-              <w:t xml:space="preserve">1,225</w:t>
+              <w:t xml:space="preserve">1,0</w:t>
             </w:r>
           </w:p>
         </w:tc>
@@ -8877,7 +8773,7 @@
                 <w:color w:val="000000"/>
                 <w:lang w:eastAsia="nl-NL"/>
               </w:rPr>
-              <w:t xml:space="preserve">Diversiteit en inclusie 85%</w:t>
+              <w:t xml:space="preserve">Extra geld energietransitie 40%</w:t>
             </w:r>
           </w:p>
         </w:tc>
@@ -8906,7 +8802,7 @@
                 <w:color w:val="000000"/>
                 <w:lang w:eastAsia="nl-NL"/>
               </w:rPr>
-              <w:t xml:space="preserve">1,19</w:t>
+              <w:t xml:space="preserve">0,92</w:t>
             </w:r>
           </w:p>
         </w:tc>
@@ -8968,7 +8864,7 @@
                 <w:color w:val="000000"/>
                 <w:lang w:eastAsia="nl-NL"/>
               </w:rPr>
-              <w:t xml:space="preserve">Cultuur- en evenementenbeleid 10%</w:t>
+              <w:t xml:space="preserve">Uitvoering mobiliteitsvisie 55%</w:t>
             </w:r>
           </w:p>
         </w:tc>
@@ -8997,7 +8893,7 @@
                 <w:color w:val="000000"/>
                 <w:lang w:eastAsia="nl-NL"/>
               </w:rPr>
-              <w:t xml:space="preserve">1,0</w:t>
+              <w:t xml:space="preserve">0,858</w:t>
             </w:r>
           </w:p>
         </w:tc>
@@ -9059,7 +8955,7 @@
                 <w:color w:val="000000"/>
                 <w:lang w:eastAsia="nl-NL"/>
               </w:rPr>
-              <w:t xml:space="preserve">Extra geld energietransitie 40%</w:t>
+              <w:t xml:space="preserve">Cultureel vastgoed 25%</w:t>
             </w:r>
           </w:p>
         </w:tc>
@@ -9088,7 +8984,7 @@
                 <w:color w:val="000000"/>
                 <w:lang w:eastAsia="nl-NL"/>
               </w:rPr>
-              <w:t xml:space="preserve">0,92</w:t>
+              <w:t xml:space="preserve">0,85</w:t>
             </w:r>
           </w:p>
         </w:tc>
@@ -9150,7 +9046,7 @@
                 <w:color w:val="000000"/>
                 <w:lang w:eastAsia="nl-NL"/>
               </w:rPr>
-              <w:t xml:space="preserve">Uitvoering mobiliteitsvisie 55%</w:t>
+              <w:t xml:space="preserve">Strategisch bezit en grondzaken 35%</w:t>
             </w:r>
           </w:p>
         </w:tc>
@@ -9179,7 +9075,7 @@
                 <w:color w:val="000000"/>
                 <w:lang w:eastAsia="nl-NL"/>
               </w:rPr>
-              <w:t xml:space="preserve">0,858</w:t>
+              <w:t xml:space="preserve">0,84</w:t>
             </w:r>
           </w:p>
         </w:tc>
@@ -9241,7 +9137,7 @@
                 <w:color w:val="000000"/>
                 <w:lang w:eastAsia="nl-NL"/>
               </w:rPr>
-              <w:t xml:space="preserve">Cultureel vastgoed 25%</w:t>
+              <w:t xml:space="preserve">Samenwerkingsverbanden 30%</w:t>
             </w:r>
           </w:p>
         </w:tc>
@@ -9270,7 +9166,7 @@
                 <w:color w:val="000000"/>
                 <w:lang w:eastAsia="nl-NL"/>
               </w:rPr>
-              <w:t xml:space="preserve">0,85</w:t>
+              <w:t xml:space="preserve">0,63</w:t>
             </w:r>
           </w:p>
         </w:tc>
@@ -9332,7 +9228,7 @@
                 <w:color w:val="000000"/>
                 <w:lang w:eastAsia="nl-NL"/>
               </w:rPr>
-              <w:t xml:space="preserve">Strategisch bezit en grondzaken 35%</w:t>
+              <w:t xml:space="preserve">Minder wethouders 24%</w:t>
             </w:r>
           </w:p>
         </w:tc>
@@ -9361,7 +9257,7 @@
                 <w:color w:val="000000"/>
                 <w:lang w:eastAsia="nl-NL"/>
               </w:rPr>
-              <w:t xml:space="preserve">0,84</w:t>
+              <w:t xml:space="preserve">0,576</w:t>
             </w:r>
           </w:p>
         </w:tc>
@@ -9423,7 +9319,7 @@
                 <w:color w:val="000000"/>
                 <w:lang w:eastAsia="nl-NL"/>
               </w:rPr>
-              <w:t xml:space="preserve">Samenwerkingsverbanden 30%</w:t>
+              <w:t xml:space="preserve">Elektrisch maken gemeenteauto’s uitstellen (oplopend)</w:t>
             </w:r>
           </w:p>
         </w:tc>
@@ -9452,7 +9348,7 @@
                 <w:color w:val="000000"/>
                 <w:lang w:eastAsia="nl-NL"/>
               </w:rPr>
-              <w:t xml:space="preserve">0,63</w:t>
+              <w:t xml:space="preserve">0,565</w:t>
             </w:r>
           </w:p>
         </w:tc>
@@ -9514,7 +9410,7 @@
                 <w:color w:val="000000"/>
                 <w:lang w:eastAsia="nl-NL"/>
               </w:rPr>
-              <w:t xml:space="preserve">Minder wethouders 24%</w:t>
+              <w:t xml:space="preserve">Energiesubsidies 55%</w:t>
             </w:r>
           </w:p>
         </w:tc>
@@ -9543,7 +9439,7 @@
                 <w:color w:val="000000"/>
                 <w:lang w:eastAsia="nl-NL"/>
               </w:rPr>
-              <w:t xml:space="preserve">0,576</w:t>
+              <w:t xml:space="preserve">0,55</w:t>
             </w:r>
           </w:p>
         </w:tc>
@@ -9605,7 +9501,7 @@
                 <w:color w:val="000000"/>
                 <w:lang w:eastAsia="nl-NL"/>
               </w:rPr>
-              <w:t xml:space="preserve">Energiesubsidies 55%</w:t>
+              <w:t xml:space="preserve">Kettingeffect: meer begeleiding naar werk, minder bijstand</w:t>
             </w:r>
           </w:p>
         </w:tc>
@@ -9634,7 +9530,7 @@
                 <w:color w:val="000000"/>
                 <w:lang w:eastAsia="nl-NL"/>
               </w:rPr>
-              <w:t xml:space="preserve">0,55</w:t>
+              <w:t xml:space="preserve">0,482</w:t>
             </w:r>
           </w:p>
         </w:tc>
@@ -9696,7 +9592,7 @@
                 <w:color w:val="000000"/>
                 <w:lang w:eastAsia="nl-NL"/>
               </w:rPr>
-              <w:t xml:space="preserve">Minder bouwregels: welstandsvrij bouwen</w:t>
+              <w:t xml:space="preserve">Regio Groningen-Assen 25%</w:t>
             </w:r>
           </w:p>
         </w:tc>
@@ -9725,7 +9621,7 @@
                 <w:color w:val="000000"/>
                 <w:lang w:eastAsia="nl-NL"/>
               </w:rPr>
-              <w:t xml:space="preserve">0,49</w:t>
+              <w:t xml:space="preserve">0,275</w:t>
             </w:r>
           </w:p>
         </w:tc>
@@ -9787,7 +9683,7 @@
                 <w:color w:val="000000"/>
                 <w:lang w:eastAsia="nl-NL"/>
               </w:rPr>
-              <w:t xml:space="preserve">Kettingeffect: meer begeleiding naar werk, minder bijstand</w:t>
+              <w:t xml:space="preserve">Geo en data 15%</w:t>
             </w:r>
           </w:p>
         </w:tc>
@@ -9816,7 +9712,7 @@
                 <w:color w:val="000000"/>
                 <w:lang w:eastAsia="nl-NL"/>
               </w:rPr>
-              <w:t xml:space="preserve">0,482</w:t>
+              <w:t xml:space="preserve">0,27</w:t>
             </w:r>
           </w:p>
         </w:tc>
@@ -9878,7 +9774,7 @@
                 <w:color w:val="000000"/>
                 <w:lang w:eastAsia="nl-NL"/>
               </w:rPr>
-              <w:t xml:space="preserve">Regio Groningen-Assen 25%</w:t>
+              <w:t xml:space="preserve">Aanpak Oosterhamrikzone 100%</w:t>
             </w:r>
           </w:p>
         </w:tc>
@@ -9907,7 +9803,7 @@
                 <w:color w:val="000000"/>
                 <w:lang w:eastAsia="nl-NL"/>
               </w:rPr>
-              <w:t xml:space="preserve">0,275</w:t>
+              <w:t xml:space="preserve">0,25</w:t>
             </w:r>
           </w:p>
         </w:tc>
@@ -9969,7 +9865,7 @@
                 <w:color w:val="000000"/>
                 <w:lang w:eastAsia="nl-NL"/>
               </w:rPr>
-              <w:t xml:space="preserve">Geo en data 15%</w:t>
+              <w:t xml:space="preserve">Opvang vluchtelingen en asielzoekers 16,7%</w:t>
             </w:r>
           </w:p>
         </w:tc>
@@ -9998,7 +9894,7 @@
                 <w:color w:val="000000"/>
                 <w:lang w:eastAsia="nl-NL"/>
               </w:rPr>
-              <w:t xml:space="preserve">0,27</w:t>
+              <w:t xml:space="preserve">0,2</w:t>
             </w:r>
           </w:p>
         </w:tc>
@@ -10060,7 +9956,7 @@
                 <w:color w:val="000000"/>
                 <w:lang w:eastAsia="nl-NL"/>
               </w:rPr>
-              <w:t xml:space="preserve">Aanpak Oosterhamrikzone 100%</w:t>
+              <w:t xml:space="preserve">Geen geld voor Campus Camera</w:t>
             </w:r>
           </w:p>
         </w:tc>
@@ -10089,7 +9985,7 @@
                 <w:color w:val="000000"/>
                 <w:lang w:eastAsia="nl-NL"/>
               </w:rPr>
-              <w:t xml:space="preserve">0,25</w:t>
+              <w:t xml:space="preserve">0,1</w:t>
             </w:r>
           </w:p>
         </w:tc>
@@ -10151,7 +10047,7 @@
                 <w:color w:val="000000"/>
                 <w:lang w:eastAsia="nl-NL"/>
               </w:rPr>
-              <w:t xml:space="preserve">Opvang vluchtelingen en asielzoekers 16,7%</w:t>
+              <w:t xml:space="preserve">Stoppen met budget internationale solidariteit</w:t>
             </w:r>
           </w:p>
         </w:tc>
@@ -10180,7 +10076,7 @@
                 <w:color w:val="000000"/>
                 <w:lang w:eastAsia="nl-NL"/>
               </w:rPr>
-              <w:t xml:space="preserve">0,2</w:t>
+              <w:t xml:space="preserve">0,05</w:t>
             </w:r>
           </w:p>
         </w:tc>
@@ -10242,7 +10138,7 @@
                 <w:color w:val="000000"/>
                 <w:lang w:eastAsia="nl-NL"/>
               </w:rPr>
-              <w:t xml:space="preserve">Parkeercontrole 20%</w:t>
+              <w:t xml:space="preserve">Verplichte tegenprestatie in de bijstand (vanaf 2028)</w:t>
             </w:r>
           </w:p>
         </w:tc>
@@ -10271,7 +10167,7 @@
                 <w:color w:val="000000"/>
                 <w:lang w:eastAsia="nl-NL"/>
               </w:rPr>
-              <w:t xml:space="preserve">0,2</w:t>
+              <w:t xml:space="preserve">0,0</w:t>
             </w:r>
           </w:p>
         </w:tc>
@@ -10333,7 +10229,7 @@
                 <w:color w:val="000000"/>
                 <w:lang w:eastAsia="nl-NL"/>
               </w:rPr>
-              <w:t xml:space="preserve">Elektrisch maken gemeenteauto’s uitstellen</w:t>
+              <w:t xml:space="preserve">Kettingeffect: overhead werkplaats valt vrij (vanaf 2028)</w:t>
             </w:r>
           </w:p>
         </w:tc>
@@ -10362,7 +10258,7 @@
                 <w:color w:val="000000"/>
                 <w:lang w:eastAsia="nl-NL"/>
               </w:rPr>
-              <w:t xml:space="preserve">0,172</w:t>
+              <w:t xml:space="preserve">0,0</w:t>
             </w:r>
           </w:p>
         </w:tc>
@@ -10424,7 +10320,7 @@
                 <w:color w:val="000000"/>
                 <w:lang w:eastAsia="nl-NL"/>
               </w:rPr>
-              <w:t xml:space="preserve">Geen geld voor Campus Camera</w:t>
+              <w:t xml:space="preserve">Stoppen met opvang ongedocumenteerden</w:t>
             </w:r>
           </w:p>
         </w:tc>
@@ -10453,7 +10349,7 @@
                 <w:color w:val="000000"/>
                 <w:lang w:eastAsia="nl-NL"/>
               </w:rPr>
-              <w:t xml:space="preserve">0,1</w:t>
+              <w:t xml:space="preserve">5,6</w:t>
             </w:r>
           </w:p>
         </w:tc>
@@ -10482,7 +10378,7 @@
                 <w:color w:val="000000"/>
                 <w:lang w:eastAsia="nl-NL"/>
               </w:rPr>
-              <w:t xml:space="preserve">S</w:t>
+              <w:t xml:space="preserve">I</w:t>
             </w:r>
           </w:p>
         </w:tc>
@@ -10515,7 +10411,7 @@
                 <w:color w:val="000000"/>
                 <w:lang w:eastAsia="nl-NL"/>
               </w:rPr>
-              <w:t xml:space="preserve">Stoppen met budget internationale solidariteit</w:t>
+              <w:t xml:space="preserve">Stoppen met het werkprogramma bijstand</w:t>
             </w:r>
           </w:p>
         </w:tc>
@@ -10544,7 +10440,7 @@
                 <w:color w:val="000000"/>
                 <w:lang w:eastAsia="nl-NL"/>
               </w:rPr>
-              <w:t xml:space="preserve">0,05</w:t>
+              <w:t xml:space="preserve">0,85</w:t>
             </w:r>
           </w:p>
         </w:tc>
@@ -10573,7 +10469,7 @@
                 <w:color w:val="000000"/>
                 <w:lang w:eastAsia="nl-NL"/>
               </w:rPr>
-              <w:t xml:space="preserve">S</w:t>
+              <w:t xml:space="preserve">I</w:t>
             </w:r>
           </w:p>
         </w:tc>
@@ -10606,7 +10502,7 @@
                 <w:color w:val="000000"/>
                 <w:lang w:eastAsia="nl-NL"/>
               </w:rPr>
-              <w:t xml:space="preserve">Verplichte tegenprestatie in de bijstand (vanaf 2028)</w:t>
+              <w:t xml:space="preserve">Route Arbeid+ niet uitbreiden</w:t>
             </w:r>
           </w:p>
         </w:tc>
@@ -10635,7 +10531,7 @@
                 <w:color w:val="000000"/>
                 <w:lang w:eastAsia="nl-NL"/>
               </w:rPr>
-              <w:t xml:space="preserve">0,0</w:t>
+              <w:t xml:space="preserve">0,35</w:t>
             </w:r>
           </w:p>
         </w:tc>
@@ -10664,7 +10560,7 @@
                 <w:color w:val="000000"/>
                 <w:lang w:eastAsia="nl-NL"/>
               </w:rPr>
-              <w:t xml:space="preserve">S</w:t>
+              <w:t xml:space="preserve">I</w:t>
             </w:r>
           </w:p>
         </w:tc>
@@ -10697,825 +10593,6 @@
                 <w:color w:val="000000"/>
                 <w:lang w:eastAsia="nl-NL"/>
               </w:rPr>
-              <w:t xml:space="preserve">Kettingeffect: overhead werkplaats valt vrij (vanaf 2028)</w:t>
-            </w:r>
-          </w:p>
-        </w:tc>
-        <w:tc>
-          <w:tcPr>
-            <w:tcW w:w="1103" w:type="dxa"/>
-            <w:noWrap/>
-            <w:vAlign w:val="bottom"/>
-            <w:hideMark/>
-          </w:tcPr>
-          <w:p>
-            <w:pPr>
-              <w:widowControl/>
-              <w:autoSpaceDE/>
-              <w:autoSpaceDN/>
-              <w:jc w:val="right"/>
-              <w:rPr>
-                <w:rFonts w:ascii="Aptos Narrow" w:eastAsia="Times New Roman" w:hAnsi="Aptos Narrow" w:cs="Times New Roman"/>
-                <w:color w:val="000000"/>
-                <w:lang w:eastAsia="nl-NL"/>
-              </w:rPr>
-            </w:pPr>
-            <w:r>
-              <w:rPr>
-                <w:rFonts w:ascii="Aptos Narrow" w:eastAsia="Times New Roman" w:hAnsi="Aptos Narrow" w:cs="Times New Roman"/>
-                <w:color w:val="000000"/>
-                <w:lang w:eastAsia="nl-NL"/>
-              </w:rPr>
-              <w:t xml:space="preserve">0,0</w:t>
-            </w:r>
-          </w:p>
-        </w:tc>
-        <w:tc>
-          <w:tcPr>
-            <w:tcW w:w="2169" w:type="dxa"/>
-            <w:noWrap/>
-            <w:vAlign w:val="bottom"/>
-            <w:hideMark/>
-          </w:tcPr>
-          <w:p>
-            <w:pPr>
-              <w:widowControl/>
-              <w:autoSpaceDE/>
-              <w:autoSpaceDN/>
-              <w:jc w:val="right"/>
-              <w:rPr>
-                <w:rFonts w:ascii="Aptos Narrow" w:eastAsia="Times New Roman" w:hAnsi="Aptos Narrow" w:cs="Times New Roman"/>
-                <w:color w:val="000000"/>
-                <w:lang w:eastAsia="nl-NL"/>
-              </w:rPr>
-            </w:pPr>
-            <w:r>
-              <w:rPr>
-                <w:rFonts w:ascii="Aptos Narrow" w:eastAsia="Times New Roman" w:hAnsi="Aptos Narrow" w:cs="Times New Roman"/>
-                <w:color w:val="000000"/>
-                <w:lang w:eastAsia="nl-NL"/>
-              </w:rPr>
-              <w:t xml:space="preserve">S</w:t>
-            </w:r>
-          </w:p>
-        </w:tc>
-      </w:tr>
-      <w:tr>
-        <w:trPr>
-          <w:trHeight w:val="315"/>
-        </w:trPr>
-        <w:tc>
-          <w:tcPr>
-            <w:tcW w:w="7285" w:type="dxa"/>
-            <w:noWrap/>
-            <w:vAlign w:val="bottom"/>
-            <w:hideMark/>
-          </w:tcPr>
-          <w:p>
-            <w:pPr>
-              <w:widowControl/>
-              <w:autoSpaceDE/>
-              <w:autoSpaceDN/>
-              <w:rPr>
-                <w:rFonts w:ascii="Aptos Narrow" w:eastAsia="Times New Roman" w:hAnsi="Aptos Narrow" w:cs="Times New Roman"/>
-                <w:color w:val="000000"/>
-                <w:lang w:eastAsia="nl-NL"/>
-              </w:rPr>
-            </w:pPr>
-            <w:r>
-              <w:rPr>
-                <w:rFonts w:ascii="Aptos Narrow" w:eastAsia="Times New Roman" w:hAnsi="Aptos Narrow" w:cs="Times New Roman"/>
-                <w:color w:val="000000"/>
-                <w:lang w:eastAsia="nl-NL"/>
-              </w:rPr>
-              <w:t xml:space="preserve">Kettingeffect: sneller bouwen, meer OZB (vanaf 2029)</w:t>
-            </w:r>
-          </w:p>
-        </w:tc>
-        <w:tc>
-          <w:tcPr>
-            <w:tcW w:w="1103" w:type="dxa"/>
-            <w:noWrap/>
-            <w:vAlign w:val="bottom"/>
-            <w:hideMark/>
-          </w:tcPr>
-          <w:p>
-            <w:pPr>
-              <w:widowControl/>
-              <w:autoSpaceDE/>
-              <w:autoSpaceDN/>
-              <w:jc w:val="right"/>
-              <w:rPr>
-                <w:rFonts w:ascii="Aptos Narrow" w:eastAsia="Times New Roman" w:hAnsi="Aptos Narrow" w:cs="Times New Roman"/>
-                <w:color w:val="000000"/>
-                <w:lang w:eastAsia="nl-NL"/>
-              </w:rPr>
-            </w:pPr>
-            <w:r>
-              <w:rPr>
-                <w:rFonts w:ascii="Aptos Narrow" w:eastAsia="Times New Roman" w:hAnsi="Aptos Narrow" w:cs="Times New Roman"/>
-                <w:color w:val="000000"/>
-                <w:lang w:eastAsia="nl-NL"/>
-              </w:rPr>
-              <w:t xml:space="preserve">0,0</w:t>
-            </w:r>
-          </w:p>
-        </w:tc>
-        <w:tc>
-          <w:tcPr>
-            <w:tcW w:w="2169" w:type="dxa"/>
-            <w:noWrap/>
-            <w:vAlign w:val="bottom"/>
-            <w:hideMark/>
-          </w:tcPr>
-          <w:p>
-            <w:pPr>
-              <w:widowControl/>
-              <w:autoSpaceDE/>
-              <w:autoSpaceDN/>
-              <w:jc w:val="right"/>
-              <w:rPr>
-                <w:rFonts w:ascii="Aptos Narrow" w:eastAsia="Times New Roman" w:hAnsi="Aptos Narrow" w:cs="Times New Roman"/>
-                <w:color w:val="000000"/>
-                <w:lang w:eastAsia="nl-NL"/>
-              </w:rPr>
-            </w:pPr>
-            <w:r>
-              <w:rPr>
-                <w:rFonts w:ascii="Aptos Narrow" w:eastAsia="Times New Roman" w:hAnsi="Aptos Narrow" w:cs="Times New Roman"/>
-                <w:color w:val="000000"/>
-                <w:lang w:eastAsia="nl-NL"/>
-              </w:rPr>
-              <w:t xml:space="preserve">S</w:t>
-            </w:r>
-          </w:p>
-        </w:tc>
-      </w:tr>
-      <w:tr>
-        <w:trPr>
-          <w:trHeight w:val="315"/>
-        </w:trPr>
-        <w:tc>
-          <w:tcPr>
-            <w:tcW w:w="7285" w:type="dxa"/>
-            <w:noWrap/>
-            <w:vAlign w:val="bottom"/>
-            <w:hideMark/>
-          </w:tcPr>
-          <w:p>
-            <w:pPr>
-              <w:widowControl/>
-              <w:autoSpaceDE/>
-              <w:autoSpaceDN/>
-              <w:rPr>
-                <w:rFonts w:ascii="Aptos Narrow" w:eastAsia="Times New Roman" w:hAnsi="Aptos Narrow" w:cs="Times New Roman"/>
-                <w:color w:val="000000"/>
-                <w:lang w:eastAsia="nl-NL"/>
-              </w:rPr>
-            </w:pPr>
-            <w:r>
-              <w:rPr>
-                <w:rFonts w:ascii="Aptos Narrow" w:eastAsia="Times New Roman" w:hAnsi="Aptos Narrow" w:cs="Times New Roman"/>
-                <w:color w:val="000000"/>
-                <w:lang w:eastAsia="nl-NL"/>
-              </w:rPr>
-              <w:t xml:space="preserve">Stoppen met opvang ongedocumenteerden</w:t>
-            </w:r>
-          </w:p>
-        </w:tc>
-        <w:tc>
-          <w:tcPr>
-            <w:tcW w:w="1103" w:type="dxa"/>
-            <w:noWrap/>
-            <w:vAlign w:val="bottom"/>
-            <w:hideMark/>
-          </w:tcPr>
-          <w:p>
-            <w:pPr>
-              <w:widowControl/>
-              <w:autoSpaceDE/>
-              <w:autoSpaceDN/>
-              <w:jc w:val="right"/>
-              <w:rPr>
-                <w:rFonts w:ascii="Aptos Narrow" w:eastAsia="Times New Roman" w:hAnsi="Aptos Narrow" w:cs="Times New Roman"/>
-                <w:color w:val="000000"/>
-                <w:lang w:eastAsia="nl-NL"/>
-              </w:rPr>
-            </w:pPr>
-            <w:r>
-              <w:rPr>
-                <w:rFonts w:ascii="Aptos Narrow" w:eastAsia="Times New Roman" w:hAnsi="Aptos Narrow" w:cs="Times New Roman"/>
-                <w:color w:val="000000"/>
-                <w:lang w:eastAsia="nl-NL"/>
-              </w:rPr>
-              <w:t xml:space="preserve">5,6</w:t>
-            </w:r>
-          </w:p>
-        </w:tc>
-        <w:tc>
-          <w:tcPr>
-            <w:tcW w:w="2169" w:type="dxa"/>
-            <w:noWrap/>
-            <w:vAlign w:val="bottom"/>
-            <w:hideMark/>
-          </w:tcPr>
-          <w:p>
-            <w:pPr>
-              <w:widowControl/>
-              <w:autoSpaceDE/>
-              <w:autoSpaceDN/>
-              <w:jc w:val="right"/>
-              <w:rPr>
-                <w:rFonts w:ascii="Aptos Narrow" w:eastAsia="Times New Roman" w:hAnsi="Aptos Narrow" w:cs="Times New Roman"/>
-                <w:color w:val="000000"/>
-                <w:lang w:eastAsia="nl-NL"/>
-              </w:rPr>
-            </w:pPr>
-            <w:r>
-              <w:rPr>
-                <w:rFonts w:ascii="Aptos Narrow" w:eastAsia="Times New Roman" w:hAnsi="Aptos Narrow" w:cs="Times New Roman"/>
-                <w:color w:val="000000"/>
-                <w:lang w:eastAsia="nl-NL"/>
-              </w:rPr>
-              <w:t xml:space="preserve">I</w:t>
-            </w:r>
-          </w:p>
-        </w:tc>
-      </w:tr>
-      <w:tr>
-        <w:trPr>
-          <w:trHeight w:val="315"/>
-        </w:trPr>
-        <w:tc>
-          <w:tcPr>
-            <w:tcW w:w="7285" w:type="dxa"/>
-            <w:noWrap/>
-            <w:vAlign w:val="bottom"/>
-            <w:hideMark/>
-          </w:tcPr>
-          <w:p>
-            <w:pPr>
-              <w:widowControl/>
-              <w:autoSpaceDE/>
-              <w:autoSpaceDN/>
-              <w:rPr>
-                <w:rFonts w:ascii="Aptos Narrow" w:eastAsia="Times New Roman" w:hAnsi="Aptos Narrow" w:cs="Times New Roman"/>
-                <w:color w:val="000000"/>
-                <w:lang w:eastAsia="nl-NL"/>
-              </w:rPr>
-            </w:pPr>
-            <w:r>
-              <w:rPr>
-                <w:rFonts w:ascii="Aptos Narrow" w:eastAsia="Times New Roman" w:hAnsi="Aptos Narrow" w:cs="Times New Roman"/>
-                <w:color w:val="000000"/>
-                <w:lang w:eastAsia="nl-NL"/>
-              </w:rPr>
-              <w:t xml:space="preserve">Stoppen met het preventiefonds jeugd</w:t>
-            </w:r>
-          </w:p>
-        </w:tc>
-        <w:tc>
-          <w:tcPr>
-            <w:tcW w:w="1103" w:type="dxa"/>
-            <w:noWrap/>
-            <w:vAlign w:val="bottom"/>
-            <w:hideMark/>
-          </w:tcPr>
-          <w:p>
-            <w:pPr>
-              <w:widowControl/>
-              <w:autoSpaceDE/>
-              <w:autoSpaceDN/>
-              <w:jc w:val="right"/>
-              <w:rPr>
-                <w:rFonts w:ascii="Aptos Narrow" w:eastAsia="Times New Roman" w:hAnsi="Aptos Narrow" w:cs="Times New Roman"/>
-                <w:color w:val="000000"/>
-                <w:lang w:eastAsia="nl-NL"/>
-              </w:rPr>
-            </w:pPr>
-            <w:r>
-              <w:rPr>
-                <w:rFonts w:ascii="Aptos Narrow" w:eastAsia="Times New Roman" w:hAnsi="Aptos Narrow" w:cs="Times New Roman"/>
-                <w:color w:val="000000"/>
-                <w:lang w:eastAsia="nl-NL"/>
-              </w:rPr>
-              <w:t xml:space="preserve">4,509</w:t>
-            </w:r>
-          </w:p>
-        </w:tc>
-        <w:tc>
-          <w:tcPr>
-            <w:tcW w:w="2169" w:type="dxa"/>
-            <w:noWrap/>
-            <w:vAlign w:val="bottom"/>
-            <w:hideMark/>
-          </w:tcPr>
-          <w:p>
-            <w:pPr>
-              <w:widowControl/>
-              <w:autoSpaceDE/>
-              <w:autoSpaceDN/>
-              <w:jc w:val="right"/>
-              <w:rPr>
-                <w:rFonts w:ascii="Aptos Narrow" w:eastAsia="Times New Roman" w:hAnsi="Aptos Narrow" w:cs="Times New Roman"/>
-                <w:color w:val="000000"/>
-                <w:lang w:eastAsia="nl-NL"/>
-              </w:rPr>
-            </w:pPr>
-            <w:r>
-              <w:rPr>
-                <w:rFonts w:ascii="Aptos Narrow" w:eastAsia="Times New Roman" w:hAnsi="Aptos Narrow" w:cs="Times New Roman"/>
-                <w:color w:val="000000"/>
-                <w:lang w:eastAsia="nl-NL"/>
-              </w:rPr>
-              <w:t xml:space="preserve">I</w:t>
-            </w:r>
-          </w:p>
-        </w:tc>
-      </w:tr>
-      <w:tr>
-        <w:trPr>
-          <w:trHeight w:val="315"/>
-        </w:trPr>
-        <w:tc>
-          <w:tcPr>
-            <w:tcW w:w="7285" w:type="dxa"/>
-            <w:noWrap/>
-            <w:vAlign w:val="bottom"/>
-            <w:hideMark/>
-          </w:tcPr>
-          <w:p>
-            <w:pPr>
-              <w:widowControl/>
-              <w:autoSpaceDE/>
-              <w:autoSpaceDN/>
-              <w:rPr>
-                <w:rFonts w:ascii="Aptos Narrow" w:eastAsia="Times New Roman" w:hAnsi="Aptos Narrow" w:cs="Times New Roman"/>
-                <w:color w:val="000000"/>
-                <w:lang w:eastAsia="nl-NL"/>
-              </w:rPr>
-            </w:pPr>
-            <w:r>
-              <w:rPr>
-                <w:rFonts w:ascii="Aptos Narrow" w:eastAsia="Times New Roman" w:hAnsi="Aptos Narrow" w:cs="Times New Roman"/>
-                <w:color w:val="000000"/>
-                <w:lang w:eastAsia="nl-NL"/>
-              </w:rPr>
-              <w:t xml:space="preserve">Stoppen met het werkprogramma bijstand</w:t>
-            </w:r>
-          </w:p>
-        </w:tc>
-        <w:tc>
-          <w:tcPr>
-            <w:tcW w:w="1103" w:type="dxa"/>
-            <w:noWrap/>
-            <w:vAlign w:val="bottom"/>
-            <w:hideMark/>
-          </w:tcPr>
-          <w:p>
-            <w:pPr>
-              <w:widowControl/>
-              <w:autoSpaceDE/>
-              <w:autoSpaceDN/>
-              <w:jc w:val="right"/>
-              <w:rPr>
-                <w:rFonts w:ascii="Aptos Narrow" w:eastAsia="Times New Roman" w:hAnsi="Aptos Narrow" w:cs="Times New Roman"/>
-                <w:color w:val="000000"/>
-                <w:lang w:eastAsia="nl-NL"/>
-              </w:rPr>
-            </w:pPr>
-            <w:r>
-              <w:rPr>
-                <w:rFonts w:ascii="Aptos Narrow" w:eastAsia="Times New Roman" w:hAnsi="Aptos Narrow" w:cs="Times New Roman"/>
-                <w:color w:val="000000"/>
-                <w:lang w:eastAsia="nl-NL"/>
-              </w:rPr>
-              <w:t xml:space="preserve">1,05</w:t>
-            </w:r>
-          </w:p>
-        </w:tc>
-        <w:tc>
-          <w:tcPr>
-            <w:tcW w:w="2169" w:type="dxa"/>
-            <w:noWrap/>
-            <w:vAlign w:val="bottom"/>
-            <w:hideMark/>
-          </w:tcPr>
-          <w:p>
-            <w:pPr>
-              <w:widowControl/>
-              <w:autoSpaceDE/>
-              <w:autoSpaceDN/>
-              <w:jc w:val="right"/>
-              <w:rPr>
-                <w:rFonts w:ascii="Aptos Narrow" w:eastAsia="Times New Roman" w:hAnsi="Aptos Narrow" w:cs="Times New Roman"/>
-                <w:color w:val="000000"/>
-                <w:lang w:eastAsia="nl-NL"/>
-              </w:rPr>
-            </w:pPr>
-            <w:r>
-              <w:rPr>
-                <w:rFonts w:ascii="Aptos Narrow" w:eastAsia="Times New Roman" w:hAnsi="Aptos Narrow" w:cs="Times New Roman"/>
-                <w:color w:val="000000"/>
-                <w:lang w:eastAsia="nl-NL"/>
-              </w:rPr>
-              <w:t xml:space="preserve">I</w:t>
-            </w:r>
-          </w:p>
-        </w:tc>
-      </w:tr>
-      <w:tr>
-        <w:trPr>
-          <w:trHeight w:val="315"/>
-        </w:trPr>
-        <w:tc>
-          <w:tcPr>
-            <w:tcW w:w="7285" w:type="dxa"/>
-            <w:noWrap/>
-            <w:vAlign w:val="bottom"/>
-            <w:hideMark/>
-          </w:tcPr>
-          <w:p>
-            <w:pPr>
-              <w:widowControl/>
-              <w:autoSpaceDE/>
-              <w:autoSpaceDN/>
-              <w:rPr>
-                <w:rFonts w:ascii="Aptos Narrow" w:eastAsia="Times New Roman" w:hAnsi="Aptos Narrow" w:cs="Times New Roman"/>
-                <w:color w:val="000000"/>
-                <w:lang w:eastAsia="nl-NL"/>
-              </w:rPr>
-            </w:pPr>
-            <w:r>
-              <w:rPr>
-                <w:rFonts w:ascii="Aptos Narrow" w:eastAsia="Times New Roman" w:hAnsi="Aptos Narrow" w:cs="Times New Roman"/>
-                <w:color w:val="000000"/>
-                <w:lang w:eastAsia="nl-NL"/>
-              </w:rPr>
-              <w:t xml:space="preserve">Route Arbeid+ niet uitbreiden</w:t>
-            </w:r>
-          </w:p>
-        </w:tc>
-        <w:tc>
-          <w:tcPr>
-            <w:tcW w:w="1103" w:type="dxa"/>
-            <w:noWrap/>
-            <w:vAlign w:val="bottom"/>
-            <w:hideMark/>
-          </w:tcPr>
-          <w:p>
-            <w:pPr>
-              <w:widowControl/>
-              <w:autoSpaceDE/>
-              <w:autoSpaceDN/>
-              <w:jc w:val="right"/>
-              <w:rPr>
-                <w:rFonts w:ascii="Aptos Narrow" w:eastAsia="Times New Roman" w:hAnsi="Aptos Narrow" w:cs="Times New Roman"/>
-                <w:color w:val="000000"/>
-                <w:lang w:eastAsia="nl-NL"/>
-              </w:rPr>
-            </w:pPr>
-            <w:r>
-              <w:rPr>
-                <w:rFonts w:ascii="Aptos Narrow" w:eastAsia="Times New Roman" w:hAnsi="Aptos Narrow" w:cs="Times New Roman"/>
-                <w:color w:val="000000"/>
-                <w:lang w:eastAsia="nl-NL"/>
-              </w:rPr>
-              <w:t xml:space="preserve">0,35</w:t>
-            </w:r>
-          </w:p>
-        </w:tc>
-        <w:tc>
-          <w:tcPr>
-            <w:tcW w:w="2169" w:type="dxa"/>
-            <w:noWrap/>
-            <w:vAlign w:val="bottom"/>
-            <w:hideMark/>
-          </w:tcPr>
-          <w:p>
-            <w:pPr>
-              <w:widowControl/>
-              <w:autoSpaceDE/>
-              <w:autoSpaceDN/>
-              <w:jc w:val="right"/>
-              <w:rPr>
-                <w:rFonts w:ascii="Aptos Narrow" w:eastAsia="Times New Roman" w:hAnsi="Aptos Narrow" w:cs="Times New Roman"/>
-                <w:color w:val="000000"/>
-                <w:lang w:eastAsia="nl-NL"/>
-              </w:rPr>
-            </w:pPr>
-            <w:r>
-              <w:rPr>
-                <w:rFonts w:ascii="Aptos Narrow" w:eastAsia="Times New Roman" w:hAnsi="Aptos Narrow" w:cs="Times New Roman"/>
-                <w:color w:val="000000"/>
-                <w:lang w:eastAsia="nl-NL"/>
-              </w:rPr>
-              <w:t xml:space="preserve">I</w:t>
-            </w:r>
-          </w:p>
-        </w:tc>
-      </w:tr>
-      <w:tr>
-        <w:trPr>
-          <w:trHeight w:val="315"/>
-        </w:trPr>
-        <w:tc>
-          <w:tcPr>
-            <w:tcW w:w="7285" w:type="dxa"/>
-            <w:noWrap/>
-            <w:vAlign w:val="bottom"/>
-            <w:hideMark/>
-          </w:tcPr>
-          <w:p>
-            <w:pPr>
-              <w:widowControl/>
-              <w:autoSpaceDE/>
-              <w:autoSpaceDN/>
-              <w:rPr>
-                <w:rFonts w:ascii="Aptos Narrow" w:eastAsia="Times New Roman" w:hAnsi="Aptos Narrow" w:cs="Times New Roman"/>
-                <w:color w:val="000000"/>
-                <w:lang w:eastAsia="nl-NL"/>
-              </w:rPr>
-            </w:pPr>
-            <w:r>
-              <w:rPr>
-                <w:rFonts w:ascii="Aptos Narrow" w:eastAsia="Times New Roman" w:hAnsi="Aptos Narrow" w:cs="Times New Roman"/>
-                <w:color w:val="000000"/>
-                <w:lang w:eastAsia="nl-NL"/>
-              </w:rPr>
-              <w:t xml:space="preserve">Schrappen cultuurprogramma Niemeyer</w:t>
-            </w:r>
-          </w:p>
-        </w:tc>
-        <w:tc>
-          <w:tcPr>
-            <w:tcW w:w="1103" w:type="dxa"/>
-            <w:noWrap/>
-            <w:vAlign w:val="bottom"/>
-            <w:hideMark/>
-          </w:tcPr>
-          <w:p>
-            <w:pPr>
-              <w:widowControl/>
-              <w:autoSpaceDE/>
-              <w:autoSpaceDN/>
-              <w:jc w:val="right"/>
-              <w:rPr>
-                <w:rFonts w:ascii="Aptos Narrow" w:eastAsia="Times New Roman" w:hAnsi="Aptos Narrow" w:cs="Times New Roman"/>
-                <w:color w:val="000000"/>
-                <w:lang w:eastAsia="nl-NL"/>
-              </w:rPr>
-            </w:pPr>
-            <w:r>
-              <w:rPr>
-                <w:rFonts w:ascii="Aptos Narrow" w:eastAsia="Times New Roman" w:hAnsi="Aptos Narrow" w:cs="Times New Roman"/>
-                <w:color w:val="000000"/>
-                <w:lang w:eastAsia="nl-NL"/>
-              </w:rPr>
-              <w:t xml:space="preserve">0,25</w:t>
-            </w:r>
-          </w:p>
-        </w:tc>
-        <w:tc>
-          <w:tcPr>
-            <w:tcW w:w="2169" w:type="dxa"/>
-            <w:noWrap/>
-            <w:vAlign w:val="bottom"/>
-            <w:hideMark/>
-          </w:tcPr>
-          <w:p>
-            <w:pPr>
-              <w:widowControl/>
-              <w:autoSpaceDE/>
-              <w:autoSpaceDN/>
-              <w:jc w:val="right"/>
-              <w:rPr>
-                <w:rFonts w:ascii="Aptos Narrow" w:eastAsia="Times New Roman" w:hAnsi="Aptos Narrow" w:cs="Times New Roman"/>
-                <w:color w:val="000000"/>
-                <w:lang w:eastAsia="nl-NL"/>
-              </w:rPr>
-            </w:pPr>
-            <w:r>
-              <w:rPr>
-                <w:rFonts w:ascii="Aptos Narrow" w:eastAsia="Times New Roman" w:hAnsi="Aptos Narrow" w:cs="Times New Roman"/>
-                <w:color w:val="000000"/>
-                <w:lang w:eastAsia="nl-NL"/>
-              </w:rPr>
-              <w:t xml:space="preserve">I</w:t>
-            </w:r>
-          </w:p>
-        </w:tc>
-      </w:tr>
-      <w:tr>
-        <w:trPr>
-          <w:trHeight w:val="315"/>
-        </w:trPr>
-        <w:tc>
-          <w:tcPr>
-            <w:tcW w:w="7285" w:type="dxa"/>
-            <w:noWrap/>
-            <w:vAlign w:val="bottom"/>
-            <w:hideMark/>
-          </w:tcPr>
-          <w:p>
-            <w:pPr>
-              <w:widowControl/>
-              <w:autoSpaceDE/>
-              <w:autoSpaceDN/>
-              <w:rPr>
-                <w:rFonts w:ascii="Aptos Narrow" w:eastAsia="Times New Roman" w:hAnsi="Aptos Narrow" w:cs="Times New Roman"/>
-                <w:color w:val="000000"/>
-                <w:lang w:eastAsia="nl-NL"/>
-              </w:rPr>
-            </w:pPr>
-            <w:r>
-              <w:rPr>
-                <w:rFonts w:ascii="Aptos Narrow" w:eastAsia="Times New Roman" w:hAnsi="Aptos Narrow" w:cs="Times New Roman"/>
-                <w:color w:val="000000"/>
-                <w:lang w:eastAsia="nl-NL"/>
-              </w:rPr>
-              <w:t xml:space="preserve">Stoppen uitvoering plan van aanpak diversiteit</w:t>
-            </w:r>
-          </w:p>
-        </w:tc>
-        <w:tc>
-          <w:tcPr>
-            <w:tcW w:w="1103" w:type="dxa"/>
-            <w:noWrap/>
-            <w:vAlign w:val="bottom"/>
-            <w:hideMark/>
-          </w:tcPr>
-          <w:p>
-            <w:pPr>
-              <w:widowControl/>
-              <w:autoSpaceDE/>
-              <w:autoSpaceDN/>
-              <w:jc w:val="right"/>
-              <w:rPr>
-                <w:rFonts w:ascii="Aptos Narrow" w:eastAsia="Times New Roman" w:hAnsi="Aptos Narrow" w:cs="Times New Roman"/>
-                <w:color w:val="000000"/>
-                <w:lang w:eastAsia="nl-NL"/>
-              </w:rPr>
-            </w:pPr>
-            <w:r>
-              <w:rPr>
-                <w:rFonts w:ascii="Aptos Narrow" w:eastAsia="Times New Roman" w:hAnsi="Aptos Narrow" w:cs="Times New Roman"/>
-                <w:color w:val="000000"/>
-                <w:lang w:eastAsia="nl-NL"/>
-              </w:rPr>
-              <w:t xml:space="preserve">0,205</w:t>
-            </w:r>
-          </w:p>
-        </w:tc>
-        <w:tc>
-          <w:tcPr>
-            <w:tcW w:w="2169" w:type="dxa"/>
-            <w:noWrap/>
-            <w:vAlign w:val="bottom"/>
-            <w:hideMark/>
-          </w:tcPr>
-          <w:p>
-            <w:pPr>
-              <w:widowControl/>
-              <w:autoSpaceDE/>
-              <w:autoSpaceDN/>
-              <w:jc w:val="right"/>
-              <w:rPr>
-                <w:rFonts w:ascii="Aptos Narrow" w:eastAsia="Times New Roman" w:hAnsi="Aptos Narrow" w:cs="Times New Roman"/>
-                <w:color w:val="000000"/>
-                <w:lang w:eastAsia="nl-NL"/>
-              </w:rPr>
-            </w:pPr>
-            <w:r>
-              <w:rPr>
-                <w:rFonts w:ascii="Aptos Narrow" w:eastAsia="Times New Roman" w:hAnsi="Aptos Narrow" w:cs="Times New Roman"/>
-                <w:color w:val="000000"/>
-                <w:lang w:eastAsia="nl-NL"/>
-              </w:rPr>
-              <w:t xml:space="preserve">I</w:t>
-            </w:r>
-          </w:p>
-        </w:tc>
-      </w:tr>
-      <w:tr>
-        <w:trPr>
-          <w:trHeight w:val="315"/>
-        </w:trPr>
-        <w:tc>
-          <w:tcPr>
-            <w:tcW w:w="7285" w:type="dxa"/>
-            <w:noWrap/>
-            <w:vAlign w:val="bottom"/>
-            <w:hideMark/>
-          </w:tcPr>
-          <w:p>
-            <w:pPr>
-              <w:widowControl/>
-              <w:autoSpaceDE/>
-              <w:autoSpaceDN/>
-              <w:rPr>
-                <w:rFonts w:ascii="Aptos Narrow" w:eastAsia="Times New Roman" w:hAnsi="Aptos Narrow" w:cs="Times New Roman"/>
-                <w:color w:val="000000"/>
-                <w:lang w:eastAsia="nl-NL"/>
-              </w:rPr>
-            </w:pPr>
-            <w:r>
-              <w:rPr>
-                <w:rFonts w:ascii="Aptos Narrow" w:eastAsia="Times New Roman" w:hAnsi="Aptos Narrow" w:cs="Times New Roman"/>
-                <w:color w:val="000000"/>
-                <w:lang w:eastAsia="nl-NL"/>
-              </w:rPr>
-              <w:t xml:space="preserve">Organisatiekosten Energiebedrijf Groningen</w:t>
-            </w:r>
-          </w:p>
-        </w:tc>
-        <w:tc>
-          <w:tcPr>
-            <w:tcW w:w="1103" w:type="dxa"/>
-            <w:noWrap/>
-            <w:vAlign w:val="bottom"/>
-            <w:hideMark/>
-          </w:tcPr>
-          <w:p>
-            <w:pPr>
-              <w:widowControl/>
-              <w:autoSpaceDE/>
-              <w:autoSpaceDN/>
-              <w:jc w:val="right"/>
-              <w:rPr>
-                <w:rFonts w:ascii="Aptos Narrow" w:eastAsia="Times New Roman" w:hAnsi="Aptos Narrow" w:cs="Times New Roman"/>
-                <w:color w:val="000000"/>
-                <w:lang w:eastAsia="nl-NL"/>
-              </w:rPr>
-            </w:pPr>
-            <w:r>
-              <w:rPr>
-                <w:rFonts w:ascii="Aptos Narrow" w:eastAsia="Times New Roman" w:hAnsi="Aptos Narrow" w:cs="Times New Roman"/>
-                <w:color w:val="000000"/>
-                <w:lang w:eastAsia="nl-NL"/>
-              </w:rPr>
-              <w:t xml:space="preserve">0,201</w:t>
-            </w:r>
-          </w:p>
-        </w:tc>
-        <w:tc>
-          <w:tcPr>
-            <w:tcW w:w="2169" w:type="dxa"/>
-            <w:noWrap/>
-            <w:vAlign w:val="bottom"/>
-            <w:hideMark/>
-          </w:tcPr>
-          <w:p>
-            <w:pPr>
-              <w:widowControl/>
-              <w:autoSpaceDE/>
-              <w:autoSpaceDN/>
-              <w:jc w:val="right"/>
-              <w:rPr>
-                <w:rFonts w:ascii="Aptos Narrow" w:eastAsia="Times New Roman" w:hAnsi="Aptos Narrow" w:cs="Times New Roman"/>
-                <w:color w:val="000000"/>
-                <w:lang w:eastAsia="nl-NL"/>
-              </w:rPr>
-            </w:pPr>
-            <w:r>
-              <w:rPr>
-                <w:rFonts w:ascii="Aptos Narrow" w:eastAsia="Times New Roman" w:hAnsi="Aptos Narrow" w:cs="Times New Roman"/>
-                <w:color w:val="000000"/>
-                <w:lang w:eastAsia="nl-NL"/>
-              </w:rPr>
-              <w:t xml:space="preserve">I</w:t>
-            </w:r>
-          </w:p>
-        </w:tc>
-      </w:tr>
-      <w:tr>
-        <w:trPr>
-          <w:trHeight w:val="315"/>
-        </w:trPr>
-        <w:tc>
-          <w:tcPr>
-            <w:tcW w:w="7285" w:type="dxa"/>
-            <w:noWrap/>
-            <w:vAlign w:val="bottom"/>
-            <w:hideMark/>
-          </w:tcPr>
-          <w:p>
-            <w:pPr>
-              <w:widowControl/>
-              <w:autoSpaceDE/>
-              <w:autoSpaceDN/>
-              <w:rPr>
-                <w:rFonts w:ascii="Aptos Narrow" w:eastAsia="Times New Roman" w:hAnsi="Aptos Narrow" w:cs="Times New Roman"/>
-                <w:color w:val="000000"/>
-                <w:lang w:eastAsia="nl-NL"/>
-              </w:rPr>
-            </w:pPr>
-            <w:r>
-              <w:rPr>
-                <w:rFonts w:ascii="Aptos Narrow" w:eastAsia="Times New Roman" w:hAnsi="Aptos Narrow" w:cs="Times New Roman"/>
-                <w:color w:val="000000"/>
-                <w:lang w:eastAsia="nl-NL"/>
-              </w:rPr>
               <w:t xml:space="preserve">Geen gemeentegeld voor dierenartskosten</w:t>
             </w:r>
           </w:p>
@@ -11644,7 +10721,7 @@
                 <w:color w:val="000000"/>
                 <w:lang w:eastAsia="nl-NL"/>
               </w:rPr>
-              <w:t xml:space="preserve">138,212</w:t>
+              <w:t xml:space="preserve">121,795</w:t>
             </w:r>
           </w:p>
         </w:tc>
@@ -13217,7 +12294,7 @@
                 <w:color w:val="000000"/>
                 <w:lang w:eastAsia="nl-NL"/>
               </w:rPr>
-              <w:t xml:space="preserve">Kettingeffect: minder parkeercontrole, minder naheffingen</w:t>
+              <w:t xml:space="preserve">Openbare orde en veiligheid (o.a. cameratoezicht) 10%</w:t>
             </w:r>
           </w:p>
         </w:tc>
@@ -13246,7 +12323,7 @@
                 <w:color w:val="000000"/>
                 <w:lang w:eastAsia="nl-NL"/>
               </w:rPr>
-              <w:t xml:space="preserve">0,581</w:t>
+              <w:t xml:space="preserve">0,57</w:t>
             </w:r>
           </w:p>
         </w:tc>
@@ -13308,7 +12385,7 @@
                 <w:color w:val="000000"/>
                 <w:lang w:eastAsia="nl-NL"/>
               </w:rPr>
-              <w:t xml:space="preserve">Openbare orde en veiligheid (o.a. cameratoezicht) 10%</w:t>
+              <w:t xml:space="preserve">Suikerzijde (gebiedsontwikkeling) 10%</w:t>
             </w:r>
           </w:p>
         </w:tc>
@@ -13337,7 +12414,7 @@
                 <w:color w:val="000000"/>
                 <w:lang w:eastAsia="nl-NL"/>
               </w:rPr>
-              <w:t xml:space="preserve">0,57</w:t>
+              <w:t xml:space="preserve">0,43</w:t>
             </w:r>
           </w:p>
         </w:tc>
@@ -13399,7 +12476,7 @@
                 <w:color w:val="000000"/>
                 <w:lang w:eastAsia="nl-NL"/>
               </w:rPr>
-              <w:t xml:space="preserve">Suikerzijde (gebiedsontwikkeling) 10%</w:t>
+              <w:t xml:space="preserve">Verlaging precariobelasting 20%</w:t>
             </w:r>
           </w:p>
         </w:tc>
@@ -13428,7 +12505,7 @@
                 <w:color w:val="000000"/>
                 <w:lang w:eastAsia="nl-NL"/>
               </w:rPr>
-              <w:t xml:space="preserve">0,43</w:t>
+              <w:t xml:space="preserve">0,373</w:t>
             </w:r>
           </w:p>
         </w:tc>
@@ -13490,7 +12567,7 @@
                 <w:color w:val="000000"/>
                 <w:lang w:eastAsia="nl-NL"/>
               </w:rPr>
-              <w:t xml:space="preserve">Verlaging precariobelasting 20%</w:t>
+              <w:t xml:space="preserve">Extra boa’s 10%</w:t>
             </w:r>
           </w:p>
         </w:tc>
@@ -13519,7 +12596,7 @@
                 <w:color w:val="000000"/>
                 <w:lang w:eastAsia="nl-NL"/>
               </w:rPr>
-              <w:t xml:space="preserve">0,373</w:t>
+              <w:t xml:space="preserve">0,37</w:t>
             </w:r>
           </w:p>
         </w:tc>
@@ -13581,7 +12658,7 @@
                 <w:color w:val="000000"/>
                 <w:lang w:eastAsia="nl-NL"/>
               </w:rPr>
-              <w:t xml:space="preserve">Extra boa’s 10%</w:t>
+              <w:t xml:space="preserve">Ambtenaren gebiedsontwikkeling 5%</w:t>
             </w:r>
           </w:p>
         </w:tc>
@@ -13610,7 +12687,7 @@
                 <w:color w:val="000000"/>
                 <w:lang w:eastAsia="nl-NL"/>
               </w:rPr>
-              <w:t xml:space="preserve">0,37</w:t>
+              <w:t xml:space="preserve">0,35</w:t>
             </w:r>
           </w:p>
         </w:tc>
@@ -13672,7 +12749,7 @@
                 <w:color w:val="000000"/>
                 <w:lang w:eastAsia="nl-NL"/>
               </w:rPr>
-              <w:t xml:space="preserve">Ambtenaren gebiedsontwikkeling 5%</w:t>
+              <w:t xml:space="preserve">Citymarketing en economische activiteiten 15%</w:t>
             </w:r>
           </w:p>
         </w:tc>
@@ -13701,7 +12778,7 @@
                 <w:color w:val="000000"/>
                 <w:lang w:eastAsia="nl-NL"/>
               </w:rPr>
-              <w:t xml:space="preserve">0,35</w:t>
+              <w:t xml:space="preserve">0,338</w:t>
             </w:r>
           </w:p>
         </w:tc>
@@ -13763,7 +12840,7 @@
                 <w:color w:val="000000"/>
                 <w:lang w:eastAsia="nl-NL"/>
               </w:rPr>
-              <w:t xml:space="preserve">Citymarketing en economische activiteiten 15%</w:t>
+              <w:t xml:space="preserve">Verlaging toeristenbelasting 10%</w:t>
             </w:r>
           </w:p>
         </w:tc>
@@ -13792,7 +12869,7 @@
                 <w:color w:val="000000"/>
                 <w:lang w:eastAsia="nl-NL"/>
               </w:rPr>
-              <w:t xml:space="preserve">0,338</w:t>
+              <w:t xml:space="preserve">0,3</w:t>
             </w:r>
           </w:p>
         </w:tc>
@@ -13854,7 +12931,7 @@
                 <w:color w:val="000000"/>
                 <w:lang w:eastAsia="nl-NL"/>
               </w:rPr>
-              <w:t xml:space="preserve">Verlaging toeristenbelasting 10%</w:t>
+              <w:t xml:space="preserve">Burgerzaken (extra) 5%</w:t>
             </w:r>
           </w:p>
         </w:tc>
@@ -13883,7 +12960,7 @@
                 <w:color w:val="000000"/>
                 <w:lang w:eastAsia="nl-NL"/>
               </w:rPr>
-              <w:t xml:space="preserve">0,3</w:t>
+              <w:t xml:space="preserve">0,295</w:t>
             </w:r>
           </w:p>
         </w:tc>
@@ -13945,7 +13022,7 @@
                 <w:color w:val="000000"/>
                 <w:lang w:eastAsia="nl-NL"/>
               </w:rPr>
-              <w:t xml:space="preserve">Burgerzaken (extra) 5%</w:t>
+              <w:t xml:space="preserve">Jeugd en veiligheid 10%</w:t>
             </w:r>
           </w:p>
         </w:tc>
@@ -13974,7 +13051,7 @@
                 <w:color w:val="000000"/>
                 <w:lang w:eastAsia="nl-NL"/>
               </w:rPr>
-              <w:t xml:space="preserve">0,295</w:t>
+              <w:t xml:space="preserve">0,28</w:t>
             </w:r>
           </w:p>
         </w:tc>
@@ -14036,7 +13113,7 @@
                 <w:color w:val="000000"/>
                 <w:lang w:eastAsia="nl-NL"/>
               </w:rPr>
-              <w:t xml:space="preserve">Jeugd en veiligheid 10%</w:t>
+              <w:t xml:space="preserve">Klantcontactcentrum (extra) 5%</w:t>
             </w:r>
           </w:p>
         </w:tc>
@@ -14065,7 +13142,7 @@
                 <w:color w:val="000000"/>
                 <w:lang w:eastAsia="nl-NL"/>
               </w:rPr>
-              <w:t xml:space="preserve">0,28</w:t>
+              <w:t xml:space="preserve">0,205</w:t>
             </w:r>
           </w:p>
         </w:tc>
@@ -14127,7 +13204,7 @@
                 <w:color w:val="000000"/>
                 <w:lang w:eastAsia="nl-NL"/>
               </w:rPr>
-              <w:t xml:space="preserve">Klantcontactcentrum (extra) 5%</w:t>
+              <w:t xml:space="preserve">Leefkwaliteit (groen en spelen in wijken) 5%</w:t>
             </w:r>
           </w:p>
         </w:tc>
@@ -14156,7 +13233,7 @@
                 <w:color w:val="000000"/>
                 <w:lang w:eastAsia="nl-NL"/>
               </w:rPr>
-              <w:t xml:space="preserve">0,205</w:t>
+              <w:t xml:space="preserve">0,2</w:t>
             </w:r>
           </w:p>
         </w:tc>
@@ -14218,7 +13295,7 @@
                 <w:color w:val="000000"/>
                 <w:lang w:eastAsia="nl-NL"/>
               </w:rPr>
-              <w:t xml:space="preserve">Leefkwaliteit (groen en spelen in wijken) 5%</w:t>
+              <w:t xml:space="preserve">Ondermijning 10%</w:t>
             </w:r>
           </w:p>
         </w:tc>
@@ -14247,7 +13324,7 @@
                 <w:color w:val="000000"/>
                 <w:lang w:eastAsia="nl-NL"/>
               </w:rPr>
-              <w:t xml:space="preserve">0,2</w:t>
+              <w:t xml:space="preserve">0,14</w:t>
             </w:r>
           </w:p>
         </w:tc>
@@ -14309,7 +13386,7 @@
                 <w:color w:val="000000"/>
                 <w:lang w:eastAsia="nl-NL"/>
               </w:rPr>
-              <w:t xml:space="preserve">Ondermijning 10%</w:t>
+              <w:t xml:space="preserve">Toezicht op bouwen 5%</w:t>
             </w:r>
           </w:p>
         </w:tc>
@@ -14338,7 +13415,7 @@
                 <w:color w:val="000000"/>
                 <w:lang w:eastAsia="nl-NL"/>
               </w:rPr>
-              <w:t xml:space="preserve">0,14</w:t>
+              <w:t xml:space="preserve">0,1</w:t>
             </w:r>
           </w:p>
         </w:tc>
@@ -14400,7 +13477,7 @@
                 <w:color w:val="000000"/>
                 <w:lang w:eastAsia="nl-NL"/>
               </w:rPr>
-              <w:t xml:space="preserve">Toezicht op bouwen 5%</w:t>
+              <w:t xml:space="preserve">Sportstimulering 5%</w:t>
             </w:r>
           </w:p>
         </w:tc>
@@ -14429,7 +13506,7 @@
                 <w:color w:val="000000"/>
                 <w:lang w:eastAsia="nl-NL"/>
               </w:rPr>
-              <w:t xml:space="preserve">0,1</w:t>
+              <w:t xml:space="preserve">0,09</w:t>
             </w:r>
           </w:p>
         </w:tc>
@@ -14491,7 +13568,7 @@
                 <w:color w:val="000000"/>
                 <w:lang w:eastAsia="nl-NL"/>
               </w:rPr>
-              <w:t xml:space="preserve">Sportstimulering 5%</w:t>
+              <w:t xml:space="preserve">Extra geld wonen 5%</w:t>
             </w:r>
           </w:p>
         </w:tc>
@@ -14520,7 +13597,7 @@
                 <w:color w:val="000000"/>
                 <w:lang w:eastAsia="nl-NL"/>
               </w:rPr>
-              <w:t xml:space="preserve">0,09</w:t>
+              <w:t xml:space="preserve">0,089</w:t>
             </w:r>
           </w:p>
         </w:tc>
@@ -14582,7 +13659,7 @@
                 <w:color w:val="000000"/>
                 <w:lang w:eastAsia="nl-NL"/>
               </w:rPr>
-              <w:t xml:space="preserve">Extra geld wonen 5%</w:t>
+              <w:t xml:space="preserve">Bedrijventerreinen en winkelcentra 5%</w:t>
             </w:r>
           </w:p>
         </w:tc>
@@ -14611,7 +13688,7 @@
                 <w:color w:val="000000"/>
                 <w:lang w:eastAsia="nl-NL"/>
               </w:rPr>
-              <w:t xml:space="preserve">0,089</w:t>
+              <w:t xml:space="preserve">0,078</w:t>
             </w:r>
           </w:p>
         </w:tc>
@@ -14673,7 +13750,7 @@
                 <w:color w:val="000000"/>
                 <w:lang w:eastAsia="nl-NL"/>
               </w:rPr>
-              <w:t xml:space="preserve">Bedrijventerreinen en winkelcentra 5%</w:t>
+              <w:t xml:space="preserve">Kettingeffect: preventie en jeugdzorg (vanaf 2028)</w:t>
             </w:r>
           </w:p>
         </w:tc>
@@ -14702,7 +13779,7 @@
                 <w:color w:val="000000"/>
                 <w:lang w:eastAsia="nl-NL"/>
               </w:rPr>
-              <w:t xml:space="preserve">0,078</w:t>
+              <w:t xml:space="preserve">0,0</w:t>
             </w:r>
           </w:p>
         </w:tc>
@@ -14764,7 +13841,7 @@
                 <w:color w:val="000000"/>
                 <w:lang w:eastAsia="nl-NL"/>
               </w:rPr>
-              <w:t xml:space="preserve">Kettingeffect: preventie en jeugdzorg (vanaf 2028)</w:t>
+              <w:t xml:space="preserve">Kettingeffect: welzijn, bewegen en Wmo (vanaf 2028)</w:t>
             </w:r>
           </w:p>
         </w:tc>
@@ -14855,7 +13932,7 @@
                 <w:color w:val="000000"/>
                 <w:lang w:eastAsia="nl-NL"/>
               </w:rPr>
-              <w:t xml:space="preserve">Kettingeffect: welzijn, bewegen en Wmo (vanaf 2028)</w:t>
+              <w:t xml:space="preserve">Kettingeffect: gemeentefonds (verdeelmodel, vanaf 2028)</w:t>
             </w:r>
           </w:p>
         </w:tc>
@@ -14946,7 +14023,7 @@
                 <w:color w:val="000000"/>
                 <w:lang w:eastAsia="nl-NL"/>
               </w:rPr>
-              <w:t xml:space="preserve">Kettingeffect: gemeentefonds (verdeelmodel, vanaf 2028)</w:t>
+              <w:t xml:space="preserve">Kettingeffect: cultuur en toeristenbelasting (vanaf 2028)</w:t>
             </w:r>
           </w:p>
         </w:tc>
@@ -15037,7 +14114,7 @@
                 <w:color w:val="000000"/>
                 <w:lang w:eastAsia="nl-NL"/>
               </w:rPr>
-              <w:t xml:space="preserve">Kettingeffect: cultuur en toeristenbelasting (vanaf 2028)</w:t>
+              <w:t xml:space="preserve">Kettingeffect: kaartverkoop schouwburg en toeristenbelasting (vanaf 2028)</w:t>
             </w:r>
           </w:p>
         </w:tc>
@@ -15128,7 +14205,7 @@
                 <w:color w:val="000000"/>
                 <w:lang w:eastAsia="nl-NL"/>
               </w:rPr>
-              <w:t xml:space="preserve">Kettingeffect: kaartverkoop schouwburg en toeristenbelasting (vanaf 2028)</w:t>
+              <w:t xml:space="preserve">Kettingeffect: frictiekosten minder ambtenaren (eenmalig)</w:t>
             </w:r>
           </w:p>
         </w:tc>
@@ -15157,7 +14234,7 @@
                 <w:color w:val="000000"/>
                 <w:lang w:eastAsia="nl-NL"/>
               </w:rPr>
-              <w:t xml:space="preserve">0,0</w:t>
+              <w:t xml:space="preserve">8,403</w:t>
             </w:r>
           </w:p>
         </w:tc>
@@ -15186,7 +14263,7 @@
                 <w:color w:val="000000"/>
                 <w:lang w:eastAsia="nl-NL"/>
               </w:rPr>
-              <w:t xml:space="preserve">S</w:t>
+              <w:t xml:space="preserve">I</w:t>
             </w:r>
           </w:p>
         </w:tc>
@@ -15219,7 +14296,7 @@
                 <w:color w:val="000000"/>
                 <w:lang w:eastAsia="nl-NL"/>
               </w:rPr>
-              <w:t xml:space="preserve">Kettingeffect: meer openbare ruimte door nieuwe woningen (2030)</w:t>
+              <w:t xml:space="preserve">Kosten onderzoek SMR</w:t>
             </w:r>
           </w:p>
         </w:tc>
@@ -15248,7 +14325,7 @@
                 <w:color w:val="000000"/>
                 <w:lang w:eastAsia="nl-NL"/>
               </w:rPr>
-              <w:t xml:space="preserve">0,0</w:t>
+              <w:t xml:space="preserve">0,5</w:t>
             </w:r>
           </w:p>
         </w:tc>
@@ -15277,7 +14354,7 @@
                 <w:color w:val="000000"/>
                 <w:lang w:eastAsia="nl-NL"/>
               </w:rPr>
-              <w:t xml:space="preserve">S</w:t>
+              <w:t xml:space="preserve">I</w:t>
             </w:r>
           </w:p>
         </w:tc>
@@ -15310,7 +14387,7 @@
                 <w:color w:val="000000"/>
                 <w:lang w:eastAsia="nl-NL"/>
               </w:rPr>
-              <w:t xml:space="preserve">Kettingeffect: frictiekosten minder ambtenaren</w:t>
+              <w:t xml:space="preserve">Verbeteren financiële positie van de gemeente</w:t>
             </w:r>
           </w:p>
         </w:tc>
@@ -15339,7 +14416,7 @@
                 <w:color w:val="000000"/>
                 <w:lang w:eastAsia="nl-NL"/>
               </w:rPr>
-              <w:t xml:space="preserve">10,948</w:t>
+              <w:t xml:space="preserve">11,436</w:t>
             </w:r>
           </w:p>
         </w:tc>
@@ -15391,188 +14468,6 @@
               <w:autoSpaceDN/>
               <w:rPr>
                 <w:rFonts w:ascii="Aptos Narrow" w:eastAsia="Times New Roman" w:hAnsi="Aptos Narrow" w:cs="Times New Roman"/>
-                <w:color w:val="000000"/>
-                <w:lang w:eastAsia="nl-NL"/>
-              </w:rPr>
-            </w:pPr>
-            <w:r>
-              <w:rPr>
-                <w:rFonts w:ascii="Aptos Narrow" w:eastAsia="Times New Roman" w:hAnsi="Aptos Narrow" w:cs="Times New Roman"/>
-                <w:color w:val="000000"/>
-                <w:lang w:eastAsia="nl-NL"/>
-              </w:rPr>
-              <w:t xml:space="preserve">Kosten onderzoek SMR</w:t>
-            </w:r>
-          </w:p>
-        </w:tc>
-        <w:tc>
-          <w:tcPr>
-            <w:tcW w:w="1107" w:type="dxa"/>
-            <w:noWrap/>
-            <w:vAlign w:val="bottom"/>
-            <w:hideMark/>
-          </w:tcPr>
-          <w:p>
-            <w:pPr>
-              <w:widowControl/>
-              <w:autoSpaceDE/>
-              <w:autoSpaceDN/>
-              <w:jc w:val="right"/>
-              <w:rPr>
-                <w:rFonts w:ascii="Aptos Narrow" w:eastAsia="Times New Roman" w:hAnsi="Aptos Narrow" w:cs="Times New Roman"/>
-                <w:color w:val="000000"/>
-                <w:lang w:eastAsia="nl-NL"/>
-              </w:rPr>
-            </w:pPr>
-            <w:r>
-              <w:rPr>
-                <w:rFonts w:ascii="Aptos Narrow" w:eastAsia="Times New Roman" w:hAnsi="Aptos Narrow" w:cs="Times New Roman"/>
-                <w:color w:val="000000"/>
-                <w:lang w:eastAsia="nl-NL"/>
-              </w:rPr>
-              <w:t xml:space="preserve">0,5</w:t>
-            </w:r>
-          </w:p>
-        </w:tc>
-        <w:tc>
-          <w:tcPr>
-            <w:tcW w:w="2279" w:type="dxa"/>
-            <w:noWrap/>
-            <w:vAlign w:val="bottom"/>
-            <w:hideMark/>
-          </w:tcPr>
-          <w:p>
-            <w:pPr>
-              <w:widowControl/>
-              <w:autoSpaceDE/>
-              <w:autoSpaceDN/>
-              <w:jc w:val="right"/>
-              <w:rPr>
-                <w:rFonts w:ascii="Aptos Narrow" w:eastAsia="Times New Roman" w:hAnsi="Aptos Narrow" w:cs="Times New Roman"/>
-                <w:color w:val="000000"/>
-                <w:lang w:eastAsia="nl-NL"/>
-              </w:rPr>
-            </w:pPr>
-            <w:r>
-              <w:rPr>
-                <w:rFonts w:ascii="Aptos Narrow" w:eastAsia="Times New Roman" w:hAnsi="Aptos Narrow" w:cs="Times New Roman"/>
-                <w:color w:val="000000"/>
-                <w:lang w:eastAsia="nl-NL"/>
-              </w:rPr>
-              <w:t xml:space="preserve">I</w:t>
-            </w:r>
-          </w:p>
-        </w:tc>
-      </w:tr>
-      <w:tr>
-        <w:trPr>
-          <w:trHeight w:val="305"/>
-        </w:trPr>
-        <w:tc>
-          <w:tcPr>
-            <w:tcW w:w="7308" w:type="dxa"/>
-            <w:noWrap/>
-            <w:vAlign w:val="bottom"/>
-            <w:hideMark/>
-          </w:tcPr>
-          <w:p>
-            <w:pPr>
-              <w:widowControl/>
-              <w:autoSpaceDE/>
-              <w:autoSpaceDN/>
-              <w:rPr>
-                <w:rFonts w:ascii="Aptos Narrow" w:eastAsia="Times New Roman" w:hAnsi="Aptos Narrow" w:cs="Times New Roman"/>
-                <w:color w:val="000000"/>
-                <w:lang w:eastAsia="nl-NL"/>
-              </w:rPr>
-            </w:pPr>
-            <w:r>
-              <w:rPr>
-                <w:rFonts w:ascii="Aptos Narrow" w:eastAsia="Times New Roman" w:hAnsi="Aptos Narrow" w:cs="Times New Roman"/>
-                <w:color w:val="000000"/>
-                <w:lang w:eastAsia="nl-NL"/>
-              </w:rPr>
-              <w:t xml:space="preserve">Verbeteren financiële positie van de gemeente</w:t>
-            </w:r>
-          </w:p>
-        </w:tc>
-        <w:tc>
-          <w:tcPr>
-            <w:tcW w:w="1107" w:type="dxa"/>
-            <w:noWrap/>
-            <w:vAlign w:val="bottom"/>
-            <w:hideMark/>
-          </w:tcPr>
-          <w:p>
-            <w:pPr>
-              <w:widowControl/>
-              <w:autoSpaceDE/>
-              <w:autoSpaceDN/>
-              <w:jc w:val="right"/>
-              <w:rPr>
-                <w:rFonts w:ascii="Aptos Narrow" w:eastAsia="Times New Roman" w:hAnsi="Aptos Narrow" w:cs="Times New Roman"/>
-                <w:color w:val="000000"/>
-                <w:lang w:eastAsia="nl-NL"/>
-              </w:rPr>
-            </w:pPr>
-            <w:r>
-              <w:rPr>
-                <w:rFonts w:ascii="Aptos Narrow" w:eastAsia="Times New Roman" w:hAnsi="Aptos Narrow" w:cs="Times New Roman"/>
-                <w:color w:val="000000"/>
-                <w:lang w:eastAsia="nl-NL"/>
-              </w:rPr>
-              <w:t xml:space="preserve">24,728</w:t>
-            </w:r>
-          </w:p>
-        </w:tc>
-        <w:tc>
-          <w:tcPr>
-            <w:tcW w:w="2279" w:type="dxa"/>
-            <w:noWrap/>
-            <w:vAlign w:val="bottom"/>
-            <w:hideMark/>
-          </w:tcPr>
-          <w:p>
-            <w:pPr>
-              <w:widowControl/>
-              <w:autoSpaceDE/>
-              <w:autoSpaceDN/>
-              <w:jc w:val="right"/>
-              <w:rPr>
-                <w:rFonts w:ascii="Aptos Narrow" w:eastAsia="Times New Roman" w:hAnsi="Aptos Narrow" w:cs="Times New Roman"/>
-                <w:color w:val="000000"/>
-                <w:lang w:eastAsia="nl-NL"/>
-              </w:rPr>
-            </w:pPr>
-            <w:r>
-              <w:rPr>
-                <w:rFonts w:ascii="Aptos Narrow" w:eastAsia="Times New Roman" w:hAnsi="Aptos Narrow" w:cs="Times New Roman"/>
-                <w:color w:val="000000"/>
-                <w:lang w:eastAsia="nl-NL"/>
-              </w:rPr>
-              <w:t xml:space="preserve">I</w:t>
-            </w:r>
-          </w:p>
-        </w:tc>
-      </w:tr>
-      <w:tr>
-        <w:trPr>
-          <w:trHeight w:val="305"/>
-        </w:trPr>
-        <w:tc>
-          <w:tcPr>
-            <w:tcW w:w="7308" w:type="dxa"/>
-            <w:noWrap/>
-            <w:vAlign w:val="bottom"/>
-            <w:hideMark/>
-          </w:tcPr>
-          <w:p>
-            <w:pPr>
-              <w:widowControl/>
-              <w:autoSpaceDE/>
-              <w:autoSpaceDN/>
-              <w:rPr>
-                <w:rFonts w:ascii="Aptos Narrow" w:eastAsia="Times New Roman" w:hAnsi="Aptos Narrow" w:cs="Times New Roman"/>
                 <w:b/>
                 <w:bCs/>
                 <w:color w:val="000000"/>
@@ -15620,7 +14515,7 @@
                 <w:color w:val="000000"/>
                 <w:lang w:eastAsia="nl-NL"/>
               </w:rPr>
-              <w:t xml:space="preserve">138,212</w:t>
+              <w:t xml:space="preserve">121,795</w:t>
             </w:r>
           </w:p>
         </w:tc>
@@ -15925,7 +14820,7 @@
                 <w:color w:val="000000"/>
                 <w:lang w:eastAsia="nl-NL"/>
               </w:rPr>
-              <w:t xml:space="preserve">125,997</w:t>
+              <w:t xml:space="preserve">114,945</w:t>
             </w:r>
           </w:p>
         </w:tc>
@@ -15954,7 +14849,7 @@
                 <w:color w:val="000000"/>
                 <w:lang w:eastAsia="nl-NL"/>
               </w:rPr>
-              <w:t xml:space="preserve">141,877</w:t>
+              <w:t xml:space="preserve">122,908</w:t>
             </w:r>
           </w:p>
         </w:tc>
@@ -15983,7 +14878,7 @@
                 <w:color w:val="000000"/>
                 <w:lang w:eastAsia="nl-NL"/>
               </w:rPr>
-              <w:t xml:space="preserve">156,62</w:t>
+              <w:t xml:space="preserve">129,427</w:t>
             </w:r>
           </w:p>
         </w:tc>
@@ -16012,7 +14907,7 @@
                 <w:color w:val="000000"/>
                 <w:lang w:eastAsia="nl-NL"/>
               </w:rPr>
-              <w:t xml:space="preserve">170,057</w:t>
+              <w:t xml:space="preserve">134,64</w:t>
             </w:r>
           </w:p>
         </w:tc>
@@ -16074,7 +14969,7 @@
                 <w:color w:val="000000"/>
                 <w:lang w:eastAsia="nl-NL"/>
               </w:rPr>
-              <w:t xml:space="preserve">12,215</w:t>
+              <w:t xml:space="preserve">6,85</w:t>
             </w:r>
           </w:p>
         </w:tc>
@@ -16231,7 +15126,7 @@
                 <w:color w:val="000000"/>
                 <w:lang w:eastAsia="nl-NL"/>
               </w:rPr>
-              <w:t xml:space="preserve">138,212</w:t>
+              <w:t xml:space="preserve">121,795</w:t>
             </w:r>
           </w:p>
         </w:tc>
@@ -16264,7 +15159,7 @@
                 <w:color w:val="000000"/>
                 <w:lang w:eastAsia="nl-NL"/>
               </w:rPr>
-              <w:t xml:space="preserve">141,877</w:t>
+              <w:t xml:space="preserve">122,908</w:t>
             </w:r>
           </w:p>
         </w:tc>
@@ -16297,7 +15192,7 @@
                 <w:color w:val="000000"/>
                 <w:lang w:eastAsia="nl-NL"/>
               </w:rPr>
-              <w:t xml:space="preserve">156,62</w:t>
+              <w:t xml:space="preserve">129,427</w:t>
             </w:r>
           </w:p>
         </w:tc>
@@ -16330,7 +15225,7 @@
                 <w:color w:val="000000"/>
                 <w:lang w:eastAsia="nl-NL"/>
               </w:rPr>
-              <w:t xml:space="preserve">170,057</w:t>
+              <w:t xml:space="preserve">134,64</w:t>
             </w:r>
           </w:p>
         </w:tc>
@@ -16392,7 +15287,7 @@
                 <w:color w:val="000000"/>
                 <w:lang w:eastAsia="nl-NL"/>
               </w:rPr>
-              <w:t xml:space="preserve">102,037</w:t>
+              <w:t xml:space="preserve">101,456</w:t>
             </w:r>
           </w:p>
         </w:tc>
@@ -16421,7 +15316,7 @@
                 <w:color w:val="000000"/>
                 <w:lang w:eastAsia="nl-NL"/>
               </w:rPr>
-              <w:t xml:space="preserve">81,355</w:t>
+              <w:t xml:space="preserve">80,775</w:t>
             </w:r>
           </w:p>
         </w:tc>
@@ -16450,7 +15345,7 @@
                 <w:color w:val="000000"/>
                 <w:lang w:eastAsia="nl-NL"/>
               </w:rPr>
-              <w:t xml:space="preserve">81,605</w:t>
+              <w:t xml:space="preserve">81,025</w:t>
             </w:r>
           </w:p>
         </w:tc>
@@ -16479,7 +15374,7 @@
                 <w:color w:val="000000"/>
                 <w:lang w:eastAsia="nl-NL"/>
               </w:rPr>
-              <w:t xml:space="preserve">81,796</w:t>
+              <w:t xml:space="preserve">81,23</w:t>
             </w:r>
           </w:p>
         </w:tc>
@@ -16541,7 +15436,7 @@
                 <w:color w:val="000000"/>
                 <w:lang w:eastAsia="nl-NL"/>
               </w:rPr>
-              <w:t xml:space="preserve">11,448</w:t>
+              <w:t xml:space="preserve">8,903</w:t>
             </w:r>
           </w:p>
         </w:tc>
@@ -16698,7 +15593,7 @@
                 <w:color w:val="000000"/>
                 <w:lang w:eastAsia="nl-NL"/>
               </w:rPr>
-              <w:t xml:space="preserve">113,485</w:t>
+              <w:t xml:space="preserve">110,359</w:t>
             </w:r>
           </w:p>
         </w:tc>
@@ -16731,7 +15626,7 @@
                 <w:color w:val="000000"/>
                 <w:lang w:eastAsia="nl-NL"/>
               </w:rPr>
-              <w:t xml:space="preserve">81,355</w:t>
+              <w:t xml:space="preserve">80,775</w:t>
             </w:r>
           </w:p>
         </w:tc>
@@ -16764,7 +15659,7 @@
                 <w:color w:val="000000"/>
                 <w:lang w:eastAsia="nl-NL"/>
               </w:rPr>
-              <w:t xml:space="preserve">81,605</w:t>
+              <w:t xml:space="preserve">81,025</w:t>
             </w:r>
           </w:p>
         </w:tc>
@@ -16797,7 +15692,7 @@
                 <w:color w:val="000000"/>
                 <w:lang w:eastAsia="nl-NL"/>
               </w:rPr>
-              <w:t xml:space="preserve">81,796</w:t>
+              <w:t xml:space="preserve">81,23</w:t>
             </w:r>
           </w:p>
         </w:tc>
@@ -16867,7 +15762,7 @@
                 <w:color w:val="000000"/>
                 <w:lang w:eastAsia="nl-NL"/>
               </w:rPr>
-              <w:t xml:space="preserve">24,728</w:t>
+              <w:t xml:space="preserve">11,436</w:t>
             </w:r>
           </w:p>
         </w:tc>
@@ -16900,7 +15795,7 @@
                 <w:color w:val="000000"/>
                 <w:lang w:eastAsia="nl-NL"/>
               </w:rPr>
-              <w:t xml:space="preserve">60,521</w:t>
+              <w:t xml:space="preserve">42,133</w:t>
             </w:r>
           </w:p>
         </w:tc>
@@ -16933,7 +15828,7 @@
                 <w:color w:val="000000"/>
                 <w:lang w:eastAsia="nl-NL"/>
               </w:rPr>
-              <w:t xml:space="preserve">75,015</w:t>
+              <w:t xml:space="preserve">48,402</w:t>
             </w:r>
           </w:p>
         </w:tc>
@@ -16966,7 +15861,7 @@
                 <w:color w:val="000000"/>
                 <w:lang w:eastAsia="nl-NL"/>
               </w:rPr>
-              <w:t xml:space="preserve">88,262</w:t>
+              <w:t xml:space="preserve">53,41</w:t>
             </w:r>
           </w:p>
         </w:tc>
@@ -17028,7 +15923,7 @@
                 <w:color w:val="000000"/>
                 <w:lang w:eastAsia="nl-NL"/>
               </w:rPr>
-              <w:t xml:space="preserve">23,96</w:t>
+              <w:t xml:space="preserve">13,489</w:t>
             </w:r>
           </w:p>
         </w:tc>
@@ -17057,7 +15952,7 @@
                 <w:color w:val="000000"/>
                 <w:lang w:eastAsia="nl-NL"/>
               </w:rPr>
-              <w:t xml:space="preserve">60,521</w:t>
+              <w:t xml:space="preserve">42,133</w:t>
             </w:r>
           </w:p>
         </w:tc>
@@ -17086,7 +15981,7 @@
                 <w:color w:val="000000"/>
                 <w:lang w:eastAsia="nl-NL"/>
               </w:rPr>
-              <w:t xml:space="preserve">75,015</w:t>
+              <w:t xml:space="preserve">48,402</w:t>
             </w:r>
           </w:p>
         </w:tc>
@@ -17115,7 +16010,7 @@
                 <w:color w:val="000000"/>
                 <w:lang w:eastAsia="nl-NL"/>
               </w:rPr>
-              <w:t xml:space="preserve">88,262</w:t>
+              <w:t xml:space="preserve">53,41</w:t>
             </w:r>
           </w:p>
         </w:tc>
@@ -17177,7 +16072,7 @@
                 <w:color w:val="000000"/>
                 <w:lang w:eastAsia="nl-NL"/>
               </w:rPr>
-              <w:t xml:space="preserve">0,767</w:t>
+              <w:t xml:space="preserve">−2,053</w:t>
             </w:r>
           </w:p>
         </w:tc>
@@ -17326,7 +16221,7 @@
                 <w:color w:val="000000"/>
                 <w:lang w:eastAsia="nl-NL"/>
               </w:rPr>
-              <w:t xml:space="preserve">−38,83</w:t>
+              <w:t xml:space="preserve">−35,705</w:t>
             </w:r>
           </w:p>
         </w:tc>
@@ -17355,7 +16250,7 @@
                 <w:color w:val="000000"/>
                 <w:lang w:eastAsia="nl-NL"/>
               </w:rPr>
-              <w:t xml:space="preserve">−5,569</w:t>
+              <w:t xml:space="preserve">−4,988</w:t>
             </w:r>
           </w:p>
         </w:tc>
@@ -17384,7 +16279,7 @@
                 <w:color w:val="000000"/>
                 <w:lang w:eastAsia="nl-NL"/>
               </w:rPr>
-              <w:t xml:space="preserve">−5,323</w:t>
+              <w:t xml:space="preserve">−4,756</w:t>
             </w:r>
           </w:p>
         </w:tc>
@@ -17413,7 +16308,7 @@
                 <w:color w:val="000000"/>
                 <w:lang w:eastAsia="nl-NL"/>
               </w:rPr>
-              <w:t xml:space="preserve">−5,498</w:t>
+              <w:t xml:space="preserve">−4,961</w:t>
             </w:r>
           </w:p>
         </w:tc>
@@ -17475,7 +16370,7 @@
                 <w:color w:val="000000"/>
                 <w:lang w:eastAsia="nl-NL"/>
               </w:rPr>
-              <w:t xml:space="preserve">24,728</w:t>
+              <w:t xml:space="preserve">11,436</w:t>
             </w:r>
           </w:p>
         </w:tc>
@@ -17504,7 +16399,7 @@
                 <w:color w:val="000000"/>
                 <w:lang w:eastAsia="nl-NL"/>
               </w:rPr>
-              <w:t xml:space="preserve">85,249</w:t>
+              <w:t xml:space="preserve">53,57</w:t>
             </w:r>
           </w:p>
         </w:tc>
@@ -17533,7 +16428,7 @@
                 <w:color w:val="000000"/>
                 <w:lang w:eastAsia="nl-NL"/>
               </w:rPr>
-              <w:t xml:space="preserve">160,264</w:t>
+              <w:t xml:space="preserve">101,972</w:t>
             </w:r>
           </w:p>
         </w:tc>
@@ -17562,7 +16457,7 @@
                 <w:color w:val="000000"/>
                 <w:lang w:eastAsia="nl-NL"/>
               </w:rPr>
-              <w:t xml:space="preserve">248,526</w:t>
+              <w:t xml:space="preserve">155,382</w:t>
             </w:r>
           </w:p>
         </w:tc>
@@ -17604,7 +16499,7 @@
         <w:rPr>
           <w:rFonts w:cs="Times New Roman"/>
         </w:rPr>
-        <w:t xml:space="preserve">Alle bedragen zijn berekend op basis van de Ontwerpbegroting 2027, zonder indexering. Waar een maatregel tijd nodig heeft of gevolgen heeft voor andere budgetten, staat dat als kettingeffect apart in de tabellen. Dat zijn voorzichtige inschattingen: subsidies moeten worden opgezegd (in 2027 telt een kwart van de besparing mee), lopende Wmo-contracten schuiven die besparing naar 2028, de bijdragen aan de GGD en de Regio Groningen-Assen dalen pas in 2029, en minder preventie leidt vanaf 2028 tot meer jeugdzorg en Wmo-hulp. Kleinere effecten: minder bijstandshuishoudens geven iets minder gemeentefonds, minder cultuur iets minder toeristenbelasting, en extra woningen door minder bouwregels leveren vanaf 2029 wat OZB op maar vragen ook meer onderhoud. De besparing op het ambtenarenapparaat groeit in vier gelijke stappen (25%, 50%, 75% en 100%) naar 53,7 miljoen euro in 2030; de frictiekosten daarvan vallen eenmalig in 2027. De verplichte tegenprestatie levert in 2027 nog niets op, in 2028 de helft en vanaf 2029 1,6 miljoen euro. Bij minder wethouders gaan we ervan uit dat vertrekkende wethouders afzien van wachtgeld, zodat de besparing direct in 2027 telt. Eenmalige posten tellen alleen in 2027 mee. Het saldo van 2027 is in de tabellen hierboven gestort in de reserves; in deze tabel staat het saldo vóór die storting. Door afronding kan de som van de regels in de laatste decimaal afwijken van het totaal.</w:t>
+        <w:t xml:space="preserve">Alle bedragen zijn berekend op basis van de Ontwerpbegroting 2027, zonder indexering. Waar een maatregel tijd nodig heeft of gevolgen heeft voor andere budgetten, staat dat als kettingeffect apart in de tabellen. Dat zijn voorzichtige inschattingen: subsidies moeten worden opgezegd (in 2027 telt een kwart van de besparing mee), lopende Wmo-contracten schuiven die besparing naar 2028, de bijdragen aan de GGD en de Regio Groningen-Assen dalen pas in 2029, en minder preventie leidt vanaf 2028 tot meer jeugdzorg en Wmo-hulp. Kleinere effecten: minder bijstandshuishoudens geven iets minder gemeentefonds en minder cultuur iets minder toeristenbelasting. De besparing op het ambtenarenapparaat bedraagt 15% van de loonsom (53,7 miljoen euro in 2030). Daarin tellen de besparingen op de overhead en het klimaat- en energiebeleid mee; de rest groeit in vier gelijke stappen (25%, 50%, 75% en 100%). De frictiekosten vallen eenmalig in 2027. De verplichte tegenprestatie levert in 2027 nog niets op, in 2028 de helft en vanaf 2029 1,6 miljoen euro. Bij minder wethouders gaan we ervan uit dat vertrekkende wethouders afzien van wachtgeld, zodat de besparing direct in 2027 telt. Eenmalige posten tellen alleen in 2027 mee. Het saldo van 2027 is in de tabellen hierboven gestort in de reserves; in deze tabel staat het saldo vóór die storting. Door afronding kan de som van de regels in de laatste decimaal afwijken van het totaal.</w:t>
       </w:r>
     </w:p>
     <w:p>
@@ -17897,7 +16792,7 @@
         <w:footnoteRef/>
       </w:r>
       <w:r>
-        <w:t xml:space="preserve"> Rijksoverheid, "Kabinet-Jetten beëdigd", 23 februari 2026 (D66, VVD en CDA). https://www.rijksoverheid.nl/actueel/nieuws/2026/02/23/kabinet-jetten-beedigd</w:t>
+        <w:t xml:space="preserve"> AT5, "Begroting 2027: reorganisatie ambtenaren vertraagd, nauwelijks ruimte voor nieuwe investeringen", oktober 2026, https://www.at5.nl/artikelen/239953/begroting-2027-amsterdam; NH Nieuws, "Amsterdam wil 2.500 ambtenarenbanen schrappen, gedwongen ontslagen niet uitgesloten", 2026, https://www.nhnieuws.nl/nieuws/363300/amsterdam-wil-2500-ambtenarenbanen-schrappen-gedwongen-ontslagen-niet-uitgesloten</w:t>
       </w:r>
     </w:p>
   </w:footnote>
@@ -17913,7 +16808,7 @@
         <w:footnoteRef/>
       </w:r>
       <w:r>
-        <w:t xml:space="preserve"> Participatiewet, artikel 8 en 36: de gemeenteraad bepaalt in een verordening wat onder langdurig laag inkomen wordt verstaan. wetten.overheid.nl, geldende versie op 31 oktober 2026. https://wetten.overheid.nl/BWBR0015703</w:t>
+        <w:t xml:space="preserve"> Rijksoverheid, "Kabinet-Jetten beëdigd", 23 februari 2026 (D66, VVD en CDA). https://www.rijksoverheid.nl/actueel/nieuws/2026/02/23/kabinet-jetten-beedigd</w:t>
       </w:r>
     </w:p>
   </w:footnote>
@@ -17929,7 +16824,7 @@
         <w:footnoteRef/>
       </w:r>
       <w:r>
-        <w:t xml:space="preserve"> Wet maatschappelijke ondersteuning 2015, artikel 2.3.5 (maatwerkvoorziening) en artikel 2.6.6 (reële prijs voor ingekochte ondersteuning), wetten.overheid.nl, geldende versie op 31 oktober 2026. https://wetten.overheid.nl/BWBR0035362</w:t>
+        <w:t xml:space="preserve"> Participatiewet, artikel 8 en 36: de gemeenteraad bepaalt in een verordening wat onder langdurig laag inkomen wordt verstaan. wetten.overheid.nl, geldende versie op 31 oktober 2026. https://wetten.overheid.nl/BWBR0015703</w:t>
       </w:r>
     </w:p>
   </w:footnote>
@@ -17945,7 +16840,7 @@
         <w:footnoteRef/>
       </w:r>
       <w:r>
-        <w:t xml:space="preserve"> NOS, "Faber schrapt financiering 'bed-bad-brood', gemeenten vrezen overlast en onveiligheid", 4 september 2024 (rijksbijdrage aan de Landelijke Vreemdelingenvoorzieningen stopt per 1 januari 2025). https://nos.nl/l/2535822</w:t>
+        <w:t xml:space="preserve"> Wet maatschappelijke ondersteuning 2015, artikel 2.3.5 (maatwerkvoorziening) en artikel 2.6.6 (reële prijs voor ingekochte ondersteuning), wetten.overheid.nl, geldende versie op 31 oktober 2026. https://wetten.overheid.nl/BWBR0035362</w:t>
       </w:r>
     </w:p>
   </w:footnote>
@@ -17961,7 +16856,7 @@
         <w:footnoteRef/>
       </w:r>
       <w:r>
-        <w:t xml:space="preserve"> OOG, "Forum Groningen krijgt extra jaar voor stabiele exploitatie", mei 2025. https://www.oogtv.nl/2025/05/forum-groningen-krijgt-extra-jaar-voor-stabiele-exploitatie-geld-naar-onderhoud-en-upgrade-bieb/</w:t>
+        <w:t xml:space="preserve"> NOS, "Faber schrapt financiering 'bed-bad-brood', gemeenten vrezen overlast en onveiligheid", 4 september 2024 (rijksbijdrage aan de Landelijke Vreemdelingenvoorzieningen stopt per 1 januari 2025). https://nos.nl/l/2535822</w:t>
       </w:r>
     </w:p>
   </w:footnote>
@@ -17977,7 +16872,7 @@
         <w:footnoteRef/>
       </w:r>
       <w:r>
-        <w:t xml:space="preserve"> COELO (Rijksuniversiteit Groningen), Atlas van de lokale lasten 2026, databestand Gemeentelijke belastingen 2026: gemiddeld betaalde OZB bij de gemiddelde WOZ-waarde (Groningen € 687, hoogste van de 65 gemeenten in Groningen, Drenthe, Fryslân en Overijssel). https://coelo.nl/atlas-lokale-lasten-2026/bijlagen-2026-en-databestanden/</w:t>
+        <w:t xml:space="preserve"> OOG, "Forum Groningen krijgt extra jaar voor stabiele exploitatie", mei 2025. https://www.oogtv.nl/2025/05/forum-groningen-krijgt-extra-jaar-voor-stabiele-exploitatie-geld-naar-onderhoud-en-upgrade-bieb/</w:t>
       </w:r>
     </w:p>
   </w:footnote>
@@ -18009,11 +16904,27 @@
         <w:footnoteRef/>
       </w:r>
       <w:r>
-        <w:t xml:space="preserve"> ANP, "Van plek 10 naar plek 4: Haarlem bij duurste parkeersteden van Nederland", 20 oktober 2026. https://persportaal.anp.nl/artikel/230ac0d2-e22e-403c-ab54-2966cc6d7f61</w:t>
+        <w:t xml:space="preserve"> COELO (Rijksuniversiteit Groningen), Atlas van de lokale lasten 2026, databestand Gemeentelijke belastingen 2026: gemiddeld betaalde OZB bij de gemiddelde WOZ-waarde (Groningen € 687, hoogste van de 65 gemeenten in Groningen, Drenthe, Fryslân en Overijssel). https://coelo.nl/atlas-lokale-lasten-2026/bijlagen-2026-en-databestanden/</w:t>
       </w:r>
     </w:p>
   </w:footnote>
   <w:footnote w:id="9">
+    <w:p>
+      <w:pPr>
+        <w:pStyle w:val="Voetnoottekst"/>
+      </w:pPr>
+      <w:r>
+        <w:rPr>
+          <w:rStyle w:val="Voetnootmarkering"/>
+        </w:rPr>
+        <w:footnoteRef/>
+      </w:r>
+      <w:r>
+        <w:t xml:space="preserve"> ANP, "Van plek 10 naar plek 4: Haarlem bij duurste parkeersteden van Nederland", 20 oktober 2026. https://persportaal.anp.nl/artikel/230ac0d2-e22e-403c-ab54-2966cc6d7f61</w:t>
+      </w:r>
+    </w:p>
+  </w:footnote>
+  <w:footnote w:id="10">
     <w:p>
       <w:pPr>
         <w:pStyle w:val="Voetnoottekst"/>

</xml_diff>

<commit_message>
Tegenbegroting 2027: Lisa Middelbos, geen extra geld ambtenaren gebiedsontwikkeling
Co-Authored-By: Claude Opus 5.5 <noreply@anthropic.com>
Claude-Session: https://claude.ai/code/session_01Gpinc7W9kdxFe2j2GC2ZtD
</commit_message>
<xml_diff>
--- a/tegenbegroting/Tegenbegroting_VVD_Groningen_2027_v2.docx
+++ b/tegenbegroting/Tegenbegroting_VVD_Groningen_2027_v2.docx
@@ -2560,7 +2560,7 @@
           <w:lang w:eastAsia="nl-NL"/>
         </w:rPr>
         <w:br/>
-        <w:t>Lisa</w:t>
+        <w:t>Lisa Middelbos</w:t>
       </w:r>
       <w:r>
         <w:rPr>
@@ -6361,7 +6361,7 @@
         <w:rPr>
           <w:rFonts w:cs="Times New Roman"/>
         </w:rPr>
-        <w:t xml:space="preserve">Voor snellere woningbouw en een sterke lokale economie trekken we extra geld uit voor onder meer extra geld wonen (5%), toezicht op bouwen (5%), de Suikerzijde (10%), ambtenaren gebiedsontwikkeling (5%), bedrijventerreinen en winkelcentra (5%) en citymarketing (15%).</w:t>
+        <w:t xml:space="preserve">Voor snellere woningbouw en een sterke lokale economie trekken we extra geld uit voor onder meer extra geld wonen (5%), toezicht op bouwen (5%), de Suikerzijde (10%), bedrijventerreinen en winkelcentra (5%) en citymarketing (15%).</w:t>
       </w:r>
     </w:p>
     <w:p>
@@ -6439,7 +6439,7 @@
         <w:rPr>
           <w:rFonts w:cs="Times New Roman"/>
         </w:rPr>
-        <w:t xml:space="preserve">De financiële positie van de gemeente staat er niet goed voor. Daarom wil de VVD de reserves van de gemeente laten toenemen, waardoor de financiële positie van onze gemeente flink verbetert. Een gezonde balans voorkomt dat toekomstige generaties opdraaien voor de uitgaven van vandaag. Het saldo dat na alle keuzes in 2027 overblijft, 11,4 miljoen euro, storten we hiervoor. Het structurele overschot loopt op tot 53,4 miljoen euro in 2030.</w:t>
+        <w:t xml:space="preserve">De financiële positie van de gemeente staat er niet goed voor. Daarom wil de VVD de reserves van de gemeente laten toenemen, waardoor de financiële positie van onze gemeente flink verbetert. Een gezonde balans voorkomt dat toekomstige generaties opdraaien voor de uitgaven van vandaag. Het saldo dat na alle keuzes in 2027 overblijft, 11,8 miljoen euro, storten we hiervoor. Het structurele overschot loopt op tot 53,8 miljoen euro in 2030.</w:t>
       </w:r>
     </w:p>
     <w:p>
@@ -12658,7 +12658,7 @@
                 <w:color w:val="000000"/>
                 <w:lang w:eastAsia="nl-NL"/>
               </w:rPr>
-              <w:t xml:space="preserve">Ambtenaren gebiedsontwikkeling 5%</w:t>
+              <w:t xml:space="preserve">Citymarketing en economische activiteiten 15%</w:t>
             </w:r>
           </w:p>
         </w:tc>
@@ -12687,7 +12687,7 @@
                 <w:color w:val="000000"/>
                 <w:lang w:eastAsia="nl-NL"/>
               </w:rPr>
-              <w:t xml:space="preserve">0,35</w:t>
+              <w:t xml:space="preserve">0,338</w:t>
             </w:r>
           </w:p>
         </w:tc>
@@ -12749,7 +12749,7 @@
                 <w:color w:val="000000"/>
                 <w:lang w:eastAsia="nl-NL"/>
               </w:rPr>
-              <w:t xml:space="preserve">Citymarketing en economische activiteiten 15%</w:t>
+              <w:t xml:space="preserve">Verlaging toeristenbelasting 10%</w:t>
             </w:r>
           </w:p>
         </w:tc>
@@ -12778,7 +12778,7 @@
                 <w:color w:val="000000"/>
                 <w:lang w:eastAsia="nl-NL"/>
               </w:rPr>
-              <w:t xml:space="preserve">0,338</w:t>
+              <w:t xml:space="preserve">0,3</w:t>
             </w:r>
           </w:p>
         </w:tc>
@@ -12840,7 +12840,7 @@
                 <w:color w:val="000000"/>
                 <w:lang w:eastAsia="nl-NL"/>
               </w:rPr>
-              <w:t xml:space="preserve">Verlaging toeristenbelasting 10%</w:t>
+              <w:t xml:space="preserve">Burgerzaken (extra) 5%</w:t>
             </w:r>
           </w:p>
         </w:tc>
@@ -12869,7 +12869,7 @@
                 <w:color w:val="000000"/>
                 <w:lang w:eastAsia="nl-NL"/>
               </w:rPr>
-              <w:t xml:space="preserve">0,3</w:t>
+              <w:t xml:space="preserve">0,295</w:t>
             </w:r>
           </w:p>
         </w:tc>
@@ -12931,7 +12931,7 @@
                 <w:color w:val="000000"/>
                 <w:lang w:eastAsia="nl-NL"/>
               </w:rPr>
-              <w:t xml:space="preserve">Burgerzaken (extra) 5%</w:t>
+              <w:t xml:space="preserve">Jeugd en veiligheid 10%</w:t>
             </w:r>
           </w:p>
         </w:tc>
@@ -12960,7 +12960,7 @@
                 <w:color w:val="000000"/>
                 <w:lang w:eastAsia="nl-NL"/>
               </w:rPr>
-              <w:t xml:space="preserve">0,295</w:t>
+              <w:t xml:space="preserve">0,28</w:t>
             </w:r>
           </w:p>
         </w:tc>
@@ -13022,7 +13022,7 @@
                 <w:color w:val="000000"/>
                 <w:lang w:eastAsia="nl-NL"/>
               </w:rPr>
-              <w:t xml:space="preserve">Jeugd en veiligheid 10%</w:t>
+              <w:t xml:space="preserve">Klantcontactcentrum (extra) 5%</w:t>
             </w:r>
           </w:p>
         </w:tc>
@@ -13051,7 +13051,7 @@
                 <w:color w:val="000000"/>
                 <w:lang w:eastAsia="nl-NL"/>
               </w:rPr>
-              <w:t xml:space="preserve">0,28</w:t>
+              <w:t xml:space="preserve">0,205</w:t>
             </w:r>
           </w:p>
         </w:tc>
@@ -13113,7 +13113,7 @@
                 <w:color w:val="000000"/>
                 <w:lang w:eastAsia="nl-NL"/>
               </w:rPr>
-              <w:t xml:space="preserve">Klantcontactcentrum (extra) 5%</w:t>
+              <w:t xml:space="preserve">Leefkwaliteit (groen en spelen in wijken) 5%</w:t>
             </w:r>
           </w:p>
         </w:tc>
@@ -13142,7 +13142,7 @@
                 <w:color w:val="000000"/>
                 <w:lang w:eastAsia="nl-NL"/>
               </w:rPr>
-              <w:t xml:space="preserve">0,205</w:t>
+              <w:t xml:space="preserve">0,2</w:t>
             </w:r>
           </w:p>
         </w:tc>
@@ -13204,7 +13204,7 @@
                 <w:color w:val="000000"/>
                 <w:lang w:eastAsia="nl-NL"/>
               </w:rPr>
-              <w:t xml:space="preserve">Leefkwaliteit (groen en spelen in wijken) 5%</w:t>
+              <w:t xml:space="preserve">Ondermijning 10%</w:t>
             </w:r>
           </w:p>
         </w:tc>
@@ -13233,7 +13233,7 @@
                 <w:color w:val="000000"/>
                 <w:lang w:eastAsia="nl-NL"/>
               </w:rPr>
-              <w:t xml:space="preserve">0,2</w:t>
+              <w:t xml:space="preserve">0,14</w:t>
             </w:r>
           </w:p>
         </w:tc>
@@ -13295,7 +13295,7 @@
                 <w:color w:val="000000"/>
                 <w:lang w:eastAsia="nl-NL"/>
               </w:rPr>
-              <w:t xml:space="preserve">Ondermijning 10%</w:t>
+              <w:t xml:space="preserve">Toezicht op bouwen 5%</w:t>
             </w:r>
           </w:p>
         </w:tc>
@@ -13324,7 +13324,7 @@
                 <w:color w:val="000000"/>
                 <w:lang w:eastAsia="nl-NL"/>
               </w:rPr>
-              <w:t xml:space="preserve">0,14</w:t>
+              <w:t xml:space="preserve">0,1</w:t>
             </w:r>
           </w:p>
         </w:tc>
@@ -13386,7 +13386,7 @@
                 <w:color w:val="000000"/>
                 <w:lang w:eastAsia="nl-NL"/>
               </w:rPr>
-              <w:t xml:space="preserve">Toezicht op bouwen 5%</w:t>
+              <w:t xml:space="preserve">Sportstimulering 5%</w:t>
             </w:r>
           </w:p>
         </w:tc>
@@ -13415,7 +13415,7 @@
                 <w:color w:val="000000"/>
                 <w:lang w:eastAsia="nl-NL"/>
               </w:rPr>
-              <w:t xml:space="preserve">0,1</w:t>
+              <w:t xml:space="preserve">0,09</w:t>
             </w:r>
           </w:p>
         </w:tc>
@@ -13477,7 +13477,7 @@
                 <w:color w:val="000000"/>
                 <w:lang w:eastAsia="nl-NL"/>
               </w:rPr>
-              <w:t xml:space="preserve">Sportstimulering 5%</w:t>
+              <w:t xml:space="preserve">Extra geld wonen 5%</w:t>
             </w:r>
           </w:p>
         </w:tc>
@@ -13506,7 +13506,7 @@
                 <w:color w:val="000000"/>
                 <w:lang w:eastAsia="nl-NL"/>
               </w:rPr>
-              <w:t xml:space="preserve">0,09</w:t>
+              <w:t xml:space="preserve">0,089</w:t>
             </w:r>
           </w:p>
         </w:tc>
@@ -13568,7 +13568,7 @@
                 <w:color w:val="000000"/>
                 <w:lang w:eastAsia="nl-NL"/>
               </w:rPr>
-              <w:t xml:space="preserve">Extra geld wonen 5%</w:t>
+              <w:t xml:space="preserve">Bedrijventerreinen en winkelcentra 5%</w:t>
             </w:r>
           </w:p>
         </w:tc>
@@ -13597,7 +13597,7 @@
                 <w:color w:val="000000"/>
                 <w:lang w:eastAsia="nl-NL"/>
               </w:rPr>
-              <w:t xml:space="preserve">0,089</w:t>
+              <w:t xml:space="preserve">0,078</w:t>
             </w:r>
           </w:p>
         </w:tc>
@@ -13659,7 +13659,7 @@
                 <w:color w:val="000000"/>
                 <w:lang w:eastAsia="nl-NL"/>
               </w:rPr>
-              <w:t xml:space="preserve">Bedrijventerreinen en winkelcentra 5%</w:t>
+              <w:t xml:space="preserve">Kettingeffect: preventie en jeugdzorg (vanaf 2028)</w:t>
             </w:r>
           </w:p>
         </w:tc>
@@ -13688,7 +13688,7 @@
                 <w:color w:val="000000"/>
                 <w:lang w:eastAsia="nl-NL"/>
               </w:rPr>
-              <w:t xml:space="preserve">0,078</w:t>
+              <w:t xml:space="preserve">0,0</w:t>
             </w:r>
           </w:p>
         </w:tc>
@@ -13750,7 +13750,7 @@
                 <w:color w:val="000000"/>
                 <w:lang w:eastAsia="nl-NL"/>
               </w:rPr>
-              <w:t xml:space="preserve">Kettingeffect: preventie en jeugdzorg (vanaf 2028)</w:t>
+              <w:t xml:space="preserve">Kettingeffect: welzijn, bewegen en Wmo (vanaf 2028)</w:t>
             </w:r>
           </w:p>
         </w:tc>
@@ -13841,7 +13841,7 @@
                 <w:color w:val="000000"/>
                 <w:lang w:eastAsia="nl-NL"/>
               </w:rPr>
-              <w:t xml:space="preserve">Kettingeffect: welzijn, bewegen en Wmo (vanaf 2028)</w:t>
+              <w:t xml:space="preserve">Kettingeffect: gemeentefonds (verdeelmodel, vanaf 2028)</w:t>
             </w:r>
           </w:p>
         </w:tc>
@@ -13932,7 +13932,7 @@
                 <w:color w:val="000000"/>
                 <w:lang w:eastAsia="nl-NL"/>
               </w:rPr>
-              <w:t xml:space="preserve">Kettingeffect: gemeentefonds (verdeelmodel, vanaf 2028)</w:t>
+              <w:t xml:space="preserve">Kettingeffect: cultuur en toeristenbelasting (vanaf 2028)</w:t>
             </w:r>
           </w:p>
         </w:tc>
@@ -14023,7 +14023,7 @@
                 <w:color w:val="000000"/>
                 <w:lang w:eastAsia="nl-NL"/>
               </w:rPr>
-              <w:t xml:space="preserve">Kettingeffect: cultuur en toeristenbelasting (vanaf 2028)</w:t>
+              <w:t xml:space="preserve">Kettingeffect: kaartverkoop schouwburg en toeristenbelasting (vanaf 2028)</w:t>
             </w:r>
           </w:p>
         </w:tc>
@@ -14114,7 +14114,7 @@
                 <w:color w:val="000000"/>
                 <w:lang w:eastAsia="nl-NL"/>
               </w:rPr>
-              <w:t xml:space="preserve">Kettingeffect: kaartverkoop schouwburg en toeristenbelasting (vanaf 2028)</w:t>
+              <w:t xml:space="preserve">Kettingeffect: frictiekosten minder ambtenaren (eenmalig)</w:t>
             </w:r>
           </w:p>
         </w:tc>
@@ -14143,7 +14143,7 @@
                 <w:color w:val="000000"/>
                 <w:lang w:eastAsia="nl-NL"/>
               </w:rPr>
-              <w:t xml:space="preserve">0,0</w:t>
+              <w:t xml:space="preserve">8,403</w:t>
             </w:r>
           </w:p>
         </w:tc>
@@ -14172,7 +14172,7 @@
                 <w:color w:val="000000"/>
                 <w:lang w:eastAsia="nl-NL"/>
               </w:rPr>
-              <w:t xml:space="preserve">S</w:t>
+              <w:t xml:space="preserve">I</w:t>
             </w:r>
           </w:p>
         </w:tc>
@@ -14205,7 +14205,7 @@
                 <w:color w:val="000000"/>
                 <w:lang w:eastAsia="nl-NL"/>
               </w:rPr>
-              <w:t xml:space="preserve">Kettingeffect: frictiekosten minder ambtenaren (eenmalig)</w:t>
+              <w:t xml:space="preserve">Kosten onderzoek SMR</w:t>
             </w:r>
           </w:p>
         </w:tc>
@@ -14234,7 +14234,7 @@
                 <w:color w:val="000000"/>
                 <w:lang w:eastAsia="nl-NL"/>
               </w:rPr>
-              <w:t xml:space="preserve">8,403</w:t>
+              <w:t xml:space="preserve">0,5</w:t>
             </w:r>
           </w:p>
         </w:tc>
@@ -14296,7 +14296,7 @@
                 <w:color w:val="000000"/>
                 <w:lang w:eastAsia="nl-NL"/>
               </w:rPr>
-              <w:t xml:space="preserve">Kosten onderzoek SMR</w:t>
+              <w:t xml:space="preserve">Verbeteren financiële positie van de gemeente</w:t>
             </w:r>
           </w:p>
         </w:tc>
@@ -14325,98 +14325,7 @@
                 <w:color w:val="000000"/>
                 <w:lang w:eastAsia="nl-NL"/>
               </w:rPr>
-              <w:t xml:space="preserve">0,5</w:t>
-            </w:r>
-          </w:p>
-        </w:tc>
-        <w:tc>
-          <w:tcPr>
-            <w:tcW w:w="2279" w:type="dxa"/>
-            <w:noWrap/>
-            <w:vAlign w:val="bottom"/>
-            <w:hideMark/>
-          </w:tcPr>
-          <w:p>
-            <w:pPr>
-              <w:widowControl/>
-              <w:autoSpaceDE/>
-              <w:autoSpaceDN/>
-              <w:jc w:val="right"/>
-              <w:rPr>
-                <w:rFonts w:ascii="Aptos Narrow" w:eastAsia="Times New Roman" w:hAnsi="Aptos Narrow" w:cs="Times New Roman"/>
-                <w:color w:val="000000"/>
-                <w:lang w:eastAsia="nl-NL"/>
-              </w:rPr>
-            </w:pPr>
-            <w:r>
-              <w:rPr>
-                <w:rFonts w:ascii="Aptos Narrow" w:eastAsia="Times New Roman" w:hAnsi="Aptos Narrow" w:cs="Times New Roman"/>
-                <w:color w:val="000000"/>
-                <w:lang w:eastAsia="nl-NL"/>
-              </w:rPr>
-              <w:t xml:space="preserve">I</w:t>
-            </w:r>
-          </w:p>
-        </w:tc>
-      </w:tr>
-      <w:tr>
-        <w:trPr>
-          <w:trHeight w:val="305"/>
-        </w:trPr>
-        <w:tc>
-          <w:tcPr>
-            <w:tcW w:w="7308" w:type="dxa"/>
-            <w:noWrap/>
-            <w:vAlign w:val="bottom"/>
-            <w:hideMark/>
-          </w:tcPr>
-          <w:p>
-            <w:pPr>
-              <w:widowControl/>
-              <w:autoSpaceDE/>
-              <w:autoSpaceDN/>
-              <w:rPr>
-                <w:rFonts w:ascii="Aptos Narrow" w:eastAsia="Times New Roman" w:hAnsi="Aptos Narrow" w:cs="Times New Roman"/>
-                <w:color w:val="000000"/>
-                <w:lang w:eastAsia="nl-NL"/>
-              </w:rPr>
-            </w:pPr>
-            <w:r>
-              <w:rPr>
-                <w:rFonts w:ascii="Aptos Narrow" w:eastAsia="Times New Roman" w:hAnsi="Aptos Narrow" w:cs="Times New Roman"/>
-                <w:color w:val="000000"/>
-                <w:lang w:eastAsia="nl-NL"/>
-              </w:rPr>
-              <w:t xml:space="preserve">Verbeteren financiële positie van de gemeente</w:t>
-            </w:r>
-          </w:p>
-        </w:tc>
-        <w:tc>
-          <w:tcPr>
-            <w:tcW w:w="1107" w:type="dxa"/>
-            <w:noWrap/>
-            <w:vAlign w:val="bottom"/>
-            <w:hideMark/>
-          </w:tcPr>
-          <w:p>
-            <w:pPr>
-              <w:widowControl/>
-              <w:autoSpaceDE/>
-              <w:autoSpaceDN/>
-              <w:jc w:val="right"/>
-              <w:rPr>
-                <w:rFonts w:ascii="Aptos Narrow" w:eastAsia="Times New Roman" w:hAnsi="Aptos Narrow" w:cs="Times New Roman"/>
-                <w:color w:val="000000"/>
-                <w:lang w:eastAsia="nl-NL"/>
-              </w:rPr>
-            </w:pPr>
-            <w:r>
-              <w:rPr>
-                <w:rFonts w:ascii="Aptos Narrow" w:eastAsia="Times New Roman" w:hAnsi="Aptos Narrow" w:cs="Times New Roman"/>
-                <w:color w:val="000000"/>
-                <w:lang w:eastAsia="nl-NL"/>
-              </w:rPr>
-              <w:t xml:space="preserve">11,436</w:t>
+              <w:t xml:space="preserve">11,786</w:t>
             </w:r>
           </w:p>
         </w:tc>
@@ -15287,7 +15196,7 @@
                 <w:color w:val="000000"/>
                 <w:lang w:eastAsia="nl-NL"/>
               </w:rPr>
-              <w:t xml:space="preserve">101,456</w:t>
+              <w:t xml:space="preserve">101,106</w:t>
             </w:r>
           </w:p>
         </w:tc>
@@ -15316,7 +15225,7 @@
                 <w:color w:val="000000"/>
                 <w:lang w:eastAsia="nl-NL"/>
               </w:rPr>
-              <w:t xml:space="preserve">80,775</w:t>
+              <w:t xml:space="preserve">80,425</w:t>
             </w:r>
           </w:p>
         </w:tc>
@@ -15345,7 +15254,7 @@
                 <w:color w:val="000000"/>
                 <w:lang w:eastAsia="nl-NL"/>
               </w:rPr>
-              <w:t xml:space="preserve">81,025</w:t>
+              <w:t xml:space="preserve">80,675</w:t>
             </w:r>
           </w:p>
         </w:tc>
@@ -15374,7 +15283,7 @@
                 <w:color w:val="000000"/>
                 <w:lang w:eastAsia="nl-NL"/>
               </w:rPr>
-              <w:t xml:space="preserve">81,23</w:t>
+              <w:t xml:space="preserve">80,88</w:t>
             </w:r>
           </w:p>
         </w:tc>
@@ -15593,7 +15502,7 @@
                 <w:color w:val="000000"/>
                 <w:lang w:eastAsia="nl-NL"/>
               </w:rPr>
-              <w:t xml:space="preserve">110,359</w:t>
+              <w:t xml:space="preserve">110,009</w:t>
             </w:r>
           </w:p>
         </w:tc>
@@ -15626,7 +15535,7 @@
                 <w:color w:val="000000"/>
                 <w:lang w:eastAsia="nl-NL"/>
               </w:rPr>
-              <w:t xml:space="preserve">80,775</w:t>
+              <w:t xml:space="preserve">80,425</w:t>
             </w:r>
           </w:p>
         </w:tc>
@@ -15659,7 +15568,7 @@
                 <w:color w:val="000000"/>
                 <w:lang w:eastAsia="nl-NL"/>
               </w:rPr>
-              <w:t xml:space="preserve">81,025</w:t>
+              <w:t xml:space="preserve">80,675</w:t>
             </w:r>
           </w:p>
         </w:tc>
@@ -15692,7 +15601,7 @@
                 <w:color w:val="000000"/>
                 <w:lang w:eastAsia="nl-NL"/>
               </w:rPr>
-              <w:t xml:space="preserve">81,23</w:t>
+              <w:t xml:space="preserve">80,88</w:t>
             </w:r>
           </w:p>
         </w:tc>
@@ -15762,7 +15671,7 @@
                 <w:color w:val="000000"/>
                 <w:lang w:eastAsia="nl-NL"/>
               </w:rPr>
-              <w:t xml:space="preserve">11,436</w:t>
+              <w:t xml:space="preserve">11,786</w:t>
             </w:r>
           </w:p>
         </w:tc>
@@ -15795,7 +15704,7 @@
                 <w:color w:val="000000"/>
                 <w:lang w:eastAsia="nl-NL"/>
               </w:rPr>
-              <w:t xml:space="preserve">42,133</w:t>
+              <w:t xml:space="preserve">42,483</w:t>
             </w:r>
           </w:p>
         </w:tc>
@@ -15828,7 +15737,7 @@
                 <w:color w:val="000000"/>
                 <w:lang w:eastAsia="nl-NL"/>
               </w:rPr>
-              <w:t xml:space="preserve">48,402</w:t>
+              <w:t xml:space="preserve">48,752</w:t>
             </w:r>
           </w:p>
         </w:tc>
@@ -15861,7 +15770,7 @@
                 <w:color w:val="000000"/>
                 <w:lang w:eastAsia="nl-NL"/>
               </w:rPr>
-              <w:t xml:space="preserve">53,41</w:t>
+              <w:t xml:space="preserve">53,76</w:t>
             </w:r>
           </w:p>
         </w:tc>
@@ -15923,7 +15832,7 @@
                 <w:color w:val="000000"/>
                 <w:lang w:eastAsia="nl-NL"/>
               </w:rPr>
-              <w:t xml:space="preserve">13,489</w:t>
+              <w:t xml:space="preserve">13,839</w:t>
             </w:r>
           </w:p>
         </w:tc>
@@ -15952,7 +15861,7 @@
                 <w:color w:val="000000"/>
                 <w:lang w:eastAsia="nl-NL"/>
               </w:rPr>
-              <w:t xml:space="preserve">42,133</w:t>
+              <w:t xml:space="preserve">42,483</w:t>
             </w:r>
           </w:p>
         </w:tc>
@@ -15981,7 +15890,7 @@
                 <w:color w:val="000000"/>
                 <w:lang w:eastAsia="nl-NL"/>
               </w:rPr>
-              <w:t xml:space="preserve">48,402</w:t>
+              <w:t xml:space="preserve">48,752</w:t>
             </w:r>
           </w:p>
         </w:tc>
@@ -16010,7 +15919,7 @@
                 <w:color w:val="000000"/>
                 <w:lang w:eastAsia="nl-NL"/>
               </w:rPr>
-              <w:t xml:space="preserve">53,41</w:t>
+              <w:t xml:space="preserve">53,76</w:t>
             </w:r>
           </w:p>
         </w:tc>
@@ -16370,7 +16279,7 @@
                 <w:color w:val="000000"/>
                 <w:lang w:eastAsia="nl-NL"/>
               </w:rPr>
-              <w:t xml:space="preserve">11,436</w:t>
+              <w:t xml:space="preserve">11,786</w:t>
             </w:r>
           </w:p>
         </w:tc>
@@ -16399,7 +16308,7 @@
                 <w:color w:val="000000"/>
                 <w:lang w:eastAsia="nl-NL"/>
               </w:rPr>
-              <w:t xml:space="preserve">53,57</w:t>
+              <w:t xml:space="preserve">54,27</w:t>
             </w:r>
           </w:p>
         </w:tc>
@@ -16428,7 +16337,7 @@
                 <w:color w:val="000000"/>
                 <w:lang w:eastAsia="nl-NL"/>
               </w:rPr>
-              <w:t xml:space="preserve">101,972</w:t>
+              <w:t xml:space="preserve">103,022</w:t>
             </w:r>
           </w:p>
         </w:tc>
@@ -16457,7 +16366,7 @@
                 <w:color w:val="000000"/>
                 <w:lang w:eastAsia="nl-NL"/>
               </w:rPr>
-              <w:t xml:space="preserve">155,382</w:t>
+              <w:t xml:space="preserve">156,782</w:t>
             </w:r>
           </w:p>
         </w:tc>

</xml_diff>

<commit_message>
Tegenbegroting 2027: vacaturestop zonder veiligheid en uitvoering; feiten uit raadsvoorstel Belastingtarieven 2027
Co-Authored-By: Claude Opus 5.5 <noreply@anthropic.com>
Claude-Session: https://claude.ai/code/session_01Gpinc7W9kdxFe2j2GC2ZtD
</commit_message>
<xml_diff>
--- a/tegenbegroting/Tegenbegroting_VVD_Groningen_2027_v2.docx
+++ b/tegenbegroting/Tegenbegroting_VVD_Groningen_2027_v2.docx
@@ -3039,7 +3039,7 @@
         <w:rPr>
           <w:rFonts w:cs="Times New Roman"/>
         </w:rPr>
-        <w:t xml:space="preserve"> De VVD wil ook in Groningen een vacaturestop: vacatures die ontstaan door pensioen of vertrek worden niet meer opgevuld, tenzij het gaat om boa’s en de mensen die de openbare ruimte onderhouden. Daarnaast stoot de gemeente taken af. De besparingen op de overhead (26,3 miljoen euro) en op het klimaat- en energiebeleid (6,5 miljoen euro) tellen mee voor deze 15%. De rest, oplopend van 5,2 miljoen euro in 2027 naar 20,9 miljoen euro vanaf 2030, komt uit de vacaturestop en het afstoten van taken in de rest van de organisatie. Omdat de besparing op de overhead al in 2027 wordt gehaald, sneller dan via natuurlijk verloop kan, is in 2027 eenmalig 8,4 miljoen euro aan frictiekosten opgenomen.</w:t>
+        <w:t xml:space="preserve"> De VVD wil ook in Groningen een vacaturestop: vacatures die ontstaan door pensioen of vertrek worden niet meer opgevuld. Veiligheid en uitvoering vallen daarbuiten: boa’s en handhaving, en de mensen die het werk voor inwoners doen, zoals onderhoud van de openbare ruimte, afvalinzameling en dienstverlening aan het loket, worden wel vervangen. Daarnaast stoot de gemeente taken af. De besparingen op de overhead (26,3 miljoen euro) en op het klimaat- en energiebeleid (6,5 miljoen euro) tellen mee voor deze 15%. De rest, oplopend van 5,2 miljoen euro in 2027 naar 20,9 miljoen euro vanaf 2030, komt uit de vacaturestop en het afstoten van taken in de rest van de organisatie. Omdat de besparing op de overhead al in 2027 wordt gehaald, sneller dan via natuurlijk verloop kan, is in 2027 eenmalig 8,4 miljoen euro aan frictiekosten opgenomen.</w:t>
       </w:r>
     </w:p>
     <w:p>
@@ -5729,7 +5729,20 @@
         <w:rPr>
           <w:rFonts w:cs="Times New Roman"/>
         </w:rPr>
-        <w:t xml:space="preserve"> De VVD wil de lasten voor alle Groningers verlichten. De verlaging van de OZB met 20% is hier een onderdeel van.</w:t>
+        <w:t xml:space="preserve"> Het college wil de OZB in 2027 verhogen met 4,58% en daarbovenop nog eens 5%; de woonlasten voor huiseigenaren stijgen daardoor met 9,57%.</w:t>
+      </w:r>
+      <w:r>
+        <w:rPr>
+          <w:rStyle w:val="Voetnootmarkering"/>
+          <w:rFonts w:cs="Times New Roman"/>
+        </w:rPr>
+        <w:footnoteReference w:id="9"/>
+      </w:r>
+      <w:r>
+        <w:rPr>
+          <w:rFonts w:cs="Times New Roman"/>
+        </w:rPr>
+        <w:t xml:space="preserve"> De VVD wil de lasten voor alle Groningers juist verlichten. De verlaging van de OZB met 20% is hier een onderdeel van.</w:t>
       </w:r>
     </w:p>
     <w:p>
@@ -5768,7 +5781,20 @@
         <w:rPr>
           <w:rFonts w:cs="Times New Roman"/>
         </w:rPr>
-        <w:t xml:space="preserve">De VVD wil zo snel mogelijk stoppen met de reclamebelasting. Dit is een belasting waarmee we de lasten voor bedrijven en instellingen onnodig laten stijgen. Het doel van de reclamebelasting, het tegengaan van verrommeling, bereik je door samen te werken met ondernemers en instellingen, niet door het opleggen van een extra belasting. De belasting levert de gemeente weinig op (1,0 miljoen euro per jaar), terwijl inventarisatie, controle en bezwaar tijd en geld kosten, voor ondernemers én voor de gemeente. Daarnaast hebben bijvoorbeeld winkeliers reclame nodig om hun producten aan te prijzen.</w:t>
+        <w:t xml:space="preserve">De VVD wil zo snel mogelijk stoppen met de reclamebelasting. Dit is een belasting waarmee we de lasten voor bedrijven en instellingen onnodig laten stijgen. Het doel van de reclamebelasting, het tegengaan van verrommeling, bereik je door samen te werken met ondernemers en instellingen, niet door het opleggen van een extra belasting. Het college stelt de tweede stap van de reclamebelasting zelf al uit en stelt ondernemers met 2 m² reclame of minder vrij; een evaluatie is er nog niet.</w:t>
+      </w:r>
+      <w:r>
+        <w:rPr>
+          <w:rStyle w:val="Voetnootmarkering"/>
+          <w:rFonts w:cs="Times New Roman"/>
+        </w:rPr>
+        <w:footnoteReference w:id="10"/>
+      </w:r>
+      <w:r>
+        <w:rPr>
+          <w:rFonts w:cs="Times New Roman"/>
+        </w:rPr>
+        <w:t xml:space="preserve"> De belasting levert de gemeente weinig op (1,0 miljoen euro per jaar), terwijl inventarisatie, controle en bezwaar tijd en geld kosten, voor ondernemers én voor de gemeente. Daarnaast hebben bijvoorbeeld winkeliers reclame nodig om hun producten aan te prijzen.</w:t>
       </w:r>
     </w:p>
     <w:p>
@@ -5814,7 +5840,20 @@
           <w:rStyle w:val="Voetnootmarkering"/>
           <w:rFonts w:cs="Times New Roman"/>
         </w:rPr>
-        <w:footnoteReference w:id="9"/>
+        <w:footnoteReference w:id="11"/>
+      </w:r>
+      <w:r>
+        <w:rPr>
+          <w:rFonts w:cs="Times New Roman"/>
+        </w:rPr>
+        <w:t xml:space="preserve"> In 2027 wil het college de kortparkeertarieven in de binnenstad, Binnenstad-Oost, de Hortusbuurt en het Stationsgebied nog eens met 20% verhogen.</w:t>
+      </w:r>
+      <w:r>
+        <w:rPr>
+          <w:rStyle w:val="Voetnootmarkering"/>
+          <w:rFonts w:cs="Times New Roman"/>
+        </w:rPr>
+        <w:footnoteReference w:id="12"/>
       </w:r>
       <w:r>
         <w:rPr>
@@ -6199,7 +6238,7 @@
           <w:rStyle w:val="Voetnootmarkering"/>
           <w:rFonts w:cs="Times New Roman"/>
         </w:rPr>
-        <w:footnoteReference w:id="10"/>
+        <w:footnoteReference w:id="13"/>
       </w:r>
       <w:r>
         <w:rPr>
@@ -16701,7 +16740,7 @@
         <w:footnoteRef/>
       </w:r>
       <w:r>
-        <w:t xml:space="preserve"> AT5, "Begroting 2027: reorganisatie ambtenaren vertraagd, nauwelijks ruimte voor nieuwe investeringen", oktober 2026, https://www.at5.nl/artikelen/239953/begroting-2027-amsterdam; NH Nieuws, "Amsterdam wil 2.500 ambtenarenbanen schrappen, gedwongen ontslagen niet uitgesloten", 2026, https://www.nhnieuws.nl/nieuws/363300/amsterdam-wil-2500-ambtenarenbanen-schrappen-gedwongen-ontslagen-niet-uitgesloten</w:t>
+        <w:t xml:space="preserve"> Het Parool, "Gemeente Amsterdam nam sinds vacaturestop tientallen ambtenaren aan", 2026, https://www.parool.nl/amsterdam/gemeente-amsterdam-nam-sinds-vacaturestop-tientallen-ambtenaren-aan~bea34535/; AT5, "Begroting 2027: reorganisatie ambtenaren vertraagd, nauwelijks ruimte voor nieuwe investeringen", oktober 2026, https://www.at5.nl/artikelen/239953/begroting-2027-amsterdam; NH Nieuws, "Amsterdam wil 2.500 ambtenarenbanen schrappen, gedwongen ontslagen niet uitgesloten", 2026, https://www.nhnieuws.nl/nieuws/363300/amsterdam-wil-2500-ambtenarenbanen-schrappen-gedwongen-ontslagen-niet-uitgesloten</w:t>
       </w:r>
     </w:p>
   </w:footnote>
@@ -16829,11 +16868,59 @@
         <w:footnoteRef/>
       </w:r>
       <w:r>
-        <w:t xml:space="preserve"> ANP, "Van plek 10 naar plek 4: Haarlem bij duurste parkeersteden van Nederland", 20 oktober 2026. https://persportaal.anp.nl/artikel/230ac0d2-e22e-403c-ab54-2966cc6d7f61</w:t>
+        <w:t xml:space="preserve"> Gemeente Groningen, raadsvoorstel "Belastingtarieven 2027" (registratienummer 274695-2026), 1 oktober 2026.</w:t>
       </w:r>
     </w:p>
   </w:footnote>
   <w:footnote w:id="10">
+    <w:p>
+      <w:pPr>
+        <w:pStyle w:val="Voetnoottekst"/>
+      </w:pPr>
+      <w:r>
+        <w:rPr>
+          <w:rStyle w:val="Voetnootmarkering"/>
+        </w:rPr>
+        <w:footnoteRef/>
+      </w:r>
+      <w:r>
+        <w:t xml:space="preserve"> Gemeente Groningen, raadsvoorstel "Belastingtarieven 2027" (registratienummer 274695-2026), 1 oktober 2026.</w:t>
+      </w:r>
+    </w:p>
+  </w:footnote>
+  <w:footnote w:id="11">
+    <w:p>
+      <w:pPr>
+        <w:pStyle w:val="Voetnoottekst"/>
+      </w:pPr>
+      <w:r>
+        <w:rPr>
+          <w:rStyle w:val="Voetnootmarkering"/>
+        </w:rPr>
+        <w:footnoteRef/>
+      </w:r>
+      <w:r>
+        <w:t xml:space="preserve"> ANP, "Van plek 10 naar plek 4: Haarlem bij duurste parkeersteden van Nederland", 20 oktober 2026. https://persportaal.anp.nl/artikel/230ac0d2-e22e-403c-ab54-2966cc6d7f61</w:t>
+      </w:r>
+    </w:p>
+  </w:footnote>
+  <w:footnote w:id="12">
+    <w:p>
+      <w:pPr>
+        <w:pStyle w:val="Voetnoottekst"/>
+      </w:pPr>
+      <w:r>
+        <w:rPr>
+          <w:rStyle w:val="Voetnootmarkering"/>
+        </w:rPr>
+        <w:footnoteRef/>
+      </w:r>
+      <w:r>
+        <w:t xml:space="preserve"> Gemeente Groningen, raadsvoorstel "Belastingtarieven 2027" (registratienummer 274695-2026), 1 oktober 2026.</w:t>
+      </w:r>
+    </w:p>
+  </w:footnote>
+  <w:footnote w:id="13">
     <w:p>
       <w:pPr>
         <w:pStyle w:val="Voetnoottekst"/>

</xml_diff>

<commit_message>
Tegenbegroting 2027: tabel ambtenaren per 1.000 inwoners met vergelijking andere steden
Co-Authored-By: Claude Opus 5.5 <noreply@anthropic.com>
Claude-Session: https://claude.ai/code/session_01Gpinc7W9kdxFe2j2GC2ZtD
</commit_message>
<xml_diff>
--- a/tegenbegroting/Tegenbegroting_VVD_Groningen_2027_v2.docx
+++ b/tegenbegroting/Tegenbegroting_VVD_Groningen_2027_v2.docx
@@ -1812,7 +1812,7 @@
             <w:rPr>
               <w:noProof/>
             </w:rPr>
-            <w:t>6</w:t>
+            <w:t>7</w:t>
           </w:r>
           <w:r>
             <w:rPr>
@@ -1878,7 +1878,7 @@
             <w:rPr>
               <w:noProof/>
             </w:rPr>
-            <w:t>9</w:t>
+            <w:t>10</w:t>
           </w:r>
           <w:r>
             <w:rPr>
@@ -1944,7 +1944,7 @@
             <w:rPr>
               <w:noProof/>
             </w:rPr>
-            <w:t>11</w:t>
+            <w:t>12</w:t>
           </w:r>
           <w:r>
             <w:rPr>
@@ -2010,7 +2010,7 @@
             <w:rPr>
               <w:noProof/>
             </w:rPr>
-            <w:t>11</w:t>
+            <w:t>12</w:t>
           </w:r>
           <w:r>
             <w:rPr>
@@ -2076,7 +2076,7 @@
             <w:rPr>
               <w:noProof/>
             </w:rPr>
-            <w:t>13</w:t>
+            <w:t>14</w:t>
           </w:r>
           <w:r>
             <w:rPr>
@@ -2142,7 +2142,7 @@
             <w:rPr>
               <w:noProof/>
             </w:rPr>
-            <w:t>14</w:t>
+            <w:t>15</w:t>
           </w:r>
           <w:r>
             <w:rPr>
@@ -2216,7 +2216,7 @@
             <w:rPr>
               <w:noProof/>
             </w:rPr>
-            <w:t>16</w:t>
+            <w:t>17</w:t>
           </w:r>
           <w:r>
             <w:rPr>
@@ -2282,7 +2282,7 @@
             <w:rPr>
               <w:noProof/>
             </w:rPr>
-            <w:t>16</w:t>
+            <w:t>17</w:t>
           </w:r>
           <w:r>
             <w:rPr>
@@ -2348,7 +2348,7 @@
             <w:rPr>
               <w:noProof/>
             </w:rPr>
-            <w:t>17</w:t>
+            <w:t>18</w:t>
           </w:r>
           <w:r>
             <w:rPr>
@@ -2414,7 +2414,7 @@
             <w:rPr>
               <w:noProof/>
             </w:rPr>
-            <w:t>18</w:t>
+            <w:t>19</w:t>
           </w:r>
           <w:r>
             <w:rPr>
@@ -3026,7 +3026,7 @@
         <w:rPr>
           <w:rFonts w:cs="Times New Roman"/>
         </w:rPr>
-        <w:t xml:space="preserve">Wat de VVD betreft moet de gemeente vooral heel veel taken niet meer doen. Daarom kan het ambtenarenapparaat met 15% krimpen: 53,7 miljoen euro per jaar vanaf 2030. Amsterdam laat zien dat het kan: die gemeente heeft een vacature- en inhuurstop ingesteld en wil 2.500 voltijdbanen schrappen.</w:t>
+        <w:t xml:space="preserve">Wat de VVD betreft moet de gemeente vooral heel veel taken niet meer doen. Daarom kan het ambtenarenapparaat met 15% krimpen: 53,7 miljoen euro per jaar vanaf 2030. Groningen heeft met 14,7 fte per 1.000 inwoners fors meer ambtenaren dan Nijmegen, Eindhoven en Zwolle; alleen Utrecht zit hoger (zie de tabel hieronder). Met 15% minder komt Groningen uit op ongeveer 12,5 fte per 1.000 inwoners. Amsterdam laat zien dat het kan: die gemeente heeft een vacature- en inhuurstop ingesteld en wil 2.500 voltijdbanen schrappen.</w:t>
       </w:r>
       <w:r>
         <w:rPr>
@@ -3040,6 +3040,768 @@
           <w:rFonts w:cs="Times New Roman"/>
         </w:rPr>
         <w:t xml:space="preserve"> De VVD wil ook in Groningen een vacaturestop: vacatures die ontstaan door pensioen of vertrek worden niet meer opgevuld. Veiligheid en uitvoering vallen daarbuiten: boa’s en handhaving, en de mensen die het werk voor inwoners doen, zoals onderhoud van de openbare ruimte, afvalinzameling en dienstverlening aan het loket, worden wel vervangen. Daarnaast stoot de gemeente taken af. De besparingen op de overhead (26,3 miljoen euro) en op het klimaat- en energiebeleid (6,5 miljoen euro) tellen mee voor deze 15%. De rest, oplopend van 5,2 miljoen euro in 2027 naar 20,9 miljoen euro vanaf 2030, komt uit de vacaturestop en het afstoten van taken in de rest van de organisatie. Omdat de besparing op de overhead al in 2027 wordt gehaald, sneller dan via natuurlijk verloop kan, is in 2027 eenmalig 8,4 miljoen euro aan frictiekosten opgenomen.</w:t>
+      </w:r>
+    </w:p>
+    <w:p/>
+    <w:tbl>
+      <w:tblPr>
+        <w:tblW w:w="0" w:type="auto"/>
+        <w:tblBorders>
+          <w:top w:val="outset" w:sz="6" w:space="0" w:color="auto"/>
+          <w:left w:val="outset" w:sz="6" w:space="0" w:color="auto"/>
+          <w:bottom w:val="outset" w:sz="6" w:space="0" w:color="auto"/>
+          <w:right w:val="outset" w:sz="6" w:space="0" w:color="auto"/>
+        </w:tblBorders>
+        <w:tblCellMar>
+          <w:top w:w="15" w:type="dxa"/>
+          <w:left w:w="15" w:type="dxa"/>
+          <w:bottom w:w="15" w:type="dxa"/>
+          <w:right w:w="15" w:type="dxa"/>
+        </w:tblCellMar>
+        <w:tblLook w:val="04A0" w:firstRow="1" w:lastRow="0" w:firstColumn="1" w:lastColumn="0" w:noHBand="0" w:noVBand="1"/>
+      </w:tblPr>
+      <w:tblGrid>
+        <w:gridCol w:w="3300"/>
+        <w:gridCol w:w="1900"/>
+        <w:gridCol w:w="1200"/>
+        <w:gridCol w:w="1855"/>
+      </w:tblGrid>
+      <w:tr>
+        <w:trPr>
+          <w:trHeight w:val="369"/>
+          <w:cantSplit/>
+        </w:trPr>
+        <w:tc>
+          <w:tcPr>
+            <w:tcW w:w="3300" w:type="dxa"/>
+            <w:tcBorders>
+              <w:top w:val="single" w:sz="6" w:space="0" w:color="000000"/>
+              <w:left w:val="single" w:sz="6" w:space="0" w:color="000000"/>
+              <w:bottom w:val="single" w:sz="6" w:space="0" w:color="000000"/>
+              <w:right w:val="single" w:sz="6" w:space="0" w:color="000000"/>
+            </w:tcBorders>
+            <w:shd w:val="clear" w:color="auto" w:fill="FF6400"/>
+            <w:hideMark/>
+          </w:tcPr>
+          <w:p>
+            <w:pPr>
+              <w:keepNext/>
+            </w:pPr>
+            <w:r>
+              <w:rPr>
+                <w:b/>
+                <w:bCs/>
+              </w:rPr>
+              <w:t xml:space="preserve">Gemeente</w:t>
+            </w:r>
+          </w:p>
+        </w:tc>
+        <w:tc>
+          <w:tcPr>
+            <w:tcW w:w="1900" w:type="dxa"/>
+            <w:tcBorders>
+              <w:top w:val="single" w:sz="6" w:space="0" w:color="000000"/>
+              <w:left w:val="single" w:sz="6" w:space="0" w:color="000000"/>
+              <w:bottom w:val="single" w:sz="6" w:space="0" w:color="000000"/>
+              <w:right w:val="single" w:sz="6" w:space="0" w:color="000000"/>
+            </w:tcBorders>
+            <w:shd w:val="clear" w:color="auto" w:fill="FF6400"/>
+            <w:hideMark/>
+          </w:tcPr>
+          <w:p>
+            <w:pPr>
+              <w:keepNext/>
+            </w:pPr>
+            <w:r>
+              <w:rPr>
+                <w:b/>
+                <w:bCs/>
+              </w:rPr>
+              <w:t xml:space="preserve">Fte per 1.000 inwoners</w:t>
+            </w:r>
+          </w:p>
+        </w:tc>
+        <w:tc>
+          <w:tcPr>
+            <w:tcW w:w="1200" w:type="dxa"/>
+            <w:tcBorders>
+              <w:top w:val="single" w:sz="6" w:space="0" w:color="000000"/>
+              <w:left w:val="single" w:sz="6" w:space="0" w:color="000000"/>
+              <w:bottom w:val="single" w:sz="6" w:space="0" w:color="000000"/>
+              <w:right w:val="single" w:sz="6" w:space="0" w:color="000000"/>
+            </w:tcBorders>
+            <w:shd w:val="clear" w:color="auto" w:fill="FF6400"/>
+            <w:hideMark/>
+          </w:tcPr>
+          <w:p>
+            <w:pPr>
+              <w:keepNext/>
+            </w:pPr>
+            <w:r>
+              <w:rPr>
+                <w:b/>
+                <w:bCs/>
+              </w:rPr>
+              <w:t xml:space="preserve">Jaar</w:t>
+            </w:r>
+          </w:p>
+        </w:tc>
+        <w:tc>
+          <w:tcPr>
+            <w:tcW w:w="1855" w:type="dxa"/>
+            <w:tcBorders>
+              <w:top w:val="single" w:sz="6" w:space="0" w:color="000000"/>
+              <w:left w:val="single" w:sz="6" w:space="0" w:color="000000"/>
+              <w:bottom w:val="single" w:sz="6" w:space="0" w:color="000000"/>
+              <w:right w:val="single" w:sz="6" w:space="0" w:color="000000"/>
+            </w:tcBorders>
+            <w:shd w:val="clear" w:color="auto" w:fill="FF6400"/>
+            <w:hideMark/>
+          </w:tcPr>
+          <w:p>
+            <w:pPr>
+              <w:keepNext/>
+            </w:pPr>
+            <w:r>
+              <w:rPr>
+                <w:b/>
+                <w:bCs/>
+              </w:rPr>
+              <w:t xml:space="preserve">Soort cijfer</w:t>
+            </w:r>
+          </w:p>
+        </w:tc>
+      </w:tr>
+      <w:tr>
+        <w:trPr>
+          <w:trHeight w:val="369"/>
+          <w:cantSplit/>
+        </w:trPr>
+        <w:tc>
+          <w:tcPr>
+            <w:tcW w:w="3300" w:type="dxa"/>
+            <w:tcBorders>
+              <w:top w:val="single" w:sz="6" w:space="0" w:color="auto"/>
+              <w:left w:val="nil"/>
+              <w:bottom w:val="single" w:sz="6" w:space="0" w:color="auto"/>
+              <w:right w:val="single" w:sz="6" w:space="0" w:color="auto"/>
+            </w:tcBorders>
+            <w:hideMark/>
+          </w:tcPr>
+          <w:p>
+            <w:pPr>
+              <w:keepNext/>
+            </w:pPr>
+            <w:r>
+              <w:rPr>
+                <w:b/>
+                <w:bCs/>
+              </w:rPr>
+              <w:t xml:space="preserve">Groningen</w:t>
+            </w:r>
+          </w:p>
+        </w:tc>
+        <w:tc>
+          <w:tcPr>
+            <w:tcW w:w="1900" w:type="dxa"/>
+            <w:tcBorders>
+              <w:top w:val="single" w:sz="6" w:space="0" w:color="4E4B44"/>
+              <w:left w:val="single" w:sz="6" w:space="0" w:color="4E4B44"/>
+              <w:bottom w:val="single" w:sz="6" w:space="0" w:color="4E4B44"/>
+              <w:right w:val="single" w:sz="6" w:space="0" w:color="4E4B44"/>
+            </w:tcBorders>
+            <w:hideMark/>
+          </w:tcPr>
+          <w:p>
+            <w:pPr>
+              <w:keepNext/>
+            </w:pPr>
+            <w:r>
+              <w:t xml:space="preserve">14,7</w:t>
+            </w:r>
+          </w:p>
+        </w:tc>
+        <w:tc>
+          <w:tcPr>
+            <w:tcW w:w="1200" w:type="dxa"/>
+            <w:tcBorders>
+              <w:top w:val="single" w:sz="6" w:space="0" w:color="4E4B44"/>
+              <w:left w:val="single" w:sz="6" w:space="0" w:color="4E4B44"/>
+              <w:bottom w:val="single" w:sz="6" w:space="0" w:color="4E4B44"/>
+              <w:right w:val="single" w:sz="6" w:space="0" w:color="4E4B44"/>
+            </w:tcBorders>
+            <w:hideMark/>
+          </w:tcPr>
+          <w:p>
+            <w:pPr>
+              <w:keepNext/>
+            </w:pPr>
+            <w:r>
+              <w:t xml:space="preserve">2025</w:t>
+            </w:r>
+          </w:p>
+        </w:tc>
+        <w:tc>
+          <w:tcPr>
+            <w:tcW w:w="1855" w:type="dxa"/>
+            <w:tcBorders>
+              <w:top w:val="single" w:sz="6" w:space="0" w:color="4E4B44"/>
+              <w:left w:val="single" w:sz="6" w:space="0" w:color="4E4B44"/>
+              <w:bottom w:val="single" w:sz="6" w:space="0" w:color="4E4B44"/>
+              <w:right w:val="single" w:sz="6" w:space="0" w:color="4E4B44"/>
+            </w:tcBorders>
+            <w:hideMark/>
+          </w:tcPr>
+          <w:p>
+            <w:pPr>
+              <w:keepNext/>
+            </w:pPr>
+            <w:r>
+              <w:t xml:space="preserve">gerealiseerd</w:t>
+            </w:r>
+          </w:p>
+        </w:tc>
+      </w:tr>
+      <w:tr>
+        <w:trPr>
+          <w:trHeight w:val="369"/>
+          <w:cantSplit/>
+        </w:trPr>
+        <w:tc>
+          <w:tcPr>
+            <w:tcW w:w="3300" w:type="dxa"/>
+            <w:tcBorders>
+              <w:top w:val="single" w:sz="6" w:space="0" w:color="auto"/>
+              <w:left w:val="nil"/>
+              <w:bottom w:val="single" w:sz="6" w:space="0" w:color="auto"/>
+              <w:right w:val="single" w:sz="6" w:space="0" w:color="auto"/>
+            </w:tcBorders>
+            <w:hideMark/>
+          </w:tcPr>
+          <w:p>
+            <w:pPr>
+              <w:keepNext/>
+            </w:pPr>
+            <w:r>
+              <w:rPr>
+                <w:b/>
+                <w:bCs/>
+              </w:rPr>
+              <w:t xml:space="preserve">Groningen (doel college)</w:t>
+            </w:r>
+          </w:p>
+        </w:tc>
+        <w:tc>
+          <w:tcPr>
+            <w:tcW w:w="1900" w:type="dxa"/>
+            <w:tcBorders>
+              <w:top w:val="single" w:sz="6" w:space="0" w:color="4E4B44"/>
+              <w:left w:val="single" w:sz="6" w:space="0" w:color="4E4B44"/>
+              <w:bottom w:val="single" w:sz="6" w:space="0" w:color="4E4B44"/>
+              <w:right w:val="single" w:sz="6" w:space="0" w:color="4E4B44"/>
+            </w:tcBorders>
+            <w:hideMark/>
+          </w:tcPr>
+          <w:p>
+            <w:pPr>
+              <w:keepNext/>
+            </w:pPr>
+            <w:r>
+              <w:t xml:space="preserve">13,1</w:t>
+            </w:r>
+          </w:p>
+        </w:tc>
+        <w:tc>
+          <w:tcPr>
+            <w:tcW w:w="1200" w:type="dxa"/>
+            <w:tcBorders>
+              <w:top w:val="single" w:sz="6" w:space="0" w:color="4E4B44"/>
+              <w:left w:val="single" w:sz="6" w:space="0" w:color="4E4B44"/>
+              <w:bottom w:val="single" w:sz="6" w:space="0" w:color="4E4B44"/>
+              <w:right w:val="single" w:sz="6" w:space="0" w:color="4E4B44"/>
+            </w:tcBorders>
+            <w:hideMark/>
+          </w:tcPr>
+          <w:p>
+            <w:pPr>
+              <w:keepNext/>
+            </w:pPr>
+            <w:r>
+              <w:t xml:space="preserve">2027</w:t>
+            </w:r>
+          </w:p>
+        </w:tc>
+        <w:tc>
+          <w:tcPr>
+            <w:tcW w:w="1855" w:type="dxa"/>
+            <w:tcBorders>
+              <w:top w:val="single" w:sz="6" w:space="0" w:color="4E4B44"/>
+              <w:left w:val="single" w:sz="6" w:space="0" w:color="4E4B44"/>
+              <w:bottom w:val="single" w:sz="6" w:space="0" w:color="4E4B44"/>
+              <w:right w:val="single" w:sz="6" w:space="0" w:color="4E4B44"/>
+            </w:tcBorders>
+            <w:hideMark/>
+          </w:tcPr>
+          <w:p>
+            <w:pPr>
+              <w:keepNext/>
+            </w:pPr>
+            <w:r>
+              <w:t xml:space="preserve">begroot</w:t>
+            </w:r>
+          </w:p>
+        </w:tc>
+      </w:tr>
+      <w:tr>
+        <w:trPr>
+          <w:trHeight w:val="369"/>
+          <w:cantSplit/>
+        </w:trPr>
+        <w:tc>
+          <w:tcPr>
+            <w:tcW w:w="3300" w:type="dxa"/>
+            <w:tcBorders>
+              <w:top w:val="single" w:sz="6" w:space="0" w:color="auto"/>
+              <w:left w:val="nil"/>
+              <w:bottom w:val="single" w:sz="6" w:space="0" w:color="auto"/>
+              <w:right w:val="single" w:sz="6" w:space="0" w:color="auto"/>
+            </w:tcBorders>
+            <w:hideMark/>
+          </w:tcPr>
+          <w:p>
+            <w:pPr>
+              <w:keepNext/>
+            </w:pPr>
+            <w:r>
+              <w:rPr>
+                <w:b/>
+                <w:bCs/>
+              </w:rPr>
+              <w:t xml:space="preserve">Utrecht</w:t>
+            </w:r>
+          </w:p>
+        </w:tc>
+        <w:tc>
+          <w:tcPr>
+            <w:tcW w:w="1900" w:type="dxa"/>
+            <w:tcBorders>
+              <w:top w:val="single" w:sz="6" w:space="0" w:color="4E4B44"/>
+              <w:left w:val="single" w:sz="6" w:space="0" w:color="4E4B44"/>
+              <w:bottom w:val="single" w:sz="6" w:space="0" w:color="4E4B44"/>
+              <w:right w:val="single" w:sz="6" w:space="0" w:color="4E4B44"/>
+            </w:tcBorders>
+            <w:hideMark/>
+          </w:tcPr>
+          <w:p>
+            <w:pPr>
+              <w:keepNext/>
+            </w:pPr>
+            <w:r>
+              <w:t xml:space="preserve">15,1</w:t>
+            </w:r>
+          </w:p>
+        </w:tc>
+        <w:tc>
+          <w:tcPr>
+            <w:tcW w:w="1200" w:type="dxa"/>
+            <w:tcBorders>
+              <w:top w:val="single" w:sz="6" w:space="0" w:color="4E4B44"/>
+              <w:left w:val="single" w:sz="6" w:space="0" w:color="4E4B44"/>
+              <w:bottom w:val="single" w:sz="6" w:space="0" w:color="4E4B44"/>
+              <w:right w:val="single" w:sz="6" w:space="0" w:color="4E4B44"/>
+            </w:tcBorders>
+            <w:hideMark/>
+          </w:tcPr>
+          <w:p>
+            <w:pPr>
+              <w:keepNext/>
+            </w:pPr>
+            <w:r>
+              <w:t xml:space="preserve">2025</w:t>
+            </w:r>
+          </w:p>
+        </w:tc>
+        <w:tc>
+          <w:tcPr>
+            <w:tcW w:w="1855" w:type="dxa"/>
+            <w:tcBorders>
+              <w:top w:val="single" w:sz="6" w:space="0" w:color="4E4B44"/>
+              <w:left w:val="single" w:sz="6" w:space="0" w:color="4E4B44"/>
+              <w:bottom w:val="single" w:sz="6" w:space="0" w:color="4E4B44"/>
+              <w:right w:val="single" w:sz="6" w:space="0" w:color="4E4B44"/>
+            </w:tcBorders>
+            <w:hideMark/>
+          </w:tcPr>
+          <w:p>
+            <w:pPr>
+              <w:keepNext/>
+            </w:pPr>
+            <w:r>
+              <w:t xml:space="preserve">gerealiseerd</w:t>
+            </w:r>
+          </w:p>
+        </w:tc>
+      </w:tr>
+      <w:tr>
+        <w:trPr>
+          <w:trHeight w:val="369"/>
+          <w:cantSplit/>
+        </w:trPr>
+        <w:tc>
+          <w:tcPr>
+            <w:tcW w:w="3300" w:type="dxa"/>
+            <w:tcBorders>
+              <w:top w:val="single" w:sz="6" w:space="0" w:color="auto"/>
+              <w:left w:val="nil"/>
+              <w:bottom w:val="single" w:sz="6" w:space="0" w:color="auto"/>
+              <w:right w:val="single" w:sz="6" w:space="0" w:color="auto"/>
+            </w:tcBorders>
+            <w:hideMark/>
+          </w:tcPr>
+          <w:p>
+            <w:pPr>
+              <w:keepNext/>
+            </w:pPr>
+            <w:r>
+              <w:rPr>
+                <w:b/>
+                <w:bCs/>
+              </w:rPr>
+              <w:t xml:space="preserve">Eindhoven</w:t>
+            </w:r>
+          </w:p>
+        </w:tc>
+        <w:tc>
+          <w:tcPr>
+            <w:tcW w:w="1900" w:type="dxa"/>
+            <w:tcBorders>
+              <w:top w:val="single" w:sz="6" w:space="0" w:color="4E4B44"/>
+              <w:left w:val="single" w:sz="6" w:space="0" w:color="4E4B44"/>
+              <w:bottom w:val="single" w:sz="6" w:space="0" w:color="4E4B44"/>
+              <w:right w:val="single" w:sz="6" w:space="0" w:color="4E4B44"/>
+            </w:tcBorders>
+            <w:hideMark/>
+          </w:tcPr>
+          <w:p>
+            <w:pPr>
+              <w:keepNext/>
+            </w:pPr>
+            <w:r>
+              <w:t xml:space="preserve">9,8</w:t>
+            </w:r>
+          </w:p>
+        </w:tc>
+        <w:tc>
+          <w:tcPr>
+            <w:tcW w:w="1200" w:type="dxa"/>
+            <w:tcBorders>
+              <w:top w:val="single" w:sz="6" w:space="0" w:color="4E4B44"/>
+              <w:left w:val="single" w:sz="6" w:space="0" w:color="4E4B44"/>
+              <w:bottom w:val="single" w:sz="6" w:space="0" w:color="4E4B44"/>
+              <w:right w:val="single" w:sz="6" w:space="0" w:color="4E4B44"/>
+            </w:tcBorders>
+            <w:hideMark/>
+          </w:tcPr>
+          <w:p>
+            <w:pPr>
+              <w:keepNext/>
+            </w:pPr>
+            <w:r>
+              <w:t xml:space="preserve">2026</w:t>
+            </w:r>
+          </w:p>
+        </w:tc>
+        <w:tc>
+          <w:tcPr>
+            <w:tcW w:w="1855" w:type="dxa"/>
+            <w:tcBorders>
+              <w:top w:val="single" w:sz="6" w:space="0" w:color="4E4B44"/>
+              <w:left w:val="single" w:sz="6" w:space="0" w:color="4E4B44"/>
+              <w:bottom w:val="single" w:sz="6" w:space="0" w:color="4E4B44"/>
+              <w:right w:val="single" w:sz="6" w:space="0" w:color="4E4B44"/>
+            </w:tcBorders>
+            <w:hideMark/>
+          </w:tcPr>
+          <w:p>
+            <w:pPr>
+              <w:keepNext/>
+            </w:pPr>
+            <w:r>
+              <w:t xml:space="preserve">begroot</w:t>
+            </w:r>
+          </w:p>
+        </w:tc>
+      </w:tr>
+      <w:tr>
+        <w:trPr>
+          <w:trHeight w:val="369"/>
+          <w:cantSplit/>
+        </w:trPr>
+        <w:tc>
+          <w:tcPr>
+            <w:tcW w:w="3300" w:type="dxa"/>
+            <w:tcBorders>
+              <w:top w:val="single" w:sz="6" w:space="0" w:color="auto"/>
+              <w:left w:val="nil"/>
+              <w:bottom w:val="single" w:sz="6" w:space="0" w:color="auto"/>
+              <w:right w:val="single" w:sz="6" w:space="0" w:color="auto"/>
+            </w:tcBorders>
+            <w:hideMark/>
+          </w:tcPr>
+          <w:p>
+            <w:pPr>
+              <w:keepNext/>
+            </w:pPr>
+            <w:r>
+              <w:rPr>
+                <w:b/>
+                <w:bCs/>
+              </w:rPr>
+              <w:t xml:space="preserve">Nijmegen</w:t>
+            </w:r>
+          </w:p>
+        </w:tc>
+        <w:tc>
+          <w:tcPr>
+            <w:tcW w:w="1900" w:type="dxa"/>
+            <w:tcBorders>
+              <w:top w:val="single" w:sz="6" w:space="0" w:color="4E4B44"/>
+              <w:left w:val="single" w:sz="6" w:space="0" w:color="4E4B44"/>
+              <w:bottom w:val="single" w:sz="6" w:space="0" w:color="4E4B44"/>
+              <w:right w:val="single" w:sz="6" w:space="0" w:color="4E4B44"/>
+            </w:tcBorders>
+            <w:hideMark/>
+          </w:tcPr>
+          <w:p>
+            <w:pPr>
+              <w:keepNext/>
+            </w:pPr>
+            <w:r>
+              <w:t xml:space="preserve">9,0</w:t>
+            </w:r>
+          </w:p>
+        </w:tc>
+        <w:tc>
+          <w:tcPr>
+            <w:tcW w:w="1200" w:type="dxa"/>
+            <w:tcBorders>
+              <w:top w:val="single" w:sz="6" w:space="0" w:color="4E4B44"/>
+              <w:left w:val="single" w:sz="6" w:space="0" w:color="4E4B44"/>
+              <w:bottom w:val="single" w:sz="6" w:space="0" w:color="4E4B44"/>
+              <w:right w:val="single" w:sz="6" w:space="0" w:color="4E4B44"/>
+            </w:tcBorders>
+            <w:hideMark/>
+          </w:tcPr>
+          <w:p>
+            <w:pPr>
+              <w:keepNext/>
+            </w:pPr>
+            <w:r>
+              <w:t xml:space="preserve">2025</w:t>
+            </w:r>
+          </w:p>
+        </w:tc>
+        <w:tc>
+          <w:tcPr>
+            <w:tcW w:w="1855" w:type="dxa"/>
+            <w:tcBorders>
+              <w:top w:val="single" w:sz="6" w:space="0" w:color="4E4B44"/>
+              <w:left w:val="single" w:sz="6" w:space="0" w:color="4E4B44"/>
+              <w:bottom w:val="single" w:sz="6" w:space="0" w:color="4E4B44"/>
+              <w:right w:val="single" w:sz="6" w:space="0" w:color="4E4B44"/>
+            </w:tcBorders>
+            <w:hideMark/>
+          </w:tcPr>
+          <w:p>
+            <w:pPr>
+              <w:keepNext/>
+            </w:pPr>
+            <w:r>
+              <w:t xml:space="preserve">gerealiseerd</w:t>
+            </w:r>
+          </w:p>
+        </w:tc>
+      </w:tr>
+      <w:tr>
+        <w:trPr>
+          <w:trHeight w:val="369"/>
+          <w:cantSplit/>
+        </w:trPr>
+        <w:tc>
+          <w:tcPr>
+            <w:tcW w:w="3300" w:type="dxa"/>
+            <w:tcBorders>
+              <w:top w:val="single" w:sz="6" w:space="0" w:color="auto"/>
+              <w:left w:val="nil"/>
+              <w:bottom w:val="single" w:sz="6" w:space="0" w:color="auto"/>
+              <w:right w:val="single" w:sz="6" w:space="0" w:color="auto"/>
+            </w:tcBorders>
+            <w:hideMark/>
+          </w:tcPr>
+          <w:p>
+            <w:pPr>
+              <w:keepNext/>
+            </w:pPr>
+            <w:r>
+              <w:rPr>
+                <w:b/>
+                <w:bCs/>
+              </w:rPr>
+              <w:t xml:space="preserve">Zwolle</w:t>
+            </w:r>
+          </w:p>
+        </w:tc>
+        <w:tc>
+          <w:tcPr>
+            <w:tcW w:w="1900" w:type="dxa"/>
+            <w:tcBorders>
+              <w:top w:val="single" w:sz="6" w:space="0" w:color="4E4B44"/>
+              <w:left w:val="single" w:sz="6" w:space="0" w:color="4E4B44"/>
+              <w:bottom w:val="single" w:sz="6" w:space="0" w:color="4E4B44"/>
+              <w:right w:val="single" w:sz="6" w:space="0" w:color="4E4B44"/>
+            </w:tcBorders>
+            <w:hideMark/>
+          </w:tcPr>
+          <w:p>
+            <w:pPr>
+              <w:keepNext/>
+            </w:pPr>
+            <w:r>
+              <w:t xml:space="preserve">7,5</w:t>
+            </w:r>
+          </w:p>
+        </w:tc>
+        <w:tc>
+          <w:tcPr>
+            <w:tcW w:w="1200" w:type="dxa"/>
+            <w:tcBorders>
+              <w:top w:val="single" w:sz="6" w:space="0" w:color="4E4B44"/>
+              <w:left w:val="single" w:sz="6" w:space="0" w:color="4E4B44"/>
+              <w:bottom w:val="single" w:sz="6" w:space="0" w:color="4E4B44"/>
+              <w:right w:val="single" w:sz="6" w:space="0" w:color="4E4B44"/>
+            </w:tcBorders>
+            <w:hideMark/>
+          </w:tcPr>
+          <w:p>
+            <w:pPr>
+              <w:keepNext/>
+            </w:pPr>
+            <w:r>
+              <w:t xml:space="preserve">2026</w:t>
+            </w:r>
+          </w:p>
+        </w:tc>
+        <w:tc>
+          <w:tcPr>
+            <w:tcW w:w="1855" w:type="dxa"/>
+            <w:tcBorders>
+              <w:top w:val="single" w:sz="6" w:space="0" w:color="4E4B44"/>
+              <w:left w:val="single" w:sz="6" w:space="0" w:color="4E4B44"/>
+              <w:bottom w:val="single" w:sz="6" w:space="0" w:color="4E4B44"/>
+              <w:right w:val="single" w:sz="6" w:space="0" w:color="4E4B44"/>
+            </w:tcBorders>
+            <w:hideMark/>
+          </w:tcPr>
+          <w:p>
+            <w:pPr>
+              <w:keepNext/>
+            </w:pPr>
+            <w:r>
+              <w:t xml:space="preserve">begroot</w:t>
+            </w:r>
+          </w:p>
+        </w:tc>
+      </w:tr>
+      <w:tr>
+        <w:trPr>
+          <w:trHeight w:val="369"/>
+          <w:cantSplit/>
+        </w:trPr>
+        <w:tc>
+          <w:tcPr>
+            <w:tcW w:w="3300" w:type="dxa"/>
+            <w:tcBorders>
+              <w:top w:val="single" w:sz="6" w:space="0" w:color="auto"/>
+              <w:left w:val="nil"/>
+              <w:bottom w:val="single" w:sz="6" w:space="0" w:color="auto"/>
+              <w:right w:val="single" w:sz="6" w:space="0" w:color="auto"/>
+            </w:tcBorders>
+            <w:hideMark/>
+          </w:tcPr>
+          <w:p>
+            <w:r>
+              <w:rPr>
+                <w:b/>
+                <w:bCs/>
+              </w:rPr>
+              <w:t xml:space="preserve">Groningen na 15% minder</w:t>
+            </w:r>
+          </w:p>
+        </w:tc>
+        <w:tc>
+          <w:tcPr>
+            <w:tcW w:w="1900" w:type="dxa"/>
+            <w:tcBorders>
+              <w:top w:val="single" w:sz="6" w:space="0" w:color="4E4B44"/>
+              <w:left w:val="single" w:sz="6" w:space="0" w:color="4E4B44"/>
+              <w:bottom w:val="single" w:sz="6" w:space="0" w:color="4E4B44"/>
+              <w:right w:val="single" w:sz="6" w:space="0" w:color="4E4B44"/>
+            </w:tcBorders>
+            <w:hideMark/>
+          </w:tcPr>
+          <w:p>
+            <w:r>
+              <w:t xml:space="preserve">12,5</w:t>
+            </w:r>
+          </w:p>
+        </w:tc>
+        <w:tc>
+          <w:tcPr>
+            <w:tcW w:w="1200" w:type="dxa"/>
+            <w:tcBorders>
+              <w:top w:val="single" w:sz="6" w:space="0" w:color="4E4B44"/>
+              <w:left w:val="single" w:sz="6" w:space="0" w:color="4E4B44"/>
+              <w:bottom w:val="single" w:sz="6" w:space="0" w:color="4E4B44"/>
+              <w:right w:val="single" w:sz="6" w:space="0" w:color="4E4B44"/>
+            </w:tcBorders>
+            <w:hideMark/>
+          </w:tcPr>
+          <w:p>
+            <w:r>
+              <w:t xml:space="preserve">2030</w:t>
+            </w:r>
+          </w:p>
+        </w:tc>
+        <w:tc>
+          <w:tcPr>
+            <w:tcW w:w="1855" w:type="dxa"/>
+            <w:tcBorders>
+              <w:top w:val="single" w:sz="6" w:space="0" w:color="4E4B44"/>
+              <w:left w:val="single" w:sz="6" w:space="0" w:color="4E4B44"/>
+              <w:bottom w:val="single" w:sz="6" w:space="0" w:color="4E4B44"/>
+              <w:right w:val="single" w:sz="6" w:space="0" w:color="4E4B44"/>
+            </w:tcBorders>
+            <w:hideMark/>
+          </w:tcPr>
+          <w:p>
+            <w:r>
+              <w:t xml:space="preserve">voorstel VVD</w:t>
+            </w:r>
+          </w:p>
+        </w:tc>
+      </w:tr>
+    </w:tbl>
+    <w:p>
+      <w:pPr>
+        <w:pStyle w:val="Hoofdtekst"/>
+        <w:spacing w:before="40" w:after="120"/>
+      </w:pPr>
+      <w:r>
+        <w:rPr>
+          <w:sz w:val="16"/>
+          <w:szCs w:val="16"/>
+        </w:rPr>
+        <w:t xml:space="preserve">Formatie in fte per 1.000 inwoners: verplichte beleidsindicator uit het Besluit begroting en verantwoording (BBV), zoals de gemeenten die zelf publiceren. Groningen: ontwerpbegroting 2027, wettelijke indicatoren (p. 283); Utrecht: begroting 2027, overzicht verplichte BBV-indicatoren (kolom 2025); Nijmegen: stadsbegroting 2027, indicatoren basisset BBV (kolom 2025); Eindhoven en Zwolle: begroting 2026. Dezelfde indicator staat voor alle gemeenten op waarstaatjegemeente.nl.</w:t>
       </w:r>
     </w:p>
     <w:p>

</xml_diff>

<commit_message>
Tegenbegroting 2027: Breda, Apeldoorn en Haarlemmermeer in tabel ambtenaren per inwoner
Co-Authored-By: Claude Opus 5.5 <noreply@anthropic.com>
Claude-Session: https://claude.ai/code/session_01Gpinc7W9kdxFe2j2GC2ZtD
</commit_message>
<xml_diff>
--- a/tegenbegroting/Tegenbegroting_VVD_Groningen_2027_v2.docx
+++ b/tegenbegroting/Tegenbegroting_VVD_Groningen_2027_v2.docx
@@ -3026,7 +3026,7 @@
         <w:rPr>
           <w:rFonts w:cs="Times New Roman"/>
         </w:rPr>
-        <w:t xml:space="preserve">Wat de VVD betreft moet de gemeente vooral heel veel taken niet meer doen. Daarom kan het ambtenarenapparaat met 15% krimpen: 53,7 miljoen euro per jaar vanaf 2030. Groningen heeft met 14,7 fte per 1.000 inwoners fors meer ambtenaren dan Nijmegen, Eindhoven en Zwolle; alleen Utrecht zit hoger (zie de tabel hieronder). Met 15% minder komt Groningen uit op ongeveer 12,5 fte per 1.000 inwoners. Amsterdam laat zien dat het kan: die gemeente heeft een vacature- en inhuurstop ingesteld en wil 2.500 voltijdbanen schrappen.</w:t>
+        <w:t xml:space="preserve">Wat de VVD betreft moet de gemeente vooral heel veel taken niet meer doen. Daarom kan het ambtenarenapparaat met 15% krimpen: 53,7 miljoen euro per jaar vanaf 2030. Groningen heeft met 14,7 fte per 1.000 inwoners fors meer ambtenaren dan Breda, Eindhoven, Nijmegen, Apeldoorn, Zwolle en Haarlemmermeer; alleen Utrecht zit hoger (zie de tabel hieronder). Met 15% minder komt Groningen uit op ongeveer 12,5 fte per 1.000 inwoners. Amsterdam laat zien dat het kan: die gemeente heeft een vacature- en inhuurstop ingesteld en wil 2.500 voltijdbanen schrappen.</w:t>
       </w:r>
       <w:r>
         <w:rPr>
@@ -3467,7 +3467,7 @@
                 <w:b/>
                 <w:bCs/>
               </w:rPr>
-              <w:t xml:space="preserve">Eindhoven</w:t>
+              <w:t xml:space="preserve">Breda</w:t>
             </w:r>
           </w:p>
         </w:tc>
@@ -3487,7 +3487,7 @@
               <w:keepNext/>
             </w:pPr>
             <w:r>
-              <w:t xml:space="preserve">9,8</w:t>
+              <w:t xml:space="preserve">11,9</w:t>
             </w:r>
           </w:p>
         </w:tc>
@@ -3507,7 +3507,7 @@
               <w:keepNext/>
             </w:pPr>
             <w:r>
-              <w:t xml:space="preserve">2026</w:t>
+              <w:t xml:space="preserve">2024</w:t>
             </w:r>
           </w:p>
         </w:tc>
@@ -3527,7 +3527,7 @@
               <w:keepNext/>
             </w:pPr>
             <w:r>
-              <w:t xml:space="preserve">begroot</w:t>
+              <w:t xml:space="preserve">gerealiseerd</w:t>
             </w:r>
           </w:p>
         </w:tc>
@@ -3557,7 +3557,7 @@
                 <w:b/>
                 <w:bCs/>
               </w:rPr>
-              <w:t xml:space="preserve">Nijmegen</w:t>
+              <w:t xml:space="preserve">Eindhoven</w:t>
             </w:r>
           </w:p>
         </w:tc>
@@ -3577,7 +3577,7 @@
               <w:keepNext/>
             </w:pPr>
             <w:r>
-              <w:t xml:space="preserve">9,0</w:t>
+              <w:t xml:space="preserve">9,8</w:t>
             </w:r>
           </w:p>
         </w:tc>
@@ -3597,7 +3597,7 @@
               <w:keepNext/>
             </w:pPr>
             <w:r>
-              <w:t xml:space="preserve">2025</w:t>
+              <w:t xml:space="preserve">2026</w:t>
             </w:r>
           </w:p>
         </w:tc>
@@ -3617,7 +3617,7 @@
               <w:keepNext/>
             </w:pPr>
             <w:r>
-              <w:t xml:space="preserve">gerealiseerd</w:t>
+              <w:t xml:space="preserve">begroot</w:t>
             </w:r>
           </w:p>
         </w:tc>
@@ -3647,7 +3647,7 @@
                 <w:b/>
                 <w:bCs/>
               </w:rPr>
-              <w:t xml:space="preserve">Zwolle</w:t>
+              <w:t xml:space="preserve">Nijmegen</w:t>
             </w:r>
           </w:p>
         </w:tc>
@@ -3667,7 +3667,7 @@
               <w:keepNext/>
             </w:pPr>
             <w:r>
-              <w:t xml:space="preserve">7,5</w:t>
+              <w:t xml:space="preserve">9,0</w:t>
             </w:r>
           </w:p>
         </w:tc>
@@ -3687,7 +3687,7 @@
               <w:keepNext/>
             </w:pPr>
             <w:r>
-              <w:t xml:space="preserve">2026</w:t>
+              <w:t xml:space="preserve">2025</w:t>
             </w:r>
           </w:p>
         </w:tc>
@@ -3707,7 +3707,7 @@
               <w:keepNext/>
             </w:pPr>
             <w:r>
-              <w:t xml:space="preserve">begroot</w:t>
+              <w:t xml:space="preserve">gerealiseerd</w:t>
             </w:r>
           </w:p>
         </w:tc>
@@ -3729,12 +3729,15 @@
             <w:hideMark/>
           </w:tcPr>
           <w:p>
+            <w:pPr>
+              <w:keepNext/>
+            </w:pPr>
             <w:r>
               <w:rPr>
                 <w:b/>
                 <w:bCs/>
               </w:rPr>
-              <w:t xml:space="preserve">Groningen na 15% minder</w:t>
+              <w:t xml:space="preserve">Apeldoorn</w:t>
             </w:r>
           </w:p>
         </w:tc>
@@ -3750,8 +3753,11 @@
             <w:hideMark/>
           </w:tcPr>
           <w:p>
-            <w:r>
-              <w:t xml:space="preserve">12,5</w:t>
+            <w:pPr>
+              <w:keepNext/>
+            </w:pPr>
+            <w:r>
+              <w:t xml:space="preserve">8,5</w:t>
             </w:r>
           </w:p>
         </w:tc>
@@ -3767,8 +3773,11 @@
             <w:hideMark/>
           </w:tcPr>
           <w:p>
-            <w:r>
-              <w:t xml:space="preserve">2030</w:t>
+            <w:pPr>
+              <w:keepNext/>
+            </w:pPr>
+            <w:r>
+              <w:t xml:space="preserve">2024</w:t>
             </w:r>
           </w:p>
         </w:tc>
@@ -3784,6 +3793,267 @@
             <w:hideMark/>
           </w:tcPr>
           <w:p>
+            <w:pPr>
+              <w:keepNext/>
+            </w:pPr>
+            <w:r>
+              <w:t xml:space="preserve">gerealiseerd</w:t>
+            </w:r>
+          </w:p>
+        </w:tc>
+      </w:tr>
+      <w:tr>
+        <w:trPr>
+          <w:trHeight w:val="369"/>
+          <w:cantSplit/>
+        </w:trPr>
+        <w:tc>
+          <w:tcPr>
+            <w:tcW w:w="3300" w:type="dxa"/>
+            <w:tcBorders>
+              <w:top w:val="single" w:sz="6" w:space="0" w:color="auto"/>
+              <w:left w:val="nil"/>
+              <w:bottom w:val="single" w:sz="6" w:space="0" w:color="auto"/>
+              <w:right w:val="single" w:sz="6" w:space="0" w:color="auto"/>
+            </w:tcBorders>
+            <w:hideMark/>
+          </w:tcPr>
+          <w:p>
+            <w:pPr>
+              <w:keepNext/>
+            </w:pPr>
+            <w:r>
+              <w:rPr>
+                <w:b/>
+                <w:bCs/>
+              </w:rPr>
+              <w:t xml:space="preserve">Zwolle</w:t>
+            </w:r>
+          </w:p>
+        </w:tc>
+        <w:tc>
+          <w:tcPr>
+            <w:tcW w:w="1900" w:type="dxa"/>
+            <w:tcBorders>
+              <w:top w:val="single" w:sz="6" w:space="0" w:color="4E4B44"/>
+              <w:left w:val="single" w:sz="6" w:space="0" w:color="4E4B44"/>
+              <w:bottom w:val="single" w:sz="6" w:space="0" w:color="4E4B44"/>
+              <w:right w:val="single" w:sz="6" w:space="0" w:color="4E4B44"/>
+            </w:tcBorders>
+            <w:hideMark/>
+          </w:tcPr>
+          <w:p>
+            <w:pPr>
+              <w:keepNext/>
+            </w:pPr>
+            <w:r>
+              <w:t xml:space="preserve">7,5</w:t>
+            </w:r>
+          </w:p>
+        </w:tc>
+        <w:tc>
+          <w:tcPr>
+            <w:tcW w:w="1200" w:type="dxa"/>
+            <w:tcBorders>
+              <w:top w:val="single" w:sz="6" w:space="0" w:color="4E4B44"/>
+              <w:left w:val="single" w:sz="6" w:space="0" w:color="4E4B44"/>
+              <w:bottom w:val="single" w:sz="6" w:space="0" w:color="4E4B44"/>
+              <w:right w:val="single" w:sz="6" w:space="0" w:color="4E4B44"/>
+            </w:tcBorders>
+            <w:hideMark/>
+          </w:tcPr>
+          <w:p>
+            <w:pPr>
+              <w:keepNext/>
+            </w:pPr>
+            <w:r>
+              <w:t xml:space="preserve">2026</w:t>
+            </w:r>
+          </w:p>
+        </w:tc>
+        <w:tc>
+          <w:tcPr>
+            <w:tcW w:w="1855" w:type="dxa"/>
+            <w:tcBorders>
+              <w:top w:val="single" w:sz="6" w:space="0" w:color="4E4B44"/>
+              <w:left w:val="single" w:sz="6" w:space="0" w:color="4E4B44"/>
+              <w:bottom w:val="single" w:sz="6" w:space="0" w:color="4E4B44"/>
+              <w:right w:val="single" w:sz="6" w:space="0" w:color="4E4B44"/>
+            </w:tcBorders>
+            <w:hideMark/>
+          </w:tcPr>
+          <w:p>
+            <w:pPr>
+              <w:keepNext/>
+            </w:pPr>
+            <w:r>
+              <w:t xml:space="preserve">begroot</w:t>
+            </w:r>
+          </w:p>
+        </w:tc>
+      </w:tr>
+      <w:tr>
+        <w:trPr>
+          <w:trHeight w:val="369"/>
+          <w:cantSplit/>
+        </w:trPr>
+        <w:tc>
+          <w:tcPr>
+            <w:tcW w:w="3300" w:type="dxa"/>
+            <w:tcBorders>
+              <w:top w:val="single" w:sz="6" w:space="0" w:color="auto"/>
+              <w:left w:val="nil"/>
+              <w:bottom w:val="single" w:sz="6" w:space="0" w:color="auto"/>
+              <w:right w:val="single" w:sz="6" w:space="0" w:color="auto"/>
+            </w:tcBorders>
+            <w:hideMark/>
+          </w:tcPr>
+          <w:p>
+            <w:pPr>
+              <w:keepNext/>
+            </w:pPr>
+            <w:r>
+              <w:rPr>
+                <w:b/>
+                <w:bCs/>
+              </w:rPr>
+              <w:t xml:space="preserve">Haarlemmermeer</w:t>
+            </w:r>
+          </w:p>
+        </w:tc>
+        <w:tc>
+          <w:tcPr>
+            <w:tcW w:w="1900" w:type="dxa"/>
+            <w:tcBorders>
+              <w:top w:val="single" w:sz="6" w:space="0" w:color="4E4B44"/>
+              <w:left w:val="single" w:sz="6" w:space="0" w:color="4E4B44"/>
+              <w:bottom w:val="single" w:sz="6" w:space="0" w:color="4E4B44"/>
+              <w:right w:val="single" w:sz="6" w:space="0" w:color="4E4B44"/>
+            </w:tcBorders>
+            <w:hideMark/>
+          </w:tcPr>
+          <w:p>
+            <w:pPr>
+              <w:keepNext/>
+            </w:pPr>
+            <w:r>
+              <w:t xml:space="preserve">7,5</w:t>
+            </w:r>
+          </w:p>
+        </w:tc>
+        <w:tc>
+          <w:tcPr>
+            <w:tcW w:w="1200" w:type="dxa"/>
+            <w:tcBorders>
+              <w:top w:val="single" w:sz="6" w:space="0" w:color="4E4B44"/>
+              <w:left w:val="single" w:sz="6" w:space="0" w:color="4E4B44"/>
+              <w:bottom w:val="single" w:sz="6" w:space="0" w:color="4E4B44"/>
+              <w:right w:val="single" w:sz="6" w:space="0" w:color="4E4B44"/>
+            </w:tcBorders>
+            <w:hideMark/>
+          </w:tcPr>
+          <w:p>
+            <w:pPr>
+              <w:keepNext/>
+            </w:pPr>
+            <w:r>
+              <w:t xml:space="preserve">2024</w:t>
+            </w:r>
+          </w:p>
+        </w:tc>
+        <w:tc>
+          <w:tcPr>
+            <w:tcW w:w="1855" w:type="dxa"/>
+            <w:tcBorders>
+              <w:top w:val="single" w:sz="6" w:space="0" w:color="4E4B44"/>
+              <w:left w:val="single" w:sz="6" w:space="0" w:color="4E4B44"/>
+              <w:bottom w:val="single" w:sz="6" w:space="0" w:color="4E4B44"/>
+              <w:right w:val="single" w:sz="6" w:space="0" w:color="4E4B44"/>
+            </w:tcBorders>
+            <w:hideMark/>
+          </w:tcPr>
+          <w:p>
+            <w:pPr>
+              <w:keepNext/>
+            </w:pPr>
+            <w:r>
+              <w:t xml:space="preserve">gerealiseerd</w:t>
+            </w:r>
+          </w:p>
+        </w:tc>
+      </w:tr>
+      <w:tr>
+        <w:trPr>
+          <w:trHeight w:val="369"/>
+          <w:cantSplit/>
+        </w:trPr>
+        <w:tc>
+          <w:tcPr>
+            <w:tcW w:w="3300" w:type="dxa"/>
+            <w:tcBorders>
+              <w:top w:val="single" w:sz="6" w:space="0" w:color="auto"/>
+              <w:left w:val="nil"/>
+              <w:bottom w:val="single" w:sz="6" w:space="0" w:color="auto"/>
+              <w:right w:val="single" w:sz="6" w:space="0" w:color="auto"/>
+            </w:tcBorders>
+            <w:hideMark/>
+          </w:tcPr>
+          <w:p>
+            <w:r>
+              <w:rPr>
+                <w:b/>
+                <w:bCs/>
+              </w:rPr>
+              <w:t xml:space="preserve">Groningen na 15% minder</w:t>
+            </w:r>
+          </w:p>
+        </w:tc>
+        <w:tc>
+          <w:tcPr>
+            <w:tcW w:w="1900" w:type="dxa"/>
+            <w:tcBorders>
+              <w:top w:val="single" w:sz="6" w:space="0" w:color="4E4B44"/>
+              <w:left w:val="single" w:sz="6" w:space="0" w:color="4E4B44"/>
+              <w:bottom w:val="single" w:sz="6" w:space="0" w:color="4E4B44"/>
+              <w:right w:val="single" w:sz="6" w:space="0" w:color="4E4B44"/>
+            </w:tcBorders>
+            <w:hideMark/>
+          </w:tcPr>
+          <w:p>
+            <w:r>
+              <w:t xml:space="preserve">12,5</w:t>
+            </w:r>
+          </w:p>
+        </w:tc>
+        <w:tc>
+          <w:tcPr>
+            <w:tcW w:w="1200" w:type="dxa"/>
+            <w:tcBorders>
+              <w:top w:val="single" w:sz="6" w:space="0" w:color="4E4B44"/>
+              <w:left w:val="single" w:sz="6" w:space="0" w:color="4E4B44"/>
+              <w:bottom w:val="single" w:sz="6" w:space="0" w:color="4E4B44"/>
+              <w:right w:val="single" w:sz="6" w:space="0" w:color="4E4B44"/>
+            </w:tcBorders>
+            <w:hideMark/>
+          </w:tcPr>
+          <w:p>
+            <w:r>
+              <w:t xml:space="preserve">2030</w:t>
+            </w:r>
+          </w:p>
+        </w:tc>
+        <w:tc>
+          <w:tcPr>
+            <w:tcW w:w="1855" w:type="dxa"/>
+            <w:tcBorders>
+              <w:top w:val="single" w:sz="6" w:space="0" w:color="4E4B44"/>
+              <w:left w:val="single" w:sz="6" w:space="0" w:color="4E4B44"/>
+              <w:bottom w:val="single" w:sz="6" w:space="0" w:color="4E4B44"/>
+              <w:right w:val="single" w:sz="6" w:space="0" w:color="4E4B44"/>
+            </w:tcBorders>
+            <w:hideMark/>
+          </w:tcPr>
+          <w:p>
             <w:r>
               <w:t xml:space="preserve">voorstel VVD</w:t>
             </w:r>
@@ -3801,7 +4071,7 @@
           <w:sz w:val="16"/>
           <w:szCs w:val="16"/>
         </w:rPr>
-        <w:t xml:space="preserve">Formatie in fte per 1.000 inwoners: verplichte beleidsindicator uit het Besluit begroting en verantwoording (BBV), zoals de gemeenten die zelf publiceren. Groningen: ontwerpbegroting 2027, wettelijke indicatoren (p. 283); Utrecht: begroting 2027, overzicht verplichte BBV-indicatoren (kolom 2025); Nijmegen: stadsbegroting 2027, indicatoren basisset BBV (kolom 2025); Eindhoven en Zwolle: begroting 2026. Dezelfde indicator staat voor alle gemeenten op waarstaatjegemeente.nl.</w:t>
+        <w:t xml:space="preserve">Formatie in fte per 1.000 inwoners: verplichte beleidsindicator uit het Besluit begroting en verantwoording (BBV), zoals de gemeenten die zelf publiceren. Groningen: ontwerpbegroting 2027, wettelijke indicatoren (p. 283); Utrecht: begroting 2027, overzicht verplichte BBV-indicatoren (kolom 2025); Nijmegen: stadsbegroting 2027, indicatoren basisset BBV (kolom 2025); Breda: begroting 2026, programma Organisatie en financiën (realisatie 2024); Haarlemmermeer: jaarstukken 2024; Apeldoorn: jaarstukken 2024 (zoals opgenomen in de vergelijking in de programmabegroting 2025 van Haarlemmermeer); Eindhoven en Zwolle: begroting 2026. Dezelfde indicator staat voor alle gemeenten op waarstaatjegemeente.nl.</w:t>
       </w:r>
     </w:p>
     <w:p>

</xml_diff>

<commit_message>
Tegenbegroting 2027: dekkend cameratoezicht binnenstad en stationsgebied
Co-Authored-By: Claude Opus 5.5 <noreply@anthropic.com>
Claude-Session: https://claude.ai/code/session_01Gpinc7W9kdxFe2j2GC2ZtD
</commit_message>
<xml_diff>
--- a/tegenbegroting/Tegenbegroting_VVD_Groningen_2027_v2.docx
+++ b/tegenbegroting/Tegenbegroting_VVD_Groningen_2027_v2.docx
@@ -7165,7 +7165,7 @@
           <w:b/>
           <w:bCs/>
         </w:rPr>
-        <w:t xml:space="preserve">Jeugd, ondermijning en leefbaarheid</w:t>
+        <w:t xml:space="preserve">Dekkend cameratoezicht in de binnenstad en rond het station</w:t>
       </w:r>
       <w:r>
         <w:rPr>
@@ -7179,6 +7179,84 @@
         <w:rPr>
           <w:rFonts w:cs="Times New Roman"/>
         </w:rPr>
+        <w:t xml:space="preserve">De VVD wil dat de hele binnenstad onder cameratoezicht komt en dat er camera’s komen rondom het stationsgebied. De tijdelijke camera’s in het Gele Loper-gebied tussen het Hoofdstation en de Vismarkt</w:t>
+      </w:r>
+      <w:r>
+        <w:rPr>
+          <w:rStyle w:val="Voetnootmarkering"/>
+          <w:rFonts w:cs="Times New Roman"/>
+        </w:rPr>
+        <w:footnoteReference w:id="13"/>
+      </w:r>
+      <w:r>
+        <w:rPr>
+          <w:rFonts w:cs="Times New Roman"/>
+        </w:rPr>
+        <w:t xml:space="preserve"> worden daarmee onderdeel van een vast netwerk. De VVD vroeg hier in februari 2026 al om bij de behandeling van de Nachtvisie.</w:t>
+      </w:r>
+      <w:r>
+        <w:rPr>
+          <w:rStyle w:val="Voetnootmarkering"/>
+          <w:rFonts w:cs="Times New Roman"/>
+        </w:rPr>
+        <w:footnoteReference w:id="14"/>
+      </w:r>
+      <w:r>
+        <w:rPr>
+          <w:rFonts w:cs="Times New Roman"/>
+        </w:rPr>
+        <w:t xml:space="preserve"> We rekenen met 50 extra camera’s: 35 in de binnenstad en 15 rond het station. Aanschaf en aanleg kosten ongeveer 1,0 miljoen euro, die we in vijf jaar afschrijven; met uitkijken en onderhoud kost dit ongeveer 0,4 miljoen euro per jaar.</w:t>
+      </w:r>
+      <w:r>
+        <w:rPr>
+          <w:rStyle w:val="Voetnootmarkering"/>
+          <w:rFonts w:cs="Times New Roman"/>
+        </w:rPr>
+        <w:footnoteReference w:id="15"/>
+      </w:r>
+      <w:r>
+        <w:rPr>
+          <w:rFonts w:cs="Times New Roman"/>
+        </w:rPr>
+        <w:t xml:space="preserve"> Het aanwijzen van gebieden voor cameratoezicht is een bevoegdheid van de burgemeester; de VVD stelt het geld daarvoor beschikbaar.</w:t>
+      </w:r>
+    </w:p>
+    <w:p>
+      <w:pPr>
+        <w:pStyle w:val="Hoofdtekst"/>
+        <w:rPr>
+          <w:rFonts w:cs="Times New Roman"/>
+        </w:rPr>
+      </w:pPr>
+      <w:r>
+        <w:rPr>
+          <w:color w:val="FF6400"/>
+        </w:rPr>
+        <w:t>▶</w:t>
+      </w:r>
+      <w:r>
+        <w:tab/>
+      </w:r>
+      <w:r>
+        <w:rPr>
+          <w:rFonts w:cs="Times New Roman"/>
+          <w:b/>
+          <w:bCs/>
+        </w:rPr>
+        <w:t xml:space="preserve">Jeugd, ondermijning en leefbaarheid</w:t>
+      </w:r>
+      <w:r>
+        <w:rPr>
+          <w:rFonts w:cs="Times New Roman"/>
+          <w:b/>
+          <w:bCs/>
+        </w:rPr>
+        <w:t xml:space="preserve">. </w:t>
+      </w:r>
+      <w:r>
+        <w:rPr>
+          <w:rFonts w:cs="Times New Roman"/>
+        </w:rPr>
         <w:t xml:space="preserve">De VVD investeert extra in jeugd en veiligheid (10%), de aanpak van ondermijning (10%) en de leefkwaliteit in wijken (groen en spelen, 5%). Zo houden we wijken schoon, heel en veilig.</w:t>
       </w:r>
     </w:p>
@@ -7270,7 +7348,7 @@
           <w:rStyle w:val="Voetnootmarkering"/>
           <w:rFonts w:cs="Times New Roman"/>
         </w:rPr>
-        <w:footnoteReference w:id="13"/>
+        <w:footnoteReference w:id="16"/>
       </w:r>
       <w:r>
         <w:rPr>
@@ -7510,7 +7588,7 @@
         <w:rPr>
           <w:rFonts w:cs="Times New Roman"/>
         </w:rPr>
-        <w:t xml:space="preserve">De financiële positie van de gemeente staat er niet goed voor. Daarom wil de VVD de reserves van de gemeente laten toenemen, waardoor de financiële positie van onze gemeente flink verbetert. Een gezonde balans voorkomt dat toekomstige generaties opdraaien voor de uitgaven van vandaag. Het saldo dat na alle keuzes in 2027 overblijft, 11,8 miljoen euro, storten we hiervoor. Het structurele overschot loopt op tot 53,8 miljoen euro in 2030.</w:t>
+        <w:t xml:space="preserve">De financiële positie van de gemeente staat er niet goed voor. Daarom wil de VVD de reserves van de gemeente laten toenemen, waardoor de financiële positie van onze gemeente flink verbetert. Een gezonde balans voorkomt dat toekomstige generaties opdraaien voor de uitgaven van vandaag. Het saldo dat na alle keuzes in 2027 overblijft, 11,4 miljoen euro, storten we hiervoor. Het structurele overschot loopt op tot 53,4 miljoen euro in 2030.</w:t>
       </w:r>
     </w:p>
     <w:p>
@@ -14093,7 +14171,7 @@
                 <w:color w:val="000000"/>
                 <w:lang w:eastAsia="nl-NL"/>
               </w:rPr>
-              <w:t xml:space="preserve">Klantcontactcentrum (extra) 5%</w:t>
+              <w:t xml:space="preserve">Cameratoezicht binnenstad en stationsgebied: kapitaallasten</w:t>
             </w:r>
           </w:p>
         </w:tc>
@@ -14122,7 +14200,7 @@
                 <w:color w:val="000000"/>
                 <w:lang w:eastAsia="nl-NL"/>
               </w:rPr>
-              <w:t xml:space="preserve">0,205</w:t>
+              <w:t xml:space="preserve">0,214</w:t>
             </w:r>
           </w:p>
         </w:tc>
@@ -14184,7 +14262,7 @@
                 <w:color w:val="000000"/>
                 <w:lang w:eastAsia="nl-NL"/>
               </w:rPr>
-              <w:t xml:space="preserve">Leefkwaliteit (groen en spelen in wijken) 5%</w:t>
+              <w:t xml:space="preserve">Klantcontactcentrum (extra) 5%</w:t>
             </w:r>
           </w:p>
         </w:tc>
@@ -14213,7 +14291,7 @@
                 <w:color w:val="000000"/>
                 <w:lang w:eastAsia="nl-NL"/>
               </w:rPr>
-              <w:t xml:space="preserve">0,2</w:t>
+              <w:t xml:space="preserve">0,205</w:t>
             </w:r>
           </w:p>
         </w:tc>
@@ -14275,7 +14353,7 @@
                 <w:color w:val="000000"/>
                 <w:lang w:eastAsia="nl-NL"/>
               </w:rPr>
-              <w:t xml:space="preserve">Ondermijning 10%</w:t>
+              <w:t xml:space="preserve">Leefkwaliteit (groen en spelen in wijken) 5%</w:t>
             </w:r>
           </w:p>
         </w:tc>
@@ -14304,7 +14382,7 @@
                 <w:color w:val="000000"/>
                 <w:lang w:eastAsia="nl-NL"/>
               </w:rPr>
-              <w:t xml:space="preserve">0,14</w:t>
+              <w:t xml:space="preserve">0,2</w:t>
             </w:r>
           </w:p>
         </w:tc>
@@ -14366,7 +14444,7 @@
                 <w:color w:val="000000"/>
                 <w:lang w:eastAsia="nl-NL"/>
               </w:rPr>
-              <w:t xml:space="preserve">Toezicht op bouwen 5%</w:t>
+              <w:t xml:space="preserve">Cameratoezicht binnenstad en stationsgebied: uitkijken en onderhoud</w:t>
             </w:r>
           </w:p>
         </w:tc>
@@ -14395,7 +14473,7 @@
                 <w:color w:val="000000"/>
                 <w:lang w:eastAsia="nl-NL"/>
               </w:rPr>
-              <w:t xml:space="preserve">0,1</w:t>
+              <w:t xml:space="preserve">0,192</w:t>
             </w:r>
           </w:p>
         </w:tc>
@@ -14457,7 +14535,7 @@
                 <w:color w:val="000000"/>
                 <w:lang w:eastAsia="nl-NL"/>
               </w:rPr>
-              <w:t xml:space="preserve">Sportstimulering 5%</w:t>
+              <w:t xml:space="preserve">Ondermijning 10%</w:t>
             </w:r>
           </w:p>
         </w:tc>
@@ -14486,7 +14564,7 @@
                 <w:color w:val="000000"/>
                 <w:lang w:eastAsia="nl-NL"/>
               </w:rPr>
-              <w:t xml:space="preserve">0,09</w:t>
+              <w:t xml:space="preserve">0,14</w:t>
             </w:r>
           </w:p>
         </w:tc>
@@ -14548,7 +14626,7 @@
                 <w:color w:val="000000"/>
                 <w:lang w:eastAsia="nl-NL"/>
               </w:rPr>
-              <w:t xml:space="preserve">Extra geld wonen 5%</w:t>
+              <w:t xml:space="preserve">Toezicht op bouwen 5%</w:t>
             </w:r>
           </w:p>
         </w:tc>
@@ -14577,7 +14655,7 @@
                 <w:color w:val="000000"/>
                 <w:lang w:eastAsia="nl-NL"/>
               </w:rPr>
-              <w:t xml:space="preserve">0,089</w:t>
+              <w:t xml:space="preserve">0,1</w:t>
             </w:r>
           </w:p>
         </w:tc>
@@ -14639,7 +14717,7 @@
                 <w:color w:val="000000"/>
                 <w:lang w:eastAsia="nl-NL"/>
               </w:rPr>
-              <w:t xml:space="preserve">Bedrijventerreinen en winkelcentra 5%</w:t>
+              <w:t xml:space="preserve">Sportstimulering 5%</w:t>
             </w:r>
           </w:p>
         </w:tc>
@@ -14668,7 +14746,7 @@
                 <w:color w:val="000000"/>
                 <w:lang w:eastAsia="nl-NL"/>
               </w:rPr>
-              <w:t xml:space="preserve">0,078</w:t>
+              <w:t xml:space="preserve">0,09</w:t>
             </w:r>
           </w:p>
         </w:tc>
@@ -14730,7 +14808,7 @@
                 <w:color w:val="000000"/>
                 <w:lang w:eastAsia="nl-NL"/>
               </w:rPr>
-              <w:t xml:space="preserve">Kettingeffect: preventie en jeugdzorg (vanaf 2028)</w:t>
+              <w:t xml:space="preserve">Extra geld wonen 5%</w:t>
             </w:r>
           </w:p>
         </w:tc>
@@ -14759,7 +14837,7 @@
                 <w:color w:val="000000"/>
                 <w:lang w:eastAsia="nl-NL"/>
               </w:rPr>
-              <w:t xml:space="preserve">0,0</w:t>
+              <w:t xml:space="preserve">0,089</w:t>
             </w:r>
           </w:p>
         </w:tc>
@@ -14821,7 +14899,7 @@
                 <w:color w:val="000000"/>
                 <w:lang w:eastAsia="nl-NL"/>
               </w:rPr>
-              <w:t xml:space="preserve">Kettingeffect: welzijn, bewegen en Wmo (vanaf 2028)</w:t>
+              <w:t xml:space="preserve">Bedrijventerreinen en winkelcentra 5%</w:t>
             </w:r>
           </w:p>
         </w:tc>
@@ -14850,7 +14928,7 @@
                 <w:color w:val="000000"/>
                 <w:lang w:eastAsia="nl-NL"/>
               </w:rPr>
-              <w:t xml:space="preserve">0,0</w:t>
+              <w:t xml:space="preserve">0,078</w:t>
             </w:r>
           </w:p>
         </w:tc>
@@ -14912,7 +14990,7 @@
                 <w:color w:val="000000"/>
                 <w:lang w:eastAsia="nl-NL"/>
               </w:rPr>
-              <w:t xml:space="preserve">Kettingeffect: gemeentefonds (verdeelmodel, vanaf 2028)</w:t>
+              <w:t xml:space="preserve">Kettingeffect: preventie en jeugdzorg (vanaf 2028)</w:t>
             </w:r>
           </w:p>
         </w:tc>
@@ -15003,7 +15081,7 @@
                 <w:color w:val="000000"/>
                 <w:lang w:eastAsia="nl-NL"/>
               </w:rPr>
-              <w:t xml:space="preserve">Kettingeffect: cultuur en toeristenbelasting (vanaf 2028)</w:t>
+              <w:t xml:space="preserve">Kettingeffect: welzijn, bewegen en Wmo (vanaf 2028)</w:t>
             </w:r>
           </w:p>
         </w:tc>
@@ -15094,7 +15172,7 @@
                 <w:color w:val="000000"/>
                 <w:lang w:eastAsia="nl-NL"/>
               </w:rPr>
-              <w:t xml:space="preserve">Kettingeffect: kaartverkoop schouwburg en toeristenbelasting (vanaf 2028)</w:t>
+              <w:t xml:space="preserve">Kettingeffect: gemeentefonds (verdeelmodel, vanaf 2028)</w:t>
             </w:r>
           </w:p>
         </w:tc>
@@ -15185,7 +15263,7 @@
                 <w:color w:val="000000"/>
                 <w:lang w:eastAsia="nl-NL"/>
               </w:rPr>
-              <w:t xml:space="preserve">Kettingeffect: frictiekosten minder ambtenaren (eenmalig)</w:t>
+              <w:t xml:space="preserve">Kettingeffect: cultuur en toeristenbelasting (vanaf 2028)</w:t>
             </w:r>
           </w:p>
         </w:tc>
@@ -15214,7 +15292,7 @@
                 <w:color w:val="000000"/>
                 <w:lang w:eastAsia="nl-NL"/>
               </w:rPr>
-              <w:t xml:space="preserve">8,403</w:t>
+              <w:t xml:space="preserve">0,0</w:t>
             </w:r>
           </w:p>
         </w:tc>
@@ -15243,7 +15321,7 @@
                 <w:color w:val="000000"/>
                 <w:lang w:eastAsia="nl-NL"/>
               </w:rPr>
-              <w:t xml:space="preserve">I</w:t>
+              <w:t xml:space="preserve">S</w:t>
             </w:r>
           </w:p>
         </w:tc>
@@ -15276,7 +15354,7 @@
                 <w:color w:val="000000"/>
                 <w:lang w:eastAsia="nl-NL"/>
               </w:rPr>
-              <w:t xml:space="preserve">Kosten onderzoek SMR</w:t>
+              <w:t xml:space="preserve">Kettingeffect: kaartverkoop schouwburg en toeristenbelasting (vanaf 2028)</w:t>
             </w:r>
           </w:p>
         </w:tc>
@@ -15305,7 +15383,7 @@
                 <w:color w:val="000000"/>
                 <w:lang w:eastAsia="nl-NL"/>
               </w:rPr>
-              <w:t xml:space="preserve">0,5</w:t>
+              <w:t xml:space="preserve">0,0</w:t>
             </w:r>
           </w:p>
         </w:tc>
@@ -15334,7 +15412,7 @@
                 <w:color w:val="000000"/>
                 <w:lang w:eastAsia="nl-NL"/>
               </w:rPr>
-              <w:t xml:space="preserve">I</w:t>
+              <w:t xml:space="preserve">S</w:t>
             </w:r>
           </w:p>
         </w:tc>
@@ -15367,6 +15445,188 @@
                 <w:color w:val="000000"/>
                 <w:lang w:eastAsia="nl-NL"/>
               </w:rPr>
+              <w:t xml:space="preserve">Kettingeffect: frictiekosten minder ambtenaren (eenmalig)</w:t>
+            </w:r>
+          </w:p>
+        </w:tc>
+        <w:tc>
+          <w:tcPr>
+            <w:tcW w:w="1107" w:type="dxa"/>
+            <w:noWrap/>
+            <w:vAlign w:val="bottom"/>
+            <w:hideMark/>
+          </w:tcPr>
+          <w:p>
+            <w:pPr>
+              <w:widowControl/>
+              <w:autoSpaceDE/>
+              <w:autoSpaceDN/>
+              <w:jc w:val="right"/>
+              <w:rPr>
+                <w:rFonts w:ascii="Aptos Narrow" w:eastAsia="Times New Roman" w:hAnsi="Aptos Narrow" w:cs="Times New Roman"/>
+                <w:color w:val="000000"/>
+                <w:lang w:eastAsia="nl-NL"/>
+              </w:rPr>
+            </w:pPr>
+            <w:r>
+              <w:rPr>
+                <w:rFonts w:ascii="Aptos Narrow" w:eastAsia="Times New Roman" w:hAnsi="Aptos Narrow" w:cs="Times New Roman"/>
+                <w:color w:val="000000"/>
+                <w:lang w:eastAsia="nl-NL"/>
+              </w:rPr>
+              <w:t xml:space="preserve">8,403</w:t>
+            </w:r>
+          </w:p>
+        </w:tc>
+        <w:tc>
+          <w:tcPr>
+            <w:tcW w:w="2279" w:type="dxa"/>
+            <w:noWrap/>
+            <w:vAlign w:val="bottom"/>
+            <w:hideMark/>
+          </w:tcPr>
+          <w:p>
+            <w:pPr>
+              <w:widowControl/>
+              <w:autoSpaceDE/>
+              <w:autoSpaceDN/>
+              <w:jc w:val="right"/>
+              <w:rPr>
+                <w:rFonts w:ascii="Aptos Narrow" w:eastAsia="Times New Roman" w:hAnsi="Aptos Narrow" w:cs="Times New Roman"/>
+                <w:color w:val="000000"/>
+                <w:lang w:eastAsia="nl-NL"/>
+              </w:rPr>
+            </w:pPr>
+            <w:r>
+              <w:rPr>
+                <w:rFonts w:ascii="Aptos Narrow" w:eastAsia="Times New Roman" w:hAnsi="Aptos Narrow" w:cs="Times New Roman"/>
+                <w:color w:val="000000"/>
+                <w:lang w:eastAsia="nl-NL"/>
+              </w:rPr>
+              <w:t xml:space="preserve">I</w:t>
+            </w:r>
+          </w:p>
+        </w:tc>
+      </w:tr>
+      <w:tr>
+        <w:trPr>
+          <w:trHeight w:val="305"/>
+        </w:trPr>
+        <w:tc>
+          <w:tcPr>
+            <w:tcW w:w="7308" w:type="dxa"/>
+            <w:noWrap/>
+            <w:vAlign w:val="bottom"/>
+            <w:hideMark/>
+          </w:tcPr>
+          <w:p>
+            <w:pPr>
+              <w:widowControl/>
+              <w:autoSpaceDE/>
+              <w:autoSpaceDN/>
+              <w:rPr>
+                <w:rFonts w:ascii="Aptos Narrow" w:eastAsia="Times New Roman" w:hAnsi="Aptos Narrow" w:cs="Times New Roman"/>
+                <w:color w:val="000000"/>
+                <w:lang w:eastAsia="nl-NL"/>
+              </w:rPr>
+            </w:pPr>
+            <w:r>
+              <w:rPr>
+                <w:rFonts w:ascii="Aptos Narrow" w:eastAsia="Times New Roman" w:hAnsi="Aptos Narrow" w:cs="Times New Roman"/>
+                <w:color w:val="000000"/>
+                <w:lang w:eastAsia="nl-NL"/>
+              </w:rPr>
+              <w:t xml:space="preserve">Kosten onderzoek SMR</w:t>
+            </w:r>
+          </w:p>
+        </w:tc>
+        <w:tc>
+          <w:tcPr>
+            <w:tcW w:w="1107" w:type="dxa"/>
+            <w:noWrap/>
+            <w:vAlign w:val="bottom"/>
+            <w:hideMark/>
+          </w:tcPr>
+          <w:p>
+            <w:pPr>
+              <w:widowControl/>
+              <w:autoSpaceDE/>
+              <w:autoSpaceDN/>
+              <w:jc w:val="right"/>
+              <w:rPr>
+                <w:rFonts w:ascii="Aptos Narrow" w:eastAsia="Times New Roman" w:hAnsi="Aptos Narrow" w:cs="Times New Roman"/>
+                <w:color w:val="000000"/>
+                <w:lang w:eastAsia="nl-NL"/>
+              </w:rPr>
+            </w:pPr>
+            <w:r>
+              <w:rPr>
+                <w:rFonts w:ascii="Aptos Narrow" w:eastAsia="Times New Roman" w:hAnsi="Aptos Narrow" w:cs="Times New Roman"/>
+                <w:color w:val="000000"/>
+                <w:lang w:eastAsia="nl-NL"/>
+              </w:rPr>
+              <w:t xml:space="preserve">0,5</w:t>
+            </w:r>
+          </w:p>
+        </w:tc>
+        <w:tc>
+          <w:tcPr>
+            <w:tcW w:w="2279" w:type="dxa"/>
+            <w:noWrap/>
+            <w:vAlign w:val="bottom"/>
+            <w:hideMark/>
+          </w:tcPr>
+          <w:p>
+            <w:pPr>
+              <w:widowControl/>
+              <w:autoSpaceDE/>
+              <w:autoSpaceDN/>
+              <w:jc w:val="right"/>
+              <w:rPr>
+                <w:rFonts w:ascii="Aptos Narrow" w:eastAsia="Times New Roman" w:hAnsi="Aptos Narrow" w:cs="Times New Roman"/>
+                <w:color w:val="000000"/>
+                <w:lang w:eastAsia="nl-NL"/>
+              </w:rPr>
+            </w:pPr>
+            <w:r>
+              <w:rPr>
+                <w:rFonts w:ascii="Aptos Narrow" w:eastAsia="Times New Roman" w:hAnsi="Aptos Narrow" w:cs="Times New Roman"/>
+                <w:color w:val="000000"/>
+                <w:lang w:eastAsia="nl-NL"/>
+              </w:rPr>
+              <w:t xml:space="preserve">I</w:t>
+            </w:r>
+          </w:p>
+        </w:tc>
+      </w:tr>
+      <w:tr>
+        <w:trPr>
+          <w:trHeight w:val="305"/>
+        </w:trPr>
+        <w:tc>
+          <w:tcPr>
+            <w:tcW w:w="7308" w:type="dxa"/>
+            <w:noWrap/>
+            <w:vAlign w:val="bottom"/>
+            <w:hideMark/>
+          </w:tcPr>
+          <w:p>
+            <w:pPr>
+              <w:widowControl/>
+              <w:autoSpaceDE/>
+              <w:autoSpaceDN/>
+              <w:rPr>
+                <w:rFonts w:ascii="Aptos Narrow" w:eastAsia="Times New Roman" w:hAnsi="Aptos Narrow" w:cs="Times New Roman"/>
+                <w:color w:val="000000"/>
+                <w:lang w:eastAsia="nl-NL"/>
+              </w:rPr>
+            </w:pPr>
+            <w:r>
+              <w:rPr>
+                <w:rFonts w:ascii="Aptos Narrow" w:eastAsia="Times New Roman" w:hAnsi="Aptos Narrow" w:cs="Times New Roman"/>
+                <w:color w:val="000000"/>
+                <w:lang w:eastAsia="nl-NL"/>
+              </w:rPr>
               <w:t xml:space="preserve">Verbeteren financiële positie van de gemeente</w:t>
             </w:r>
           </w:p>
@@ -15396,7 +15656,7 @@
                 <w:color w:val="000000"/>
                 <w:lang w:eastAsia="nl-NL"/>
               </w:rPr>
-              <w:t xml:space="preserve">11,786</w:t>
+              <w:t xml:space="preserve">11,381</w:t>
             </w:r>
           </w:p>
         </w:tc>
@@ -16267,7 +16527,7 @@
                 <w:color w:val="000000"/>
                 <w:lang w:eastAsia="nl-NL"/>
               </w:rPr>
-              <w:t xml:space="preserve">101,106</w:t>
+              <w:t xml:space="preserve">101,512</w:t>
             </w:r>
           </w:p>
         </w:tc>
@@ -16296,7 +16556,7 @@
                 <w:color w:val="000000"/>
                 <w:lang w:eastAsia="nl-NL"/>
               </w:rPr>
-              <w:t xml:space="preserve">80,425</w:t>
+              <w:t xml:space="preserve">80,825</w:t>
             </w:r>
           </w:p>
         </w:tc>
@@ -16325,7 +16585,7 @@
                 <w:color w:val="000000"/>
                 <w:lang w:eastAsia="nl-NL"/>
               </w:rPr>
-              <w:t xml:space="preserve">80,675</w:t>
+              <w:t xml:space="preserve">81,071</w:t>
             </w:r>
           </w:p>
         </w:tc>
@@ -16354,7 +16614,7 @@
                 <w:color w:val="000000"/>
                 <w:lang w:eastAsia="nl-NL"/>
               </w:rPr>
-              <w:t xml:space="preserve">80,88</w:t>
+              <w:t xml:space="preserve">81,271</w:t>
             </w:r>
           </w:p>
         </w:tc>
@@ -16573,7 +16833,7 @@
                 <w:color w:val="000000"/>
                 <w:lang w:eastAsia="nl-NL"/>
               </w:rPr>
-              <w:t xml:space="preserve">110,009</w:t>
+              <w:t xml:space="preserve">110,414</w:t>
             </w:r>
           </w:p>
         </w:tc>
@@ -16606,7 +16866,7 @@
                 <w:color w:val="000000"/>
                 <w:lang w:eastAsia="nl-NL"/>
               </w:rPr>
-              <w:t xml:space="preserve">80,425</w:t>
+              <w:t xml:space="preserve">80,825</w:t>
             </w:r>
           </w:p>
         </w:tc>
@@ -16639,7 +16899,7 @@
                 <w:color w:val="000000"/>
                 <w:lang w:eastAsia="nl-NL"/>
               </w:rPr>
-              <w:t xml:space="preserve">80,675</w:t>
+              <w:t xml:space="preserve">81,071</w:t>
             </w:r>
           </w:p>
         </w:tc>
@@ -16672,7 +16932,7 @@
                 <w:color w:val="000000"/>
                 <w:lang w:eastAsia="nl-NL"/>
               </w:rPr>
-              <w:t xml:space="preserve">80,88</w:t>
+              <w:t xml:space="preserve">81,271</w:t>
             </w:r>
           </w:p>
         </w:tc>
@@ -16742,7 +17002,7 @@
                 <w:color w:val="000000"/>
                 <w:lang w:eastAsia="nl-NL"/>
               </w:rPr>
-              <w:t xml:space="preserve">11,786</w:t>
+              <w:t xml:space="preserve">11,381</w:t>
             </w:r>
           </w:p>
         </w:tc>
@@ -16775,7 +17035,7 @@
                 <w:color w:val="000000"/>
                 <w:lang w:eastAsia="nl-NL"/>
               </w:rPr>
-              <w:t xml:space="preserve">42,483</w:t>
+              <w:t xml:space="preserve">42,083</w:t>
             </w:r>
           </w:p>
         </w:tc>
@@ -16808,7 +17068,7 @@
                 <w:color w:val="000000"/>
                 <w:lang w:eastAsia="nl-NL"/>
               </w:rPr>
-              <w:t xml:space="preserve">48,752</w:t>
+              <w:t xml:space="preserve">48,356</w:t>
             </w:r>
           </w:p>
         </w:tc>
@@ -16841,7 +17101,7 @@
                 <w:color w:val="000000"/>
                 <w:lang w:eastAsia="nl-NL"/>
               </w:rPr>
-              <w:t xml:space="preserve">53,76</w:t>
+              <w:t xml:space="preserve">53,369</w:t>
             </w:r>
           </w:p>
         </w:tc>
@@ -16903,7 +17163,7 @@
                 <w:color w:val="000000"/>
                 <w:lang w:eastAsia="nl-NL"/>
               </w:rPr>
-              <w:t xml:space="preserve">13,839</w:t>
+              <w:t xml:space="preserve">13,434</w:t>
             </w:r>
           </w:p>
         </w:tc>
@@ -16932,7 +17192,7 @@
                 <w:color w:val="000000"/>
                 <w:lang w:eastAsia="nl-NL"/>
               </w:rPr>
-              <w:t xml:space="preserve">42,483</w:t>
+              <w:t xml:space="preserve">42,083</w:t>
             </w:r>
           </w:p>
         </w:tc>
@@ -16961,7 +17221,7 @@
                 <w:color w:val="000000"/>
                 <w:lang w:eastAsia="nl-NL"/>
               </w:rPr>
-              <w:t xml:space="preserve">48,752</w:t>
+              <w:t xml:space="preserve">48,356</w:t>
             </w:r>
           </w:p>
         </w:tc>
@@ -16990,7 +17250,7 @@
                 <w:color w:val="000000"/>
                 <w:lang w:eastAsia="nl-NL"/>
               </w:rPr>
-              <w:t xml:space="preserve">53,76</w:t>
+              <w:t xml:space="preserve">53,369</w:t>
             </w:r>
           </w:p>
         </w:tc>
@@ -17350,7 +17610,7 @@
                 <w:color w:val="000000"/>
                 <w:lang w:eastAsia="nl-NL"/>
               </w:rPr>
-              <w:t xml:space="preserve">11,786</w:t>
+              <w:t xml:space="preserve">11,381</w:t>
             </w:r>
           </w:p>
         </w:tc>
@@ -17379,7 +17639,7 @@
                 <w:color w:val="000000"/>
                 <w:lang w:eastAsia="nl-NL"/>
               </w:rPr>
-              <w:t xml:space="preserve">54,27</w:t>
+              <w:t xml:space="preserve">53,464</w:t>
             </w:r>
           </w:p>
         </w:tc>
@@ -17408,7 +17668,7 @@
                 <w:color w:val="000000"/>
                 <w:lang w:eastAsia="nl-NL"/>
               </w:rPr>
-              <w:t xml:space="preserve">103,022</w:t>
+              <w:t xml:space="preserve">101,82</w:t>
             </w:r>
           </w:p>
         </w:tc>
@@ -17437,7 +17697,7 @@
                 <w:color w:val="000000"/>
                 <w:lang w:eastAsia="nl-NL"/>
               </w:rPr>
-              <w:t xml:space="preserve">156,782</w:t>
+              <w:t xml:space="preserve">155,189</w:t>
             </w:r>
           </w:p>
         </w:tc>
@@ -17953,6 +18213,54 @@
     </w:p>
   </w:footnote>
   <w:footnote w:id="13">
+    <w:p>
+      <w:pPr>
+        <w:pStyle w:val="Voetnoottekst"/>
+      </w:pPr>
+      <w:r>
+        <w:rPr>
+          <w:rStyle w:val="Voetnootmarkering"/>
+        </w:rPr>
+        <w:footnoteRef/>
+      </w:r>
+      <w:r>
+        <w:t xml:space="preserve"> RTV Noord, "Gele Loper-gebied in Stad krijgt minimaal jaar cameratoezicht", 2025, https://www.rtvnoord.nl/politiek/1257785/gele-loper-gebied-in-stad-krijgt-minimaal-jaar-cameratoezicht</w:t>
+      </w:r>
+    </w:p>
+  </w:footnote>
+  <w:footnote w:id="14">
+    <w:p>
+      <w:pPr>
+        <w:pStyle w:val="Voetnoottekst"/>
+      </w:pPr>
+      <w:r>
+        <w:rPr>
+          <w:rStyle w:val="Voetnootmarkering"/>
+        </w:rPr>
+        <w:footnoteRef/>
+      </w:r>
+      <w:r>
+        <w:t xml:space="preserve"> OOG, "Raad omarmt Nachtvisie, maar binnenstad wordt geen veiligheidsrisicogebied", februari 2026, https://www.oogtv.nl/2026/02/raad-omarmt-nachtvisie-maar-binnenstad-wordt-geen-veiligheidsrisicogebied/</w:t>
+      </w:r>
+    </w:p>
+  </w:footnote>
+  <w:footnote w:id="15">
+    <w:p>
+      <w:pPr>
+        <w:pStyle w:val="Voetnoottekst"/>
+      </w:pPr>
+      <w:r>
+        <w:rPr>
+          <w:rStyle w:val="Voetnootmarkering"/>
+        </w:rPr>
+        <w:footnoteRef/>
+      </w:r>
+      <w:r>
+        <w:t xml:space="preserve"> Eenheidsprijzen uit de raadsbrief "Uitbreiding cameratoezicht" van de gemeente Nijmegen: circa € 10.000 per camera en € 9.000 bekabeling, € 3.000 per camera per jaar voor uitkijken en € 15.000 per jaar onderhoud voor 18 camera's. https://nijmegen.bestuurlijkeinformatie.nl/Document/View/c15d46d3-d182-4987-96a0-2639f4fa6560</w:t>
+      </w:r>
+    </w:p>
+  </w:footnote>
+  <w:footnote w:id="16">
     <w:p>
       <w:pPr>
         <w:pStyle w:val="Voetnoottekst"/>

</xml_diff>